<commit_message>
Embed the first five mongosh screenshots (U5, U6, D1, D2, D3)
Scales each capture to fit the page height so the heading, code and
caption stay together.

Co-Authored-By: Claude Opus 5 <noreply@anthropic.com>
Claude-Session: https://claude.ai/code/session_01WKECxGAA4Qrww3QEZbaem4
</commit_message>
<xml_diff>
--- a/dbms_casestudy/News_Portal_MongoDB_CaseStudy_24BCE2743.docx
+++ b/dbms_casestudy/News_Portal_MongoDB_CaseStudy_24BCE2743.docx
@@ -7285,41 +7285,42 @@
     </w:p>
     <w:p>
       <w:pPr>
-        <w:spacing w:before="160" w:after="40"/>
+        <w:spacing w:before="120" w:after="40"/>
         <w:jc w:val="center"/>
-        <w:shd w:val="clear" w:color="auto" w:fill="FAFAFA"/>
-        <w:pBdr>
-          <w:top w:val="single" w:sz="4" w:space="6" w:color="C0C0C0"/>
-          <w:left w:val="single" w:sz="4" w:space="6" w:color="C0C0C0"/>
-          <w:bottom w:val="single" w:sz="4" w:space="6" w:color="C0C0C0"/>
-          <w:right w:val="single" w:sz="4" w:space="6" w:color="C0C0C0"/>
-        </w:pBdr>
-      </w:pPr>
-      <w:r>
-        <w:rPr>
-          <w:i/>
-          <w:color w:val="888888"/>
-          <w:sz w:val="20"/>
-        </w:rPr>
-        <w:t>[ screenshot S25 ]</w:t>
-        <w:br/>
-      </w:r>
-      <w:r>
-        <w:rPr>
-          <w:i/>
-          <w:color w:val="888888"/>
-          <w:sz w:val="18"/>
-        </w:rPr>
-        <w:t>U5: $push adding a reply inside a comment document</w:t>
-        <w:br/>
-      </w:r>
-      <w:r>
-        <w:rPr>
-          <w:i/>
-          <w:color w:val="888888"/>
-          <w:sz w:val="18"/>
-        </w:rPr>
-        <w:t>paste the mongosh output here, or save it as S25.png</w:t>
+      </w:pPr>
+      <w:r>
+        <w:drawing>
+          <wp:inline xmlns:a="http://schemas.openxmlformats.org/drawingml/2006/main" xmlns:pic="http://schemas.openxmlformats.org/drawingml/2006/picture">
+            <wp:extent cx="5486400" cy="2725947"/>
+            <wp:docPr id="1" name="Picture 1"/>
+            <wp:cNvGraphicFramePr>
+              <a:graphicFrameLocks noChangeAspect="1"/>
+            </wp:cNvGraphicFramePr>
+            <a:graphic>
+              <a:graphicData uri="http://schemas.openxmlformats.org/drawingml/2006/picture">
+                <pic:pic>
+                  <pic:nvPicPr>
+                    <pic:cNvPr id="0" name="S25.png"/>
+                    <pic:cNvPicPr/>
+                  </pic:nvPicPr>
+                  <pic:blipFill>
+                    <a:blip r:embed="rId9"/>
+                    <a:stretch>
+                      <a:fillRect/>
+                    </a:stretch>
+                  </pic:blipFill>
+                  <pic:spPr>
+                    <a:xfrm>
+                      <a:off x="0" y="0"/>
+                      <a:ext cx="5486400" cy="2725947"/>
+                    </a:xfrm>
+                    <a:prstGeom prst="rect"/>
+                  </pic:spPr>
+                </pic:pic>
+              </a:graphicData>
+            </a:graphic>
+          </wp:inline>
+        </w:drawing>
       </w:r>
     </w:p>
     <w:p>
@@ -7423,41 +7424,42 @@
     </w:p>
     <w:p>
       <w:pPr>
-        <w:spacing w:before="160" w:after="40"/>
+        <w:spacing w:before="120" w:after="40"/>
         <w:jc w:val="center"/>
-        <w:shd w:val="clear" w:color="auto" w:fill="FAFAFA"/>
-        <w:pBdr>
-          <w:top w:val="single" w:sz="4" w:space="6" w:color="C0C0C0"/>
-          <w:left w:val="single" w:sz="4" w:space="6" w:color="C0C0C0"/>
-          <w:bottom w:val="single" w:sz="4" w:space="6" w:color="C0C0C0"/>
-          <w:right w:val="single" w:sz="4" w:space="6" w:color="C0C0C0"/>
-        </w:pBdr>
-      </w:pPr>
-      <w:r>
-        <w:rPr>
-          <w:i/>
-          <w:color w:val="888888"/>
-          <w:sz w:val="20"/>
-        </w:rPr>
-        <w:t>[ screenshot S26 ]</w:t>
-        <w:br/>
-      </w:r>
-      <w:r>
-        <w:rPr>
-          <w:i/>
-          <w:color w:val="888888"/>
-          <w:sz w:val="18"/>
-        </w:rPr>
-        <w:t>U6: expired premium subscriptions downgraded to free</w:t>
-        <w:br/>
-      </w:r>
-      <w:r>
-        <w:rPr>
-          <w:i/>
-          <w:color w:val="888888"/>
-          <w:sz w:val="18"/>
-        </w:rPr>
-        <w:t>paste the mongosh output here, or save it as S26.png</w:t>
+      </w:pPr>
+      <w:r>
+        <w:drawing>
+          <wp:inline xmlns:a="http://schemas.openxmlformats.org/drawingml/2006/main" xmlns:pic="http://schemas.openxmlformats.org/drawingml/2006/picture">
+            <wp:extent cx="5486400" cy="5571066"/>
+            <wp:docPr id="2" name="Picture 2"/>
+            <wp:cNvGraphicFramePr>
+              <a:graphicFrameLocks noChangeAspect="1"/>
+            </wp:cNvGraphicFramePr>
+            <a:graphic>
+              <a:graphicData uri="http://schemas.openxmlformats.org/drawingml/2006/picture">
+                <pic:pic>
+                  <pic:nvPicPr>
+                    <pic:cNvPr id="0" name="S26.png"/>
+                    <pic:cNvPicPr/>
+                  </pic:nvPicPr>
+                  <pic:blipFill>
+                    <a:blip r:embed="rId10"/>
+                    <a:stretch>
+                      <a:fillRect/>
+                    </a:stretch>
+                  </pic:blipFill>
+                  <pic:spPr>
+                    <a:xfrm>
+                      <a:off x="0" y="0"/>
+                      <a:ext cx="5486400" cy="5571066"/>
+                    </a:xfrm>
+                    <a:prstGeom prst="rect"/>
+                  </pic:spPr>
+                </pic:pic>
+              </a:graphicData>
+            </a:graphic>
+          </wp:inline>
+        </w:drawing>
       </w:r>
     </w:p>
     <w:p>
@@ -7564,41 +7566,42 @@
     </w:p>
     <w:p>
       <w:pPr>
-        <w:spacing w:before="160" w:after="40"/>
+        <w:spacing w:before="120" w:after="40"/>
         <w:jc w:val="center"/>
-        <w:shd w:val="clear" w:color="auto" w:fill="FAFAFA"/>
-        <w:pBdr>
-          <w:top w:val="single" w:sz="4" w:space="6" w:color="C0C0C0"/>
-          <w:left w:val="single" w:sz="4" w:space="6" w:color="C0C0C0"/>
-          <w:bottom w:val="single" w:sz="4" w:space="6" w:color="C0C0C0"/>
-          <w:right w:val="single" w:sz="4" w:space="6" w:color="C0C0C0"/>
-        </w:pBdr>
-      </w:pPr>
-      <w:r>
-        <w:rPr>
-          <w:i/>
-          <w:color w:val="888888"/>
-          <w:sz w:val="20"/>
-        </w:rPr>
-        <w:t>[ screenshot S27 ]</w:t>
-        <w:br/>
-      </w:r>
-      <w:r>
-        <w:rPr>
-          <w:i/>
-          <w:color w:val="888888"/>
-          <w:sz w:val="18"/>
-        </w:rPr>
-        <w:t>D1: deleteOne() removing a single spam comment</w:t>
-        <w:br/>
-      </w:r>
-      <w:r>
-        <w:rPr>
-          <w:i/>
-          <w:color w:val="888888"/>
-          <w:sz w:val="18"/>
-        </w:rPr>
-        <w:t>paste the mongosh output here, or save it as S27.png</w:t>
+      </w:pPr>
+      <w:r>
+        <w:drawing>
+          <wp:inline xmlns:a="http://schemas.openxmlformats.org/drawingml/2006/main" xmlns:pic="http://schemas.openxmlformats.org/drawingml/2006/picture">
+            <wp:extent cx="5486400" cy="896184"/>
+            <wp:docPr id="3" name="Picture 3"/>
+            <wp:cNvGraphicFramePr>
+              <a:graphicFrameLocks noChangeAspect="1"/>
+            </wp:cNvGraphicFramePr>
+            <a:graphic>
+              <a:graphicData uri="http://schemas.openxmlformats.org/drawingml/2006/picture">
+                <pic:pic>
+                  <pic:nvPicPr>
+                    <pic:cNvPr id="0" name="S27.png"/>
+                    <pic:cNvPicPr/>
+                  </pic:nvPicPr>
+                  <pic:blipFill>
+                    <a:blip r:embed="rId11"/>
+                    <a:stretch>
+                      <a:fillRect/>
+                    </a:stretch>
+                  </pic:blipFill>
+                  <pic:spPr>
+                    <a:xfrm>
+                      <a:off x="0" y="0"/>
+                      <a:ext cx="5486400" cy="896184"/>
+                    </a:xfrm>
+                    <a:prstGeom prst="rect"/>
+                  </pic:spPr>
+                </pic:pic>
+              </a:graphicData>
+            </a:graphic>
+          </wp:inline>
+        </w:drawing>
       </w:r>
     </w:p>
     <w:p>
@@ -7675,41 +7678,42 @@
     </w:p>
     <w:p>
       <w:pPr>
-        <w:spacing w:before="160" w:after="40"/>
+        <w:spacing w:before="120" w:after="40"/>
         <w:jc w:val="center"/>
-        <w:shd w:val="clear" w:color="auto" w:fill="FAFAFA"/>
-        <w:pBdr>
-          <w:top w:val="single" w:sz="4" w:space="6" w:color="C0C0C0"/>
-          <w:left w:val="single" w:sz="4" w:space="6" w:color="C0C0C0"/>
-          <w:bottom w:val="single" w:sz="4" w:space="6" w:color="C0C0C0"/>
-          <w:right w:val="single" w:sz="4" w:space="6" w:color="C0C0C0"/>
-        </w:pBdr>
-      </w:pPr>
-      <w:r>
-        <w:rPr>
-          <w:i/>
-          <w:color w:val="888888"/>
-          <w:sz w:val="20"/>
-        </w:rPr>
-        <w:t>[ screenshot S28 ]</w:t>
-        <w:br/>
-      </w:r>
-      <w:r>
-        <w:rPr>
-          <w:i/>
-          <w:color w:val="888888"/>
-          <w:sz w:val="18"/>
-        </w:rPr>
-        <w:t>D2: deleteMany() clearing the remaining flagged comments</w:t>
-        <w:br/>
-      </w:r>
-      <w:r>
-        <w:rPr>
-          <w:i/>
-          <w:color w:val="888888"/>
-          <w:sz w:val="18"/>
-        </w:rPr>
-        <w:t>paste the mongosh output here, or save it as S28.png</w:t>
+      </w:pPr>
+      <w:r>
+        <w:drawing>
+          <wp:inline xmlns:a="http://schemas.openxmlformats.org/drawingml/2006/main" xmlns:pic="http://schemas.openxmlformats.org/drawingml/2006/picture">
+            <wp:extent cx="4478725" cy="6035040"/>
+            <wp:docPr id="4" name="Picture 4"/>
+            <wp:cNvGraphicFramePr>
+              <a:graphicFrameLocks noChangeAspect="1"/>
+            </wp:cNvGraphicFramePr>
+            <a:graphic>
+              <a:graphicData uri="http://schemas.openxmlformats.org/drawingml/2006/picture">
+                <pic:pic>
+                  <pic:nvPicPr>
+                    <pic:cNvPr id="0" name="S28.png"/>
+                    <pic:cNvPicPr/>
+                  </pic:nvPicPr>
+                  <pic:blipFill>
+                    <a:blip r:embed="rId12"/>
+                    <a:stretch>
+                      <a:fillRect/>
+                    </a:stretch>
+                  </pic:blipFill>
+                  <pic:spPr>
+                    <a:xfrm>
+                      <a:off x="0" y="0"/>
+                      <a:ext cx="4478725" cy="6035040"/>
+                    </a:xfrm>
+                    <a:prstGeom prst="rect"/>
+                  </pic:spPr>
+                </pic:pic>
+              </a:graphicData>
+            </a:graphic>
+          </wp:inline>
+        </w:drawing>
       </w:r>
     </w:p>
     <w:p>
@@ -7786,41 +7790,42 @@
     </w:p>
     <w:p>
       <w:pPr>
-        <w:spacing w:before="160" w:after="40"/>
+        <w:spacing w:before="120" w:after="40"/>
         <w:jc w:val="center"/>
-        <w:shd w:val="clear" w:color="auto" w:fill="FAFAFA"/>
-        <w:pBdr>
-          <w:top w:val="single" w:sz="4" w:space="6" w:color="C0C0C0"/>
-          <w:left w:val="single" w:sz="4" w:space="6" w:color="C0C0C0"/>
-          <w:bottom w:val="single" w:sz="4" w:space="6" w:color="C0C0C0"/>
-          <w:right w:val="single" w:sz="4" w:space="6" w:color="C0C0C0"/>
-        </w:pBdr>
-      </w:pPr>
-      <w:r>
-        <w:rPr>
-          <w:i/>
-          <w:color w:val="888888"/>
-          <w:sz w:val="20"/>
-        </w:rPr>
-        <w:t>[ screenshot S29 ]</w:t>
-        <w:br/>
-      </w:r>
-      <w:r>
-        <w:rPr>
-          <w:i/>
-          <w:color w:val="888888"/>
-          <w:sz w:val="18"/>
-        </w:rPr>
-        <w:t>D3: deleteMany() removing the inactive category</w:t>
-        <w:br/>
-      </w:r>
-      <w:r>
-        <w:rPr>
-          <w:i/>
-          <w:color w:val="888888"/>
-          <w:sz w:val="18"/>
-        </w:rPr>
-        <w:t>paste the mongosh output here, or save it as S29.png</w:t>
+      </w:pPr>
+      <w:r>
+        <w:drawing>
+          <wp:inline xmlns:a="http://schemas.openxmlformats.org/drawingml/2006/main" xmlns:pic="http://schemas.openxmlformats.org/drawingml/2006/picture">
+            <wp:extent cx="5283528" cy="6035040"/>
+            <wp:docPr id="5" name="Picture 5"/>
+            <wp:cNvGraphicFramePr>
+              <a:graphicFrameLocks noChangeAspect="1"/>
+            </wp:cNvGraphicFramePr>
+            <a:graphic>
+              <a:graphicData uri="http://schemas.openxmlformats.org/drawingml/2006/picture">
+                <pic:pic>
+                  <pic:nvPicPr>
+                    <pic:cNvPr id="0" name="S29.png"/>
+                    <pic:cNvPicPr/>
+                  </pic:nvPicPr>
+                  <pic:blipFill>
+                    <a:blip r:embed="rId13"/>
+                    <a:stretch>
+                      <a:fillRect/>
+                    </a:stretch>
+                  </pic:blipFill>
+                  <pic:spPr>
+                    <a:xfrm>
+                      <a:off x="0" y="0"/>
+                      <a:ext cx="5283528" cy="6035040"/>
+                    </a:xfrm>
+                    <a:prstGeom prst="rect"/>
+                  </pic:spPr>
+                </pic:pic>
+              </a:graphicData>
+            </a:graphic>
+          </wp:inline>
+        </w:drawing>
       </w:r>
     </w:p>
     <w:p>

</xml_diff>

<commit_message>
Embed R12 and U1-U4 screenshots, correct the U2 match counts
The updateMany output shows four articles above 15,000 views, not
three: ART01 on 15,420 was missed when the explanation was written.
matchedCount is 4 and modifiedCount 3, since ART03 was inserted
already featured.

Co-Authored-By: Claude Opus 5 <noreply@anthropic.com>
Claude-Session: https://claude.ai/code/session_01WKECxGAA4Qrww3QEZbaem4
</commit_message>
<xml_diff>
--- a/dbms_casestudy/News_Portal_MongoDB_CaseStudy_24BCE2743.docx
+++ b/dbms_casestudy/News_Portal_MongoDB_CaseStudy_24BCE2743.docx
@@ -6538,41 +6538,42 @@
     </w:p>
     <w:p>
       <w:pPr>
-        <w:spacing w:before="160" w:after="40"/>
+        <w:spacing w:before="120" w:after="40"/>
         <w:jc w:val="center"/>
-        <w:shd w:val="clear" w:color="auto" w:fill="FAFAFA"/>
-        <w:pBdr>
-          <w:top w:val="single" w:sz="4" w:space="6" w:color="C0C0C0"/>
-          <w:left w:val="single" w:sz="4" w:space="6" w:color="C0C0C0"/>
-          <w:bottom w:val="single" w:sz="4" w:space="6" w:color="C0C0C0"/>
-          <w:right w:val="single" w:sz="4" w:space="6" w:color="C0C0C0"/>
-        </w:pBdr>
-      </w:pPr>
-      <w:r>
-        <w:rPr>
-          <w:i/>
-          <w:color w:val="888888"/>
-          <w:sz w:val="20"/>
-        </w:rPr>
-        <w:t>[ screenshot S20 ]</w:t>
-        <w:br/>
-      </w:r>
-      <w:r>
-        <w:rPr>
-          <w:i/>
-          <w:color w:val="888888"/>
-          <w:sz w:val="18"/>
-        </w:rPr>
-        <w:t>R12: article count and total views per category</w:t>
-        <w:br/>
-      </w:r>
-      <w:r>
-        <w:rPr>
-          <w:i/>
-          <w:color w:val="888888"/>
-          <w:sz w:val="18"/>
-        </w:rPr>
-        <w:t>paste the mongosh output here, or save it as S20.png</w:t>
+      </w:pPr>
+      <w:r>
+        <w:drawing>
+          <wp:inline xmlns:a="http://schemas.openxmlformats.org/drawingml/2006/main" xmlns:pic="http://schemas.openxmlformats.org/drawingml/2006/picture">
+            <wp:extent cx="5486400" cy="4662549"/>
+            <wp:docPr id="1" name="Picture 1"/>
+            <wp:cNvGraphicFramePr>
+              <a:graphicFrameLocks noChangeAspect="1"/>
+            </wp:cNvGraphicFramePr>
+            <a:graphic>
+              <a:graphicData uri="http://schemas.openxmlformats.org/drawingml/2006/picture">
+                <pic:pic>
+                  <pic:nvPicPr>
+                    <pic:cNvPr id="0" name="S20.png"/>
+                    <pic:cNvPicPr/>
+                  </pic:nvPicPr>
+                  <pic:blipFill>
+                    <a:blip r:embed="rId9"/>
+                    <a:stretch>
+                      <a:fillRect/>
+                    </a:stretch>
+                  </pic:blipFill>
+                  <pic:spPr>
+                    <a:xfrm>
+                      <a:off x="0" y="0"/>
+                      <a:ext cx="5486400" cy="4662549"/>
+                    </a:xfrm>
+                    <a:prstGeom prst="rect"/>
+                  </pic:spPr>
+                </pic:pic>
+              </a:graphicData>
+            </a:graphic>
+          </wp:inline>
+        </w:drawing>
       </w:r>
     </w:p>
     <w:p>
@@ -6706,41 +6707,42 @@
     </w:p>
     <w:p>
       <w:pPr>
-        <w:spacing w:before="160" w:after="40"/>
+        <w:spacing w:before="120" w:after="40"/>
         <w:jc w:val="center"/>
-        <w:shd w:val="clear" w:color="auto" w:fill="FAFAFA"/>
-        <w:pBdr>
-          <w:top w:val="single" w:sz="4" w:space="6" w:color="C0C0C0"/>
-          <w:left w:val="single" w:sz="4" w:space="6" w:color="C0C0C0"/>
-          <w:bottom w:val="single" w:sz="4" w:space="6" w:color="C0C0C0"/>
-          <w:right w:val="single" w:sz="4" w:space="6" w:color="C0C0C0"/>
-        </w:pBdr>
-      </w:pPr>
-      <w:r>
-        <w:rPr>
-          <w:i/>
-          <w:color w:val="888888"/>
-          <w:sz w:val="20"/>
-        </w:rPr>
-        <w:t>[ screenshot S21 ]</w:t>
-        <w:br/>
-      </w:r>
-      <w:r>
-        <w:rPr>
-          <w:i/>
-          <w:color w:val="888888"/>
-          <w:sz w:val="18"/>
-        </w:rPr>
-        <w:t>U1: $inc raising views and likes on ART09</w:t>
-        <w:br/>
-      </w:r>
-      <w:r>
-        <w:rPr>
-          <w:i/>
-          <w:color w:val="888888"/>
-          <w:sz w:val="18"/>
-        </w:rPr>
-        <w:t>paste the mongosh output here, or save it as S21.png</w:t>
+      </w:pPr>
+      <w:r>
+        <w:drawing>
+          <wp:inline xmlns:a="http://schemas.openxmlformats.org/drawingml/2006/main" xmlns:pic="http://schemas.openxmlformats.org/drawingml/2006/picture">
+            <wp:extent cx="5486400" cy="2323902"/>
+            <wp:docPr id="2" name="Picture 2"/>
+            <wp:cNvGraphicFramePr>
+              <a:graphicFrameLocks noChangeAspect="1"/>
+            </wp:cNvGraphicFramePr>
+            <a:graphic>
+              <a:graphicData uri="http://schemas.openxmlformats.org/drawingml/2006/picture">
+                <pic:pic>
+                  <pic:nvPicPr>
+                    <pic:cNvPr id="0" name="S21.png"/>
+                    <pic:cNvPicPr/>
+                  </pic:nvPicPr>
+                  <pic:blipFill>
+                    <a:blip r:embed="rId10"/>
+                    <a:stretch>
+                      <a:fillRect/>
+                    </a:stretch>
+                  </pic:blipFill>
+                  <pic:spPr>
+                    <a:xfrm>
+                      <a:off x="0" y="0"/>
+                      <a:ext cx="5486400" cy="2323902"/>
+                    </a:xfrm>
+                    <a:prstGeom prst="rect"/>
+                  </pic:spPr>
+                </pic:pic>
+              </a:graphicData>
+            </a:graphic>
+          </wp:inline>
+        </w:drawing>
       </w:r>
     </w:p>
     <w:p>
@@ -6839,46 +6841,47 @@
           <w:i w:val="0"/>
           <w:sz w:val="22"/>
         </w:rPr>
-        <w:t>A nightly job promoting anything past fifteen thousand views to the featured strip. updateMany applies the change to every matching document, unlike updateOne which stops at the first. Three articles match: ART02, ART03 and ART07. ART03 was already featured, so matchedCount is 3 while modifiedCount is 2, which is the clearest illustration of why MongoDB reports the two numbers separately.</w:t>
+        <w:t>A nightly job promoting anything past fifteen thousand views to the featured strip. updateMany applies the change to every matching document, unlike updateOne which stops at the first. Four articles clear the threshold: ART01 on 15,420 views, ART02 on 22,310, ART03 on 31,050 and ART07 on 18,760. ART03 was already featured when it was inserted, so matchedCount is 4 while modifiedCount is 3. That gap is the clearest illustration of why MongoDB reports the two numbers separately: a document can satisfy the filter and still need no change.</w:t>
       </w:r>
     </w:p>
     <w:p>
       <w:pPr>
-        <w:spacing w:before="160" w:after="40"/>
+        <w:spacing w:before="120" w:after="40"/>
         <w:jc w:val="center"/>
-        <w:shd w:val="clear" w:color="auto" w:fill="FAFAFA"/>
-        <w:pBdr>
-          <w:top w:val="single" w:sz="4" w:space="6" w:color="C0C0C0"/>
-          <w:left w:val="single" w:sz="4" w:space="6" w:color="C0C0C0"/>
-          <w:bottom w:val="single" w:sz="4" w:space="6" w:color="C0C0C0"/>
-          <w:right w:val="single" w:sz="4" w:space="6" w:color="C0C0C0"/>
-        </w:pBdr>
-      </w:pPr>
-      <w:r>
-        <w:rPr>
-          <w:i/>
-          <w:color w:val="888888"/>
-          <w:sz w:val="20"/>
-        </w:rPr>
-        <w:t>[ screenshot S22 ]</w:t>
-        <w:br/>
-      </w:r>
-      <w:r>
-        <w:rPr>
-          <w:i/>
-          <w:color w:val="888888"/>
-          <w:sz w:val="18"/>
-        </w:rPr>
-        <w:t>U2: updateMany() featuring every article above 15,000 views</w:t>
-        <w:br/>
-      </w:r>
-      <w:r>
-        <w:rPr>
-          <w:i/>
-          <w:color w:val="888888"/>
-          <w:sz w:val="18"/>
-        </w:rPr>
-        <w:t>paste the mongosh output here, or save it as S22.png</w:t>
+      </w:pPr>
+      <w:r>
+        <w:drawing>
+          <wp:inline xmlns:a="http://schemas.openxmlformats.org/drawingml/2006/main" xmlns:pic="http://schemas.openxmlformats.org/drawingml/2006/picture">
+            <wp:extent cx="5486400" cy="4188177"/>
+            <wp:docPr id="3" name="Picture 3"/>
+            <wp:cNvGraphicFramePr>
+              <a:graphicFrameLocks noChangeAspect="1"/>
+            </wp:cNvGraphicFramePr>
+            <a:graphic>
+              <a:graphicData uri="http://schemas.openxmlformats.org/drawingml/2006/picture">
+                <pic:pic>
+                  <pic:nvPicPr>
+                    <pic:cNvPr id="0" name="S22.png"/>
+                    <pic:cNvPicPr/>
+                  </pic:nvPicPr>
+                  <pic:blipFill>
+                    <a:blip r:embed="rId11"/>
+                    <a:stretch>
+                      <a:fillRect/>
+                    </a:stretch>
+                  </pic:blipFill>
+                  <pic:spPr>
+                    <a:xfrm>
+                      <a:off x="0" y="0"/>
+                      <a:ext cx="5486400" cy="4188177"/>
+                    </a:xfrm>
+                    <a:prstGeom prst="rect"/>
+                  </pic:spPr>
+                </pic:pic>
+              </a:graphicData>
+            </a:graphic>
+          </wp:inline>
+        </w:drawing>
       </w:r>
     </w:p>
     <w:p>
@@ -6991,41 +6994,42 @@
     </w:p>
     <w:p>
       <w:pPr>
-        <w:spacing w:before="160" w:after="40"/>
+        <w:spacing w:before="120" w:after="40"/>
         <w:jc w:val="center"/>
-        <w:shd w:val="clear" w:color="auto" w:fill="FAFAFA"/>
-        <w:pBdr>
-          <w:top w:val="single" w:sz="4" w:space="6" w:color="C0C0C0"/>
-          <w:left w:val="single" w:sz="4" w:space="6" w:color="C0C0C0"/>
-          <w:bottom w:val="single" w:sz="4" w:space="6" w:color="C0C0C0"/>
-          <w:right w:val="single" w:sz="4" w:space="6" w:color="C0C0C0"/>
-        </w:pBdr>
-      </w:pPr>
-      <w:r>
-        <w:rPr>
-          <w:i/>
-          <w:color w:val="888888"/>
-          <w:sz w:val="20"/>
-        </w:rPr>
-        <w:t>[ screenshot S23 ]</w:t>
-        <w:br/>
-      </w:r>
-      <w:r>
-        <w:rPr>
-          <w:i/>
-          <w:color w:val="888888"/>
-          <w:sz w:val="18"/>
-        </w:rPr>
-        <w:t>U3: publishing the draft article with $set and $currentDate</w:t>
-        <w:br/>
-      </w:r>
-      <w:r>
-        <w:rPr>
-          <w:i/>
-          <w:color w:val="888888"/>
-          <w:sz w:val="18"/>
-        </w:rPr>
-        <w:t>paste the mongosh output here, or save it as S23.png</w:t>
+      </w:pPr>
+      <w:r>
+        <w:drawing>
+          <wp:inline xmlns:a="http://schemas.openxmlformats.org/drawingml/2006/main" xmlns:pic="http://schemas.openxmlformats.org/drawingml/2006/picture">
+            <wp:extent cx="5486400" cy="2032831"/>
+            <wp:docPr id="4" name="Picture 4"/>
+            <wp:cNvGraphicFramePr>
+              <a:graphicFrameLocks noChangeAspect="1"/>
+            </wp:cNvGraphicFramePr>
+            <a:graphic>
+              <a:graphicData uri="http://schemas.openxmlformats.org/drawingml/2006/picture">
+                <pic:pic>
+                  <pic:nvPicPr>
+                    <pic:cNvPr id="0" name="S23.png"/>
+                    <pic:cNvPicPr/>
+                  </pic:nvPicPr>
+                  <pic:blipFill>
+                    <a:blip r:embed="rId12"/>
+                    <a:stretch>
+                      <a:fillRect/>
+                    </a:stretch>
+                  </pic:blipFill>
+                  <pic:spPr>
+                    <a:xfrm>
+                      <a:off x="0" y="0"/>
+                      <a:ext cx="5486400" cy="2032831"/>
+                    </a:xfrm>
+                    <a:prstGeom prst="rect"/>
+                  </pic:spPr>
+                </pic:pic>
+              </a:graphicData>
+            </a:graphic>
+          </wp:inline>
+        </w:drawing>
       </w:r>
     </w:p>
     <w:p>
@@ -7129,41 +7133,42 @@
     </w:p>
     <w:p>
       <w:pPr>
-        <w:spacing w:before="160" w:after="40"/>
+        <w:spacing w:before="120" w:after="40"/>
         <w:jc w:val="center"/>
-        <w:shd w:val="clear" w:color="auto" w:fill="FAFAFA"/>
-        <w:pBdr>
-          <w:top w:val="single" w:sz="4" w:space="6" w:color="C0C0C0"/>
-          <w:left w:val="single" w:sz="4" w:space="6" w:color="C0C0C0"/>
-          <w:bottom w:val="single" w:sz="4" w:space="6" w:color="C0C0C0"/>
-          <w:right w:val="single" w:sz="4" w:space="6" w:color="C0C0C0"/>
-        </w:pBdr>
-      </w:pPr>
-      <w:r>
-        <w:rPr>
-          <w:i/>
-          <w:color w:val="888888"/>
-          <w:sz w:val="20"/>
-        </w:rPr>
-        <w:t>[ screenshot S24 ]</w:t>
-        <w:br/>
-      </w:r>
-      <w:r>
-        <w:rPr>
-          <w:i/>
-          <w:color w:val="888888"/>
-          <w:sz w:val="18"/>
-        </w:rPr>
-        <w:t>U4: $addToSet adding a tag without duplicating it</w:t>
-        <w:br/>
-      </w:r>
-      <w:r>
-        <w:rPr>
-          <w:i/>
-          <w:color w:val="888888"/>
-          <w:sz w:val="18"/>
-        </w:rPr>
-        <w:t>paste the mongosh output here, or save it as S24.png</w:t>
+      </w:pPr>
+      <w:r>
+        <w:drawing>
+          <wp:inline xmlns:a="http://schemas.openxmlformats.org/drawingml/2006/main" xmlns:pic="http://schemas.openxmlformats.org/drawingml/2006/picture">
+            <wp:extent cx="5486400" cy="3746001"/>
+            <wp:docPr id="5" name="Picture 5"/>
+            <wp:cNvGraphicFramePr>
+              <a:graphicFrameLocks noChangeAspect="1"/>
+            </wp:cNvGraphicFramePr>
+            <a:graphic>
+              <a:graphicData uri="http://schemas.openxmlformats.org/drawingml/2006/picture">
+                <pic:pic>
+                  <pic:nvPicPr>
+                    <pic:cNvPr id="0" name="S24.png"/>
+                    <pic:cNvPicPr/>
+                  </pic:nvPicPr>
+                  <pic:blipFill>
+                    <a:blip r:embed="rId13"/>
+                    <a:stretch>
+                      <a:fillRect/>
+                    </a:stretch>
+                  </pic:blipFill>
+                  <pic:spPr>
+                    <a:xfrm>
+                      <a:off x="0" y="0"/>
+                      <a:ext cx="5486400" cy="3746001"/>
+                    </a:xfrm>
+                    <a:prstGeom prst="rect"/>
+                  </pic:spPr>
+                </pic:pic>
+              </a:graphicData>
+            </a:graphic>
+          </wp:inline>
+        </w:drawing>
       </w:r>
     </w:p>
     <w:p>
@@ -7292,7 +7297,7 @@
         <w:drawing>
           <wp:inline xmlns:a="http://schemas.openxmlformats.org/drawingml/2006/main" xmlns:pic="http://schemas.openxmlformats.org/drawingml/2006/picture">
             <wp:extent cx="5486400" cy="2725947"/>
-            <wp:docPr id="1" name="Picture 1"/>
+            <wp:docPr id="6" name="Picture 6"/>
             <wp:cNvGraphicFramePr>
               <a:graphicFrameLocks noChangeAspect="1"/>
             </wp:cNvGraphicFramePr>
@@ -7304,7 +7309,7 @@
                     <pic:cNvPicPr/>
                   </pic:nvPicPr>
                   <pic:blipFill>
-                    <a:blip r:embed="rId9"/>
+                    <a:blip r:embed="rId14"/>
                     <a:stretch>
                       <a:fillRect/>
                     </a:stretch>
@@ -7431,7 +7436,7 @@
         <w:drawing>
           <wp:inline xmlns:a="http://schemas.openxmlformats.org/drawingml/2006/main" xmlns:pic="http://schemas.openxmlformats.org/drawingml/2006/picture">
             <wp:extent cx="5486400" cy="5571066"/>
-            <wp:docPr id="2" name="Picture 2"/>
+            <wp:docPr id="7" name="Picture 7"/>
             <wp:cNvGraphicFramePr>
               <a:graphicFrameLocks noChangeAspect="1"/>
             </wp:cNvGraphicFramePr>
@@ -7443,7 +7448,7 @@
                     <pic:cNvPicPr/>
                   </pic:nvPicPr>
                   <pic:blipFill>
-                    <a:blip r:embed="rId10"/>
+                    <a:blip r:embed="rId15"/>
                     <a:stretch>
                       <a:fillRect/>
                     </a:stretch>
@@ -7573,7 +7578,7 @@
         <w:drawing>
           <wp:inline xmlns:a="http://schemas.openxmlformats.org/drawingml/2006/main" xmlns:pic="http://schemas.openxmlformats.org/drawingml/2006/picture">
             <wp:extent cx="5486400" cy="896184"/>
-            <wp:docPr id="3" name="Picture 3"/>
+            <wp:docPr id="8" name="Picture 8"/>
             <wp:cNvGraphicFramePr>
               <a:graphicFrameLocks noChangeAspect="1"/>
             </wp:cNvGraphicFramePr>
@@ -7585,7 +7590,7 @@
                     <pic:cNvPicPr/>
                   </pic:nvPicPr>
                   <pic:blipFill>
-                    <a:blip r:embed="rId11"/>
+                    <a:blip r:embed="rId16"/>
                     <a:stretch>
                       <a:fillRect/>
                     </a:stretch>
@@ -7685,7 +7690,7 @@
         <w:drawing>
           <wp:inline xmlns:a="http://schemas.openxmlformats.org/drawingml/2006/main" xmlns:pic="http://schemas.openxmlformats.org/drawingml/2006/picture">
             <wp:extent cx="4478725" cy="6035040"/>
-            <wp:docPr id="4" name="Picture 4"/>
+            <wp:docPr id="9" name="Picture 9"/>
             <wp:cNvGraphicFramePr>
               <a:graphicFrameLocks noChangeAspect="1"/>
             </wp:cNvGraphicFramePr>
@@ -7697,7 +7702,7 @@
                     <pic:cNvPicPr/>
                   </pic:nvPicPr>
                   <pic:blipFill>
-                    <a:blip r:embed="rId12"/>
+                    <a:blip r:embed="rId17"/>
                     <a:stretch>
                       <a:fillRect/>
                     </a:stretch>
@@ -7797,7 +7802,7 @@
         <w:drawing>
           <wp:inline xmlns:a="http://schemas.openxmlformats.org/drawingml/2006/main" xmlns:pic="http://schemas.openxmlformats.org/drawingml/2006/picture">
             <wp:extent cx="5283528" cy="6035040"/>
-            <wp:docPr id="5" name="Picture 5"/>
+            <wp:docPr id="10" name="Picture 10"/>
             <wp:cNvGraphicFramePr>
               <a:graphicFrameLocks noChangeAspect="1"/>
             </wp:cNvGraphicFramePr>
@@ -7809,7 +7814,7 @@
                     <pic:cNvPicPr/>
                   </pic:nvPicPr>
                   <pic:blipFill>
-                    <a:blip r:embed="rId13"/>
+                    <a:blip r:embed="rId18"/>
                     <a:stretch>
                       <a:fillRect/>
                     </a:stretch>

</xml_diff>

<commit_message>
Embed R7-R11 screenshots, note the Pan-Indian regex match
The R8 output returns the box office headline because $regex ignores
word boundaries, which is worth explaining next to the figure.

Co-Authored-By: Claude Opus 5 <noreply@anthropic.com>
Claude-Session: https://claude.ai/code/session_01WKECxGAA4Qrww3QEZbaem4
</commit_message>
<xml_diff>
--- a/dbms_casestudy/News_Portal_MongoDB_CaseStudy_24BCE2743.docx
+++ b/dbms_casestudy/News_Portal_MongoDB_CaseStudy_24BCE2743.docx
@@ -5848,41 +5848,42 @@
     </w:p>
     <w:p>
       <w:pPr>
-        <w:spacing w:before="160" w:after="40"/>
+        <w:spacing w:before="120" w:after="40"/>
         <w:jc w:val="center"/>
-        <w:shd w:val="clear" w:color="auto" w:fill="FAFAFA"/>
-        <w:pBdr>
-          <w:top w:val="single" w:sz="4" w:space="6" w:color="C0C0C0"/>
-          <w:left w:val="single" w:sz="4" w:space="6" w:color="C0C0C0"/>
-          <w:bottom w:val="single" w:sz="4" w:space="6" w:color="C0C0C0"/>
-          <w:right w:val="single" w:sz="4" w:space="6" w:color="C0C0C0"/>
-        </w:pBdr>
-      </w:pPr>
-      <w:r>
-        <w:rPr>
-          <w:i/>
-          <w:color w:val="888888"/>
-          <w:sz w:val="20"/>
-        </w:rPr>
-        <w:t>[ screenshot S15 ]</w:t>
-        <w:br/>
-      </w:r>
-      <w:r>
-        <w:rPr>
-          <w:i/>
-          <w:color w:val="888888"/>
-          <w:sz w:val="18"/>
-        </w:rPr>
-        <w:t>R7: verified authors who cover Politics</w:t>
-        <w:br/>
-      </w:r>
-      <w:r>
-        <w:rPr>
-          <w:i/>
-          <w:color w:val="888888"/>
-          <w:sz w:val="18"/>
-        </w:rPr>
-        <w:t>paste the mongosh output here, or save it as S15.png</w:t>
+      </w:pPr>
+      <w:r>
+        <w:drawing>
+          <wp:inline xmlns:a="http://schemas.openxmlformats.org/drawingml/2006/main" xmlns:pic="http://schemas.openxmlformats.org/drawingml/2006/picture">
+            <wp:extent cx="5486400" cy="4869488"/>
+            <wp:docPr id="1" name="Picture 1"/>
+            <wp:cNvGraphicFramePr>
+              <a:graphicFrameLocks noChangeAspect="1"/>
+            </wp:cNvGraphicFramePr>
+            <a:graphic>
+              <a:graphicData uri="http://schemas.openxmlformats.org/drawingml/2006/picture">
+                <pic:pic>
+                  <pic:nvPicPr>
+                    <pic:cNvPr id="0" name="S15.png"/>
+                    <pic:cNvPicPr/>
+                  </pic:nvPicPr>
+                  <pic:blipFill>
+                    <a:blip r:embed="rId9"/>
+                    <a:stretch>
+                      <a:fillRect/>
+                    </a:stretch>
+                  </pic:blipFill>
+                  <pic:spPr>
+                    <a:xfrm>
+                      <a:off x="0" y="0"/>
+                      <a:ext cx="5486400" cy="4869488"/>
+                    </a:xfrm>
+                    <a:prstGeom prst="rect"/>
+                  </pic:spPr>
+                </pic:pic>
+              </a:graphicData>
+            </a:graphic>
+          </wp:inline>
+        </w:drawing>
       </w:r>
     </w:p>
     <w:p>
@@ -5972,46 +5973,47 @@
           <w:i w:val="0"/>
           <w:sz w:val="22"/>
         </w:rPr>
-        <w:t>The site search box. $regex matches a substring anywhere in the title, and the i option makes it case-insensitive, so the lowercase search term finds titles containing India. This is a convenience rather than a fast query: without a text index MongoDB scans every document, which is fine at ten articles and would not be at ten million.</w:t>
+        <w:t>The site search box. $regex matches a substring anywhere in the title, and the i option makes it case-insensitive, so the lowercase search term finds titles containing India. The third result is worth looking at: the box office headline matches on Pan-Indian, because $regex looks for the letters anywhere in the string and does not respect word boundaries. A reader searching for India gets a film story back. This is a convenience rather than a fast query: without a text index MongoDB scans every document, which is fine at ten articles and would not be at ten million.</w:t>
       </w:r>
     </w:p>
     <w:p>
       <w:pPr>
-        <w:spacing w:before="160" w:after="40"/>
+        <w:spacing w:before="120" w:after="40"/>
         <w:jc w:val="center"/>
-        <w:shd w:val="clear" w:color="auto" w:fill="FAFAFA"/>
-        <w:pBdr>
-          <w:top w:val="single" w:sz="4" w:space="6" w:color="C0C0C0"/>
-          <w:left w:val="single" w:sz="4" w:space="6" w:color="C0C0C0"/>
-          <w:bottom w:val="single" w:sz="4" w:space="6" w:color="C0C0C0"/>
-          <w:right w:val="single" w:sz="4" w:space="6" w:color="C0C0C0"/>
-        </w:pBdr>
-      </w:pPr>
-      <w:r>
-        <w:rPr>
-          <w:i/>
-          <w:color w:val="888888"/>
-          <w:sz w:val="20"/>
-        </w:rPr>
-        <w:t>[ screenshot S16 ]</w:t>
-        <w:br/>
-      </w:r>
-      <w:r>
-        <w:rPr>
-          <w:i/>
-          <w:color w:val="888888"/>
-          <w:sz w:val="18"/>
-        </w:rPr>
-        <w:t>R8: title search for india, case-insensitive</w:t>
-        <w:br/>
-      </w:r>
-      <w:r>
-        <w:rPr>
-          <w:i/>
-          <w:color w:val="888888"/>
-          <w:sz w:val="18"/>
-        </w:rPr>
-        <w:t>paste the mongosh output here, or save it as S16.png</w:t>
+      </w:pPr>
+      <w:r>
+        <w:drawing>
+          <wp:inline xmlns:a="http://schemas.openxmlformats.org/drawingml/2006/main" xmlns:pic="http://schemas.openxmlformats.org/drawingml/2006/picture">
+            <wp:extent cx="5486400" cy="3207306"/>
+            <wp:docPr id="2" name="Picture 2"/>
+            <wp:cNvGraphicFramePr>
+              <a:graphicFrameLocks noChangeAspect="1"/>
+            </wp:cNvGraphicFramePr>
+            <a:graphic>
+              <a:graphicData uri="http://schemas.openxmlformats.org/drawingml/2006/picture">
+                <pic:pic>
+                  <pic:nvPicPr>
+                    <pic:cNvPr id="0" name="S16.png"/>
+                    <pic:cNvPicPr/>
+                  </pic:nvPicPr>
+                  <pic:blipFill>
+                    <a:blip r:embed="rId10"/>
+                    <a:stretch>
+                      <a:fillRect/>
+                    </a:stretch>
+                  </pic:blipFill>
+                  <pic:spPr>
+                    <a:xfrm>
+                      <a:off x="0" y="0"/>
+                      <a:ext cx="5486400" cy="3207306"/>
+                    </a:xfrm>
+                    <a:prstGeom prst="rect"/>
+                  </pic:spPr>
+                </pic:pic>
+              </a:graphicData>
+            </a:graphic>
+          </wp:inline>
+        </w:drawing>
       </w:r>
     </w:p>
     <w:p>
@@ -6106,41 +6108,42 @@
     </w:p>
     <w:p>
       <w:pPr>
-        <w:spacing w:before="160" w:after="40"/>
+        <w:spacing w:before="120" w:after="40"/>
         <w:jc w:val="center"/>
-        <w:shd w:val="clear" w:color="auto" w:fill="FAFAFA"/>
-        <w:pBdr>
-          <w:top w:val="single" w:sz="4" w:space="6" w:color="C0C0C0"/>
-          <w:left w:val="single" w:sz="4" w:space="6" w:color="C0C0C0"/>
-          <w:bottom w:val="single" w:sz="4" w:space="6" w:color="C0C0C0"/>
-          <w:right w:val="single" w:sz="4" w:space="6" w:color="C0C0C0"/>
-        </w:pBdr>
-      </w:pPr>
-      <w:r>
-        <w:rPr>
-          <w:i/>
-          <w:color w:val="888888"/>
-          <w:sz w:val="20"/>
-        </w:rPr>
-        <w:t>[ screenshot S17 ]</w:t>
-        <w:br/>
-      </w:r>
-      <w:r>
-        <w:rPr>
-          <w:i/>
-          <w:color w:val="888888"/>
-          <w:sz w:val="18"/>
-        </w:rPr>
-        <w:t>R9: flagged comments or comments with at least one reply</w:t>
-        <w:br/>
-      </w:r>
-      <w:r>
-        <w:rPr>
-          <w:i/>
-          <w:color w:val="888888"/>
-          <w:sz w:val="18"/>
-        </w:rPr>
-        <w:t>paste the mongosh output here, or save it as S17.png</w:t>
+      </w:pPr>
+      <w:r>
+        <w:drawing>
+          <wp:inline xmlns:a="http://schemas.openxmlformats.org/drawingml/2006/main" xmlns:pic="http://schemas.openxmlformats.org/drawingml/2006/picture">
+            <wp:extent cx="5182184" cy="6035040"/>
+            <wp:docPr id="3" name="Picture 3"/>
+            <wp:cNvGraphicFramePr>
+              <a:graphicFrameLocks noChangeAspect="1"/>
+            </wp:cNvGraphicFramePr>
+            <a:graphic>
+              <a:graphicData uri="http://schemas.openxmlformats.org/drawingml/2006/picture">
+                <pic:pic>
+                  <pic:nvPicPr>
+                    <pic:cNvPr id="0" name="S17.png"/>
+                    <pic:cNvPicPr/>
+                  </pic:nvPicPr>
+                  <pic:blipFill>
+                    <a:blip r:embed="rId11"/>
+                    <a:stretch>
+                      <a:fillRect/>
+                    </a:stretch>
+                  </pic:blipFill>
+                  <pic:spPr>
+                    <a:xfrm>
+                      <a:off x="0" y="0"/>
+                      <a:ext cx="5182184" cy="6035040"/>
+                    </a:xfrm>
+                    <a:prstGeom prst="rect"/>
+                  </pic:spPr>
+                </pic:pic>
+              </a:graphicData>
+            </a:graphic>
+          </wp:inline>
+        </w:drawing>
       </w:r>
     </w:p>
     <w:p>
@@ -6208,41 +6211,42 @@
     </w:p>
     <w:p>
       <w:pPr>
-        <w:spacing w:before="160" w:after="40"/>
+        <w:spacing w:before="120" w:after="40"/>
         <w:jc w:val="center"/>
-        <w:shd w:val="clear" w:color="auto" w:fill="FAFAFA"/>
-        <w:pBdr>
-          <w:top w:val="single" w:sz="4" w:space="6" w:color="C0C0C0"/>
-          <w:left w:val="single" w:sz="4" w:space="6" w:color="C0C0C0"/>
-          <w:bottom w:val="single" w:sz="4" w:space="6" w:color="C0C0C0"/>
-          <w:right w:val="single" w:sz="4" w:space="6" w:color="C0C0C0"/>
-        </w:pBdr>
-      </w:pPr>
-      <w:r>
-        <w:rPr>
-          <w:i/>
-          <w:color w:val="888888"/>
-          <w:sz w:val="20"/>
-        </w:rPr>
-        <w:t>[ screenshot S18 ]</w:t>
-        <w:br/>
-      </w:r>
-      <w:r>
-        <w:rPr>
-          <w:i/>
-          <w:color w:val="888888"/>
-          <w:sz w:val="18"/>
-        </w:rPr>
-        <w:t>R10: count of draft articles</w:t>
-        <w:br/>
-      </w:r>
-      <w:r>
-        <w:rPr>
-          <w:i/>
-          <w:color w:val="888888"/>
-          <w:sz w:val="18"/>
-        </w:rPr>
-        <w:t>paste the mongosh output here, or save it as S18.png</w:t>
+      </w:pPr>
+      <w:r>
+        <w:drawing>
+          <wp:inline xmlns:a="http://schemas.openxmlformats.org/drawingml/2006/main" xmlns:pic="http://schemas.openxmlformats.org/drawingml/2006/picture">
+            <wp:extent cx="5486400" cy="574029"/>
+            <wp:docPr id="4" name="Picture 4"/>
+            <wp:cNvGraphicFramePr>
+              <a:graphicFrameLocks noChangeAspect="1"/>
+            </wp:cNvGraphicFramePr>
+            <a:graphic>
+              <a:graphicData uri="http://schemas.openxmlformats.org/drawingml/2006/picture">
+                <pic:pic>
+                  <pic:nvPicPr>
+                    <pic:cNvPr id="0" name="S18.png"/>
+                    <pic:cNvPicPr/>
+                  </pic:nvPicPr>
+                  <pic:blipFill>
+                    <a:blip r:embed="rId12"/>
+                    <a:stretch>
+                      <a:fillRect/>
+                    </a:stretch>
+                  </pic:blipFill>
+                  <pic:spPr>
+                    <a:xfrm>
+                      <a:off x="0" y="0"/>
+                      <a:ext cx="5486400" cy="574029"/>
+                    </a:xfrm>
+                    <a:prstGeom prst="rect"/>
+                  </pic:spPr>
+                </pic:pic>
+              </a:graphicData>
+            </a:graphic>
+          </wp:inline>
+        </w:drawing>
       </w:r>
     </w:p>
     <w:p>
@@ -6391,41 +6395,42 @@
     </w:p>
     <w:p>
       <w:pPr>
-        <w:spacing w:before="160" w:after="40"/>
+        <w:spacing w:before="120" w:after="40"/>
         <w:jc w:val="center"/>
-        <w:shd w:val="clear" w:color="auto" w:fill="FAFAFA"/>
-        <w:pBdr>
-          <w:top w:val="single" w:sz="4" w:space="6" w:color="C0C0C0"/>
-          <w:left w:val="single" w:sz="4" w:space="6" w:color="C0C0C0"/>
-          <w:bottom w:val="single" w:sz="4" w:space="6" w:color="C0C0C0"/>
-          <w:right w:val="single" w:sz="4" w:space="6" w:color="C0C0C0"/>
-        </w:pBdr>
-      </w:pPr>
-      <w:r>
-        <w:rPr>
-          <w:i/>
-          <w:color w:val="888888"/>
-          <w:sz w:val="20"/>
-        </w:rPr>
-        <w:t>[ screenshot S19 ]</w:t>
-        <w:br/>
-      </w:r>
-      <w:r>
-        <w:rPr>
-          <w:i/>
-          <w:color w:val="888888"/>
-          <w:sz w:val="18"/>
-        </w:rPr>
-        <w:t>R11: articles joined to their author and category names</w:t>
-        <w:br/>
-      </w:r>
-      <w:r>
-        <w:rPr>
-          <w:i/>
-          <w:color w:val="888888"/>
-          <w:sz w:val="18"/>
-        </w:rPr>
-        <w:t>paste the mongosh output here, or save it as S19.png</w:t>
+      </w:pPr>
+      <w:r>
+        <w:drawing>
+          <wp:inline xmlns:a="http://schemas.openxmlformats.org/drawingml/2006/main" xmlns:pic="http://schemas.openxmlformats.org/drawingml/2006/picture">
+            <wp:extent cx="5486400" cy="3950814"/>
+            <wp:docPr id="5" name="Picture 5"/>
+            <wp:cNvGraphicFramePr>
+              <a:graphicFrameLocks noChangeAspect="1"/>
+            </wp:cNvGraphicFramePr>
+            <a:graphic>
+              <a:graphicData uri="http://schemas.openxmlformats.org/drawingml/2006/picture">
+                <pic:pic>
+                  <pic:nvPicPr>
+                    <pic:cNvPr id="0" name="S19.png"/>
+                    <pic:cNvPicPr/>
+                  </pic:nvPicPr>
+                  <pic:blipFill>
+                    <a:blip r:embed="rId13"/>
+                    <a:stretch>
+                      <a:fillRect/>
+                    </a:stretch>
+                  </pic:blipFill>
+                  <pic:spPr>
+                    <a:xfrm>
+                      <a:off x="0" y="0"/>
+                      <a:ext cx="5486400" cy="3950814"/>
+                    </a:xfrm>
+                    <a:prstGeom prst="rect"/>
+                  </pic:spPr>
+                </pic:pic>
+              </a:graphicData>
+            </a:graphic>
+          </wp:inline>
+        </w:drawing>
       </w:r>
     </w:p>
     <w:p>
@@ -6545,7 +6550,7 @@
         <w:drawing>
           <wp:inline xmlns:a="http://schemas.openxmlformats.org/drawingml/2006/main" xmlns:pic="http://schemas.openxmlformats.org/drawingml/2006/picture">
             <wp:extent cx="5486400" cy="4662549"/>
-            <wp:docPr id="1" name="Picture 1"/>
+            <wp:docPr id="6" name="Picture 6"/>
             <wp:cNvGraphicFramePr>
               <a:graphicFrameLocks noChangeAspect="1"/>
             </wp:cNvGraphicFramePr>
@@ -6557,7 +6562,7 @@
                     <pic:cNvPicPr/>
                   </pic:nvPicPr>
                   <pic:blipFill>
-                    <a:blip r:embed="rId9"/>
+                    <a:blip r:embed="rId14"/>
                     <a:stretch>
                       <a:fillRect/>
                     </a:stretch>
@@ -6714,7 +6719,7 @@
         <w:drawing>
           <wp:inline xmlns:a="http://schemas.openxmlformats.org/drawingml/2006/main" xmlns:pic="http://schemas.openxmlformats.org/drawingml/2006/picture">
             <wp:extent cx="5486400" cy="2323902"/>
-            <wp:docPr id="2" name="Picture 2"/>
+            <wp:docPr id="7" name="Picture 7"/>
             <wp:cNvGraphicFramePr>
               <a:graphicFrameLocks noChangeAspect="1"/>
             </wp:cNvGraphicFramePr>
@@ -6726,7 +6731,7 @@
                     <pic:cNvPicPr/>
                   </pic:nvPicPr>
                   <pic:blipFill>
-                    <a:blip r:embed="rId10"/>
+                    <a:blip r:embed="rId15"/>
                     <a:stretch>
                       <a:fillRect/>
                     </a:stretch>
@@ -6853,7 +6858,7 @@
         <w:drawing>
           <wp:inline xmlns:a="http://schemas.openxmlformats.org/drawingml/2006/main" xmlns:pic="http://schemas.openxmlformats.org/drawingml/2006/picture">
             <wp:extent cx="5486400" cy="4188177"/>
-            <wp:docPr id="3" name="Picture 3"/>
+            <wp:docPr id="8" name="Picture 8"/>
             <wp:cNvGraphicFramePr>
               <a:graphicFrameLocks noChangeAspect="1"/>
             </wp:cNvGraphicFramePr>
@@ -6865,7 +6870,7 @@
                     <pic:cNvPicPr/>
                   </pic:nvPicPr>
                   <pic:blipFill>
-                    <a:blip r:embed="rId11"/>
+                    <a:blip r:embed="rId16"/>
                     <a:stretch>
                       <a:fillRect/>
                     </a:stretch>
@@ -7001,7 +7006,7 @@
         <w:drawing>
           <wp:inline xmlns:a="http://schemas.openxmlformats.org/drawingml/2006/main" xmlns:pic="http://schemas.openxmlformats.org/drawingml/2006/picture">
             <wp:extent cx="5486400" cy="2032831"/>
-            <wp:docPr id="4" name="Picture 4"/>
+            <wp:docPr id="9" name="Picture 9"/>
             <wp:cNvGraphicFramePr>
               <a:graphicFrameLocks noChangeAspect="1"/>
             </wp:cNvGraphicFramePr>
@@ -7013,7 +7018,7 @@
                     <pic:cNvPicPr/>
                   </pic:nvPicPr>
                   <pic:blipFill>
-                    <a:blip r:embed="rId12"/>
+                    <a:blip r:embed="rId17"/>
                     <a:stretch>
                       <a:fillRect/>
                     </a:stretch>
@@ -7140,7 +7145,7 @@
         <w:drawing>
           <wp:inline xmlns:a="http://schemas.openxmlformats.org/drawingml/2006/main" xmlns:pic="http://schemas.openxmlformats.org/drawingml/2006/picture">
             <wp:extent cx="5486400" cy="3746001"/>
-            <wp:docPr id="5" name="Picture 5"/>
+            <wp:docPr id="10" name="Picture 10"/>
             <wp:cNvGraphicFramePr>
               <a:graphicFrameLocks noChangeAspect="1"/>
             </wp:cNvGraphicFramePr>
@@ -7152,7 +7157,7 @@
                     <pic:cNvPicPr/>
                   </pic:nvPicPr>
                   <pic:blipFill>
-                    <a:blip r:embed="rId13"/>
+                    <a:blip r:embed="rId18"/>
                     <a:stretch>
                       <a:fillRect/>
                     </a:stretch>
@@ -7297,7 +7302,7 @@
         <w:drawing>
           <wp:inline xmlns:a="http://schemas.openxmlformats.org/drawingml/2006/main" xmlns:pic="http://schemas.openxmlformats.org/drawingml/2006/picture">
             <wp:extent cx="5486400" cy="2725947"/>
-            <wp:docPr id="6" name="Picture 6"/>
+            <wp:docPr id="11" name="Picture 11"/>
             <wp:cNvGraphicFramePr>
               <a:graphicFrameLocks noChangeAspect="1"/>
             </wp:cNvGraphicFramePr>
@@ -7309,7 +7314,7 @@
                     <pic:cNvPicPr/>
                   </pic:nvPicPr>
                   <pic:blipFill>
-                    <a:blip r:embed="rId14"/>
+                    <a:blip r:embed="rId19"/>
                     <a:stretch>
                       <a:fillRect/>
                     </a:stretch>
@@ -7436,7 +7441,7 @@
         <w:drawing>
           <wp:inline xmlns:a="http://schemas.openxmlformats.org/drawingml/2006/main" xmlns:pic="http://schemas.openxmlformats.org/drawingml/2006/picture">
             <wp:extent cx="5486400" cy="5571066"/>
-            <wp:docPr id="7" name="Picture 7"/>
+            <wp:docPr id="12" name="Picture 12"/>
             <wp:cNvGraphicFramePr>
               <a:graphicFrameLocks noChangeAspect="1"/>
             </wp:cNvGraphicFramePr>
@@ -7448,7 +7453,7 @@
                     <pic:cNvPicPr/>
                   </pic:nvPicPr>
                   <pic:blipFill>
-                    <a:blip r:embed="rId15"/>
+                    <a:blip r:embed="rId20"/>
                     <a:stretch>
                       <a:fillRect/>
                     </a:stretch>
@@ -7578,7 +7583,7 @@
         <w:drawing>
           <wp:inline xmlns:a="http://schemas.openxmlformats.org/drawingml/2006/main" xmlns:pic="http://schemas.openxmlformats.org/drawingml/2006/picture">
             <wp:extent cx="5486400" cy="896184"/>
-            <wp:docPr id="8" name="Picture 8"/>
+            <wp:docPr id="13" name="Picture 13"/>
             <wp:cNvGraphicFramePr>
               <a:graphicFrameLocks noChangeAspect="1"/>
             </wp:cNvGraphicFramePr>
@@ -7590,7 +7595,7 @@
                     <pic:cNvPicPr/>
                   </pic:nvPicPr>
                   <pic:blipFill>
-                    <a:blip r:embed="rId16"/>
+                    <a:blip r:embed="rId21"/>
                     <a:stretch>
                       <a:fillRect/>
                     </a:stretch>
@@ -7690,7 +7695,7 @@
         <w:drawing>
           <wp:inline xmlns:a="http://schemas.openxmlformats.org/drawingml/2006/main" xmlns:pic="http://schemas.openxmlformats.org/drawingml/2006/picture">
             <wp:extent cx="4478725" cy="6035040"/>
-            <wp:docPr id="9" name="Picture 9"/>
+            <wp:docPr id="14" name="Picture 14"/>
             <wp:cNvGraphicFramePr>
               <a:graphicFrameLocks noChangeAspect="1"/>
             </wp:cNvGraphicFramePr>
@@ -7702,7 +7707,7 @@
                     <pic:cNvPicPr/>
                   </pic:nvPicPr>
                   <pic:blipFill>
-                    <a:blip r:embed="rId17"/>
+                    <a:blip r:embed="rId22"/>
                     <a:stretch>
                       <a:fillRect/>
                     </a:stretch>
@@ -7802,7 +7807,7 @@
         <w:drawing>
           <wp:inline xmlns:a="http://schemas.openxmlformats.org/drawingml/2006/main" xmlns:pic="http://schemas.openxmlformats.org/drawingml/2006/picture">
             <wp:extent cx="5283528" cy="6035040"/>
-            <wp:docPr id="10" name="Picture 10"/>
+            <wp:docPr id="15" name="Picture 15"/>
             <wp:cNvGraphicFramePr>
               <a:graphicFrameLocks noChangeAspect="1"/>
             </wp:cNvGraphicFramePr>
@@ -7814,7 +7819,7 @@
                     <pic:cNvPicPr/>
                   </pic:nvPicPr>
                   <pic:blipFill>
-                    <a:blip r:embed="rId18"/>
+                    <a:blip r:embed="rId23"/>
                     <a:stretch>
                       <a:fillRect/>
                     </a:stretch>

</xml_diff>

<commit_message>
Embed the authors, articles, readers and comments inserts and the counts
Co-Authored-By: Claude Opus 5 <noreply@anthropic.com>
Claude-Session: https://claude.ai/code/session_01WKECxGAA4Qrww3QEZbaem4
</commit_message>
<xml_diff>
--- a/dbms_casestudy/News_Portal_MongoDB_CaseStudy_24BCE2743.docx
+++ b/dbms_casestudy/News_Portal_MongoDB_CaseStudy_24BCE2743.docx
@@ -4268,41 +4268,42 @@
     </w:p>
     <w:p>
       <w:pPr>
-        <w:spacing w:before="160" w:after="40"/>
+        <w:spacing w:before="120" w:after="40"/>
         <w:jc w:val="center"/>
-        <w:shd w:val="clear" w:color="auto" w:fill="FAFAFA"/>
-        <w:pBdr>
-          <w:top w:val="single" w:sz="4" w:space="6" w:color="C0C0C0"/>
-          <w:left w:val="single" w:sz="4" w:space="6" w:color="C0C0C0"/>
-          <w:bottom w:val="single" w:sz="4" w:space="6" w:color="C0C0C0"/>
-          <w:right w:val="single" w:sz="4" w:space="6" w:color="C0C0C0"/>
-        </w:pBdr>
       </w:pPr>
       <w:r>
-        <w:rPr>
-          <w:i/>
-          <w:color w:val="888888"/>
-          <w:sz w:val="20"/>
-        </w:rPr>
-        <w:t>[ screenshot S04 ]</w:t>
-        <w:br/>
-      </w:r>
-      <w:r>
-        <w:rPr>
-          <w:i/>
-          <w:color w:val="888888"/>
-          <w:sz w:val="18"/>
-        </w:rPr>
-        <w:t>insertMany() adding eight author profiles</w:t>
-        <w:br/>
-      </w:r>
-      <w:r>
-        <w:rPr>
-          <w:i/>
-          <w:color w:val="888888"/>
-          <w:sz w:val="18"/>
-        </w:rPr>
-        <w:t>paste the mongosh output here, or save it as S04.png</w:t>
+        <w:drawing>
+          <wp:inline xmlns:a="http://schemas.openxmlformats.org/drawingml/2006/main" xmlns:pic="http://schemas.openxmlformats.org/drawingml/2006/picture">
+            <wp:extent cx="5486400" cy="2667000"/>
+            <wp:docPr id="1" name="Picture 1"/>
+            <wp:cNvGraphicFramePr>
+              <a:graphicFrameLocks noChangeAspect="1"/>
+            </wp:cNvGraphicFramePr>
+            <a:graphic>
+              <a:graphicData uri="http://schemas.openxmlformats.org/drawingml/2006/picture">
+                <pic:pic>
+                  <pic:nvPicPr>
+                    <pic:cNvPr id="0" name="S04.png"/>
+                    <pic:cNvPicPr/>
+                  </pic:nvPicPr>
+                  <pic:blipFill>
+                    <a:blip r:embed="rId9"/>
+                    <a:stretch>
+                      <a:fillRect/>
+                    </a:stretch>
+                  </pic:blipFill>
+                  <pic:spPr>
+                    <a:xfrm>
+                      <a:off x="0" y="0"/>
+                      <a:ext cx="5486400" cy="2667000"/>
+                    </a:xfrm>
+                    <a:prstGeom prst="rect"/>
+                  </pic:spPr>
+                </pic:pic>
+              </a:graphicData>
+            </a:graphic>
+          </wp:inline>
+        </w:drawing>
       </w:r>
     </w:p>
     <w:p>
@@ -4442,41 +4443,42 @@
     </w:p>
     <w:p>
       <w:pPr>
-        <w:spacing w:before="160" w:after="40"/>
+        <w:spacing w:before="120" w:after="40"/>
         <w:jc w:val="center"/>
-        <w:shd w:val="clear" w:color="auto" w:fill="FAFAFA"/>
-        <w:pBdr>
-          <w:top w:val="single" w:sz="4" w:space="6" w:color="C0C0C0"/>
-          <w:left w:val="single" w:sz="4" w:space="6" w:color="C0C0C0"/>
-          <w:bottom w:val="single" w:sz="4" w:space="6" w:color="C0C0C0"/>
-          <w:right w:val="single" w:sz="4" w:space="6" w:color="C0C0C0"/>
-        </w:pBdr>
       </w:pPr>
       <w:r>
-        <w:rPr>
-          <w:i/>
-          <w:color w:val="888888"/>
-          <w:sz w:val="20"/>
-        </w:rPr>
-        <w:t>[ screenshot S05 ]</w:t>
-        <w:br/>
-      </w:r>
-      <w:r>
-        <w:rPr>
-          <w:i/>
-          <w:color w:val="888888"/>
-          <w:sz w:val="18"/>
-        </w:rPr>
-        <w:t>insertMany() adding ten articles</w:t>
-        <w:br/>
-      </w:r>
-      <w:r>
-        <w:rPr>
-          <w:i/>
-          <w:color w:val="888888"/>
-          <w:sz w:val="18"/>
-        </w:rPr>
-        <w:t>paste the mongosh output here, or save it as S05.png</w:t>
+        <w:drawing>
+          <wp:inline xmlns:a="http://schemas.openxmlformats.org/drawingml/2006/main" xmlns:pic="http://schemas.openxmlformats.org/drawingml/2006/picture">
+            <wp:extent cx="5486400" cy="3118035"/>
+            <wp:docPr id="2" name="Picture 2"/>
+            <wp:cNvGraphicFramePr>
+              <a:graphicFrameLocks noChangeAspect="1"/>
+            </wp:cNvGraphicFramePr>
+            <a:graphic>
+              <a:graphicData uri="http://schemas.openxmlformats.org/drawingml/2006/picture">
+                <pic:pic>
+                  <pic:nvPicPr>
+                    <pic:cNvPr id="0" name="S05.png"/>
+                    <pic:cNvPicPr/>
+                  </pic:nvPicPr>
+                  <pic:blipFill>
+                    <a:blip r:embed="rId10"/>
+                    <a:stretch>
+                      <a:fillRect/>
+                    </a:stretch>
+                  </pic:blipFill>
+                  <pic:spPr>
+                    <a:xfrm>
+                      <a:off x="0" y="0"/>
+                      <a:ext cx="5486400" cy="3118035"/>
+                    </a:xfrm>
+                    <a:prstGeom prst="rect"/>
+                  </pic:spPr>
+                </pic:pic>
+              </a:graphicData>
+            </a:graphic>
+          </wp:inline>
+        </w:drawing>
       </w:r>
     </w:p>
     <w:p>
@@ -4607,41 +4609,42 @@
     </w:p>
     <w:p>
       <w:pPr>
-        <w:spacing w:before="160" w:after="40"/>
+        <w:spacing w:before="120" w:after="40"/>
         <w:jc w:val="center"/>
-        <w:shd w:val="clear" w:color="auto" w:fill="FAFAFA"/>
-        <w:pBdr>
-          <w:top w:val="single" w:sz="4" w:space="6" w:color="C0C0C0"/>
-          <w:left w:val="single" w:sz="4" w:space="6" w:color="C0C0C0"/>
-          <w:bottom w:val="single" w:sz="4" w:space="6" w:color="C0C0C0"/>
-          <w:right w:val="single" w:sz="4" w:space="6" w:color="C0C0C0"/>
-        </w:pBdr>
       </w:pPr>
       <w:r>
-        <w:rPr>
-          <w:i/>
-          <w:color w:val="888888"/>
-          <w:sz w:val="20"/>
-        </w:rPr>
-        <w:t>[ screenshot S06 ]</w:t>
-        <w:br/>
-      </w:r>
-      <w:r>
-        <w:rPr>
-          <w:i/>
-          <w:color w:val="888888"/>
-          <w:sz w:val="18"/>
-        </w:rPr>
-        <w:t>insertMany() adding eight reader accounts</w:t>
-        <w:br/>
-      </w:r>
-      <w:r>
-        <w:rPr>
-          <w:i/>
-          <w:color w:val="888888"/>
-          <w:sz w:val="18"/>
-        </w:rPr>
-        <w:t>paste the mongosh output here, or save it as S06.png</w:t>
+        <w:drawing>
+          <wp:inline xmlns:a="http://schemas.openxmlformats.org/drawingml/2006/main" xmlns:pic="http://schemas.openxmlformats.org/drawingml/2006/picture">
+            <wp:extent cx="5486400" cy="2657358"/>
+            <wp:docPr id="3" name="Picture 3"/>
+            <wp:cNvGraphicFramePr>
+              <a:graphicFrameLocks noChangeAspect="1"/>
+            </wp:cNvGraphicFramePr>
+            <a:graphic>
+              <a:graphicData uri="http://schemas.openxmlformats.org/drawingml/2006/picture">
+                <pic:pic>
+                  <pic:nvPicPr>
+                    <pic:cNvPr id="0" name="S06.png"/>
+                    <pic:cNvPicPr/>
+                  </pic:nvPicPr>
+                  <pic:blipFill>
+                    <a:blip r:embed="rId11"/>
+                    <a:stretch>
+                      <a:fillRect/>
+                    </a:stretch>
+                  </pic:blipFill>
+                  <pic:spPr>
+                    <a:xfrm>
+                      <a:off x="0" y="0"/>
+                      <a:ext cx="5486400" cy="2657358"/>
+                    </a:xfrm>
+                    <a:prstGeom prst="rect"/>
+                  </pic:spPr>
+                </pic:pic>
+              </a:graphicData>
+            </a:graphic>
+          </wp:inline>
+        </w:drawing>
       </w:r>
     </w:p>
     <w:p>
@@ -4772,41 +4775,42 @@
     </w:p>
     <w:p>
       <w:pPr>
-        <w:spacing w:before="160" w:after="40"/>
+        <w:spacing w:before="120" w:after="40"/>
         <w:jc w:val="center"/>
-        <w:shd w:val="clear" w:color="auto" w:fill="FAFAFA"/>
-        <w:pBdr>
-          <w:top w:val="single" w:sz="4" w:space="6" w:color="C0C0C0"/>
-          <w:left w:val="single" w:sz="4" w:space="6" w:color="C0C0C0"/>
-          <w:bottom w:val="single" w:sz="4" w:space="6" w:color="C0C0C0"/>
-          <w:right w:val="single" w:sz="4" w:space="6" w:color="C0C0C0"/>
-        </w:pBdr>
       </w:pPr>
       <w:r>
-        <w:rPr>
-          <w:i/>
-          <w:color w:val="888888"/>
-          <w:sz w:val="20"/>
-        </w:rPr>
-        <w:t>[ screenshot S07 ]</w:t>
-        <w:br/>
-      </w:r>
-      <w:r>
-        <w:rPr>
-          <w:i/>
-          <w:color w:val="888888"/>
-          <w:sz w:val="18"/>
-        </w:rPr>
-        <w:t>insertMany() adding ten comments with embedded replies</w:t>
-        <w:br/>
-      </w:r>
-      <w:r>
-        <w:rPr>
-          <w:i/>
-          <w:color w:val="888888"/>
-          <w:sz w:val="18"/>
-        </w:rPr>
-        <w:t>paste the mongosh output here, or save it as S07.png</w:t>
+        <w:drawing>
+          <wp:inline xmlns:a="http://schemas.openxmlformats.org/drawingml/2006/main" xmlns:pic="http://schemas.openxmlformats.org/drawingml/2006/picture">
+            <wp:extent cx="5486400" cy="3108452"/>
+            <wp:docPr id="4" name="Picture 4"/>
+            <wp:cNvGraphicFramePr>
+              <a:graphicFrameLocks noChangeAspect="1"/>
+            </wp:cNvGraphicFramePr>
+            <a:graphic>
+              <a:graphicData uri="http://schemas.openxmlformats.org/drawingml/2006/picture">
+                <pic:pic>
+                  <pic:nvPicPr>
+                    <pic:cNvPr id="0" name="S07.png"/>
+                    <pic:cNvPicPr/>
+                  </pic:nvPicPr>
+                  <pic:blipFill>
+                    <a:blip r:embed="rId12"/>
+                    <a:stretch>
+                      <a:fillRect/>
+                    </a:stretch>
+                  </pic:blipFill>
+                  <pic:spPr>
+                    <a:xfrm>
+                      <a:off x="0" y="0"/>
+                      <a:ext cx="5486400" cy="3108452"/>
+                    </a:xfrm>
+                    <a:prstGeom prst="rect"/>
+                  </pic:spPr>
+                </pic:pic>
+              </a:graphicData>
+            </a:graphic>
+          </wp:inline>
+        </w:drawing>
       </w:r>
     </w:p>
     <w:p>
@@ -4910,41 +4914,42 @@
     </w:p>
     <w:p>
       <w:pPr>
-        <w:spacing w:before="160" w:after="40"/>
+        <w:spacing w:before="120" w:after="40"/>
         <w:jc w:val="center"/>
-        <w:shd w:val="clear" w:color="auto" w:fill="FAFAFA"/>
-        <w:pBdr>
-          <w:top w:val="single" w:sz="4" w:space="6" w:color="C0C0C0"/>
-          <w:left w:val="single" w:sz="4" w:space="6" w:color="C0C0C0"/>
-          <w:bottom w:val="single" w:sz="4" w:space="6" w:color="C0C0C0"/>
-          <w:right w:val="single" w:sz="4" w:space="6" w:color="C0C0C0"/>
-        </w:pBdr>
       </w:pPr>
       <w:r>
-        <w:rPr>
-          <w:i/>
-          <w:color w:val="888888"/>
-          <w:sz w:val="20"/>
-        </w:rPr>
-        <w:t>[ screenshot S08 ]</w:t>
-        <w:br/>
-      </w:r>
-      <w:r>
-        <w:rPr>
-          <w:i/>
-          <w:color w:val="888888"/>
-          <w:sz w:val="18"/>
-        </w:rPr>
-        <w:t>countDocuments() confirming 8, 8, 10, 8 and 10 documents</w:t>
-        <w:br/>
-      </w:r>
-      <w:r>
-        <w:rPr>
-          <w:i/>
-          <w:color w:val="888888"/>
-          <w:sz w:val="18"/>
-        </w:rPr>
-        <w:t>paste the mongosh output here, or save it as S08.png</w:t>
+        <w:drawing>
+          <wp:inline xmlns:a="http://schemas.openxmlformats.org/drawingml/2006/main" xmlns:pic="http://schemas.openxmlformats.org/drawingml/2006/picture">
+            <wp:extent cx="5486400" cy="4624661"/>
+            <wp:docPr id="5" name="Picture 5"/>
+            <wp:cNvGraphicFramePr>
+              <a:graphicFrameLocks noChangeAspect="1"/>
+            </wp:cNvGraphicFramePr>
+            <a:graphic>
+              <a:graphicData uri="http://schemas.openxmlformats.org/drawingml/2006/picture">
+                <pic:pic>
+                  <pic:nvPicPr>
+                    <pic:cNvPr id="0" name="S08.png"/>
+                    <pic:cNvPicPr/>
+                  </pic:nvPicPr>
+                  <pic:blipFill>
+                    <a:blip r:embed="rId13"/>
+                    <a:stretch>
+                      <a:fillRect/>
+                    </a:stretch>
+                  </pic:blipFill>
+                  <pic:spPr>
+                    <a:xfrm>
+                      <a:off x="0" y="0"/>
+                      <a:ext cx="5486400" cy="4624661"/>
+                    </a:xfrm>
+                    <a:prstGeom prst="rect"/>
+                  </pic:spPr>
+                </pic:pic>
+              </a:graphicData>
+            </a:graphic>
+          </wp:inline>
+        </w:drawing>
       </w:r>
     </w:p>
     <w:p>
@@ -5090,7 +5095,7 @@
         <w:drawing>
           <wp:inline xmlns:a="http://schemas.openxmlformats.org/drawingml/2006/main" xmlns:pic="http://schemas.openxmlformats.org/drawingml/2006/picture">
             <wp:extent cx="5486400" cy="3306008"/>
-            <wp:docPr id="1" name="Picture 1"/>
+            <wp:docPr id="6" name="Picture 6"/>
             <wp:cNvGraphicFramePr>
               <a:graphicFrameLocks noChangeAspect="1"/>
             </wp:cNvGraphicFramePr>
@@ -5102,7 +5107,7 @@
                     <pic:cNvPicPr/>
                   </pic:nvPicPr>
                   <pic:blipFill>
-                    <a:blip r:embed="rId9"/>
+                    <a:blip r:embed="rId14"/>
                     <a:stretch>
                       <a:fillRect/>
                     </a:stretch>
@@ -5220,7 +5225,7 @@
         <w:drawing>
           <wp:inline xmlns:a="http://schemas.openxmlformats.org/drawingml/2006/main" xmlns:pic="http://schemas.openxmlformats.org/drawingml/2006/picture">
             <wp:extent cx="5486400" cy="4974336"/>
-            <wp:docPr id="2" name="Picture 2"/>
+            <wp:docPr id="7" name="Picture 7"/>
             <wp:cNvGraphicFramePr>
               <a:graphicFrameLocks noChangeAspect="1"/>
             </wp:cNvGraphicFramePr>
@@ -5232,7 +5237,7 @@
                     <pic:cNvPicPr/>
                   </pic:nvPicPr>
                   <pic:blipFill>
-                    <a:blip r:embed="rId10"/>
+                    <a:blip r:embed="rId15"/>
                     <a:stretch>
                       <a:fillRect/>
                     </a:stretch>
@@ -5350,7 +5355,7 @@
         <w:drawing>
           <wp:inline xmlns:a="http://schemas.openxmlformats.org/drawingml/2006/main" xmlns:pic="http://schemas.openxmlformats.org/drawingml/2006/picture">
             <wp:extent cx="5486400" cy="5965079"/>
-            <wp:docPr id="3" name="Picture 3"/>
+            <wp:docPr id="8" name="Picture 8"/>
             <wp:cNvGraphicFramePr>
               <a:graphicFrameLocks noChangeAspect="1"/>
             </wp:cNvGraphicFramePr>
@@ -5362,7 +5367,7 @@
                     <pic:cNvPicPr/>
                   </pic:nvPicPr>
                   <pic:blipFill>
-                    <a:blip r:embed="rId11"/>
+                    <a:blip r:embed="rId16"/>
                     <a:stretch>
                       <a:fillRect/>
                     </a:stretch>
@@ -5471,7 +5476,7 @@
         <w:drawing>
           <wp:inline xmlns:a="http://schemas.openxmlformats.org/drawingml/2006/main" xmlns:pic="http://schemas.openxmlformats.org/drawingml/2006/picture">
             <wp:extent cx="5486400" cy="3493510"/>
-            <wp:docPr id="4" name="Picture 4"/>
+            <wp:docPr id="9" name="Picture 9"/>
             <wp:cNvGraphicFramePr>
               <a:graphicFrameLocks noChangeAspect="1"/>
             </wp:cNvGraphicFramePr>
@@ -5483,7 +5488,7 @@
                     <pic:cNvPicPr/>
                   </pic:nvPicPr>
                   <pic:blipFill>
-                    <a:blip r:embed="rId12"/>
+                    <a:blip r:embed="rId17"/>
                     <a:stretch>
                       <a:fillRect/>
                     </a:stretch>
@@ -5601,7 +5606,7 @@
         <w:drawing>
           <wp:inline xmlns:a="http://schemas.openxmlformats.org/drawingml/2006/main" xmlns:pic="http://schemas.openxmlformats.org/drawingml/2006/picture">
             <wp:extent cx="5486400" cy="4844872"/>
-            <wp:docPr id="5" name="Picture 5"/>
+            <wp:docPr id="10" name="Picture 10"/>
             <wp:cNvGraphicFramePr>
               <a:graphicFrameLocks noChangeAspect="1"/>
             </wp:cNvGraphicFramePr>
@@ -5613,7 +5618,7 @@
                     <pic:cNvPicPr/>
                   </pic:nvPicPr>
                   <pic:blipFill>
-                    <a:blip r:embed="rId13"/>
+                    <a:blip r:embed="rId18"/>
                     <a:stretch>
                       <a:fillRect/>
                     </a:stretch>
@@ -5860,7 +5865,7 @@
         <w:drawing>
           <wp:inline xmlns:a="http://schemas.openxmlformats.org/drawingml/2006/main" xmlns:pic="http://schemas.openxmlformats.org/drawingml/2006/picture">
             <wp:extent cx="5486400" cy="4869488"/>
-            <wp:docPr id="6" name="Picture 6"/>
+            <wp:docPr id="11" name="Picture 11"/>
             <wp:cNvGraphicFramePr>
               <a:graphicFrameLocks noChangeAspect="1"/>
             </wp:cNvGraphicFramePr>
@@ -5872,7 +5877,7 @@
                     <pic:cNvPicPr/>
                   </pic:nvPicPr>
                   <pic:blipFill>
-                    <a:blip r:embed="rId14"/>
+                    <a:blip r:embed="rId19"/>
                     <a:stretch>
                       <a:fillRect/>
                     </a:stretch>
@@ -5990,7 +5995,7 @@
         <w:drawing>
           <wp:inline xmlns:a="http://schemas.openxmlformats.org/drawingml/2006/main" xmlns:pic="http://schemas.openxmlformats.org/drawingml/2006/picture">
             <wp:extent cx="5486400" cy="3207306"/>
-            <wp:docPr id="7" name="Picture 7"/>
+            <wp:docPr id="12" name="Picture 12"/>
             <wp:cNvGraphicFramePr>
               <a:graphicFrameLocks noChangeAspect="1"/>
             </wp:cNvGraphicFramePr>
@@ -6002,7 +6007,7 @@
                     <pic:cNvPicPr/>
                   </pic:nvPicPr>
                   <pic:blipFill>
-                    <a:blip r:embed="rId15"/>
+                    <a:blip r:embed="rId20"/>
                     <a:stretch>
                       <a:fillRect/>
                     </a:stretch>
@@ -6120,7 +6125,7 @@
         <w:drawing>
           <wp:inline xmlns:a="http://schemas.openxmlformats.org/drawingml/2006/main" xmlns:pic="http://schemas.openxmlformats.org/drawingml/2006/picture">
             <wp:extent cx="5182184" cy="6035040"/>
-            <wp:docPr id="8" name="Picture 8"/>
+            <wp:docPr id="13" name="Picture 13"/>
             <wp:cNvGraphicFramePr>
               <a:graphicFrameLocks noChangeAspect="1"/>
             </wp:cNvGraphicFramePr>
@@ -6132,7 +6137,7 @@
                     <pic:cNvPicPr/>
                   </pic:nvPicPr>
                   <pic:blipFill>
-                    <a:blip r:embed="rId16"/>
+                    <a:blip r:embed="rId21"/>
                     <a:stretch>
                       <a:fillRect/>
                     </a:stretch>
@@ -6223,7 +6228,7 @@
         <w:drawing>
           <wp:inline xmlns:a="http://schemas.openxmlformats.org/drawingml/2006/main" xmlns:pic="http://schemas.openxmlformats.org/drawingml/2006/picture">
             <wp:extent cx="5486400" cy="574029"/>
-            <wp:docPr id="9" name="Picture 9"/>
+            <wp:docPr id="14" name="Picture 14"/>
             <wp:cNvGraphicFramePr>
               <a:graphicFrameLocks noChangeAspect="1"/>
             </wp:cNvGraphicFramePr>
@@ -6235,7 +6240,7 @@
                     <pic:cNvPicPr/>
                   </pic:nvPicPr>
                   <pic:blipFill>
-                    <a:blip r:embed="rId17"/>
+                    <a:blip r:embed="rId22"/>
                     <a:stretch>
                       <a:fillRect/>
                     </a:stretch>
@@ -6407,7 +6412,7 @@
         <w:drawing>
           <wp:inline xmlns:a="http://schemas.openxmlformats.org/drawingml/2006/main" xmlns:pic="http://schemas.openxmlformats.org/drawingml/2006/picture">
             <wp:extent cx="5486400" cy="3950814"/>
-            <wp:docPr id="10" name="Picture 10"/>
+            <wp:docPr id="15" name="Picture 15"/>
             <wp:cNvGraphicFramePr>
               <a:graphicFrameLocks noChangeAspect="1"/>
             </wp:cNvGraphicFramePr>
@@ -6419,7 +6424,7 @@
                     <pic:cNvPicPr/>
                   </pic:nvPicPr>
                   <pic:blipFill>
-                    <a:blip r:embed="rId18"/>
+                    <a:blip r:embed="rId23"/>
                     <a:stretch>
                       <a:fillRect/>
                     </a:stretch>
@@ -6555,7 +6560,7 @@
         <w:drawing>
           <wp:inline xmlns:a="http://schemas.openxmlformats.org/drawingml/2006/main" xmlns:pic="http://schemas.openxmlformats.org/drawingml/2006/picture">
             <wp:extent cx="5486400" cy="4662549"/>
-            <wp:docPr id="11" name="Picture 11"/>
+            <wp:docPr id="16" name="Picture 16"/>
             <wp:cNvGraphicFramePr>
               <a:graphicFrameLocks noChangeAspect="1"/>
             </wp:cNvGraphicFramePr>
@@ -6567,7 +6572,7 @@
                     <pic:cNvPicPr/>
                   </pic:nvPicPr>
                   <pic:blipFill>
-                    <a:blip r:embed="rId19"/>
+                    <a:blip r:embed="rId24"/>
                     <a:stretch>
                       <a:fillRect/>
                     </a:stretch>
@@ -6724,7 +6729,7 @@
         <w:drawing>
           <wp:inline xmlns:a="http://schemas.openxmlformats.org/drawingml/2006/main" xmlns:pic="http://schemas.openxmlformats.org/drawingml/2006/picture">
             <wp:extent cx="5486400" cy="2323902"/>
-            <wp:docPr id="12" name="Picture 12"/>
+            <wp:docPr id="17" name="Picture 17"/>
             <wp:cNvGraphicFramePr>
               <a:graphicFrameLocks noChangeAspect="1"/>
             </wp:cNvGraphicFramePr>
@@ -6736,7 +6741,7 @@
                     <pic:cNvPicPr/>
                   </pic:nvPicPr>
                   <pic:blipFill>
-                    <a:blip r:embed="rId20"/>
+                    <a:blip r:embed="rId25"/>
                     <a:stretch>
                       <a:fillRect/>
                     </a:stretch>
@@ -6863,7 +6868,7 @@
         <w:drawing>
           <wp:inline xmlns:a="http://schemas.openxmlformats.org/drawingml/2006/main" xmlns:pic="http://schemas.openxmlformats.org/drawingml/2006/picture">
             <wp:extent cx="5486400" cy="4188177"/>
-            <wp:docPr id="13" name="Picture 13"/>
+            <wp:docPr id="18" name="Picture 18"/>
             <wp:cNvGraphicFramePr>
               <a:graphicFrameLocks noChangeAspect="1"/>
             </wp:cNvGraphicFramePr>
@@ -6875,7 +6880,7 @@
                     <pic:cNvPicPr/>
                   </pic:nvPicPr>
                   <pic:blipFill>
-                    <a:blip r:embed="rId21"/>
+                    <a:blip r:embed="rId26"/>
                     <a:stretch>
                       <a:fillRect/>
                     </a:stretch>
@@ -7011,7 +7016,7 @@
         <w:drawing>
           <wp:inline xmlns:a="http://schemas.openxmlformats.org/drawingml/2006/main" xmlns:pic="http://schemas.openxmlformats.org/drawingml/2006/picture">
             <wp:extent cx="5486400" cy="2032831"/>
-            <wp:docPr id="14" name="Picture 14"/>
+            <wp:docPr id="19" name="Picture 19"/>
             <wp:cNvGraphicFramePr>
               <a:graphicFrameLocks noChangeAspect="1"/>
             </wp:cNvGraphicFramePr>
@@ -7023,7 +7028,7 @@
                     <pic:cNvPicPr/>
                   </pic:nvPicPr>
                   <pic:blipFill>
-                    <a:blip r:embed="rId22"/>
+                    <a:blip r:embed="rId27"/>
                     <a:stretch>
                       <a:fillRect/>
                     </a:stretch>
@@ -7150,7 +7155,7 @@
         <w:drawing>
           <wp:inline xmlns:a="http://schemas.openxmlformats.org/drawingml/2006/main" xmlns:pic="http://schemas.openxmlformats.org/drawingml/2006/picture">
             <wp:extent cx="5486400" cy="3746001"/>
-            <wp:docPr id="15" name="Picture 15"/>
+            <wp:docPr id="20" name="Picture 20"/>
             <wp:cNvGraphicFramePr>
               <a:graphicFrameLocks noChangeAspect="1"/>
             </wp:cNvGraphicFramePr>
@@ -7162,7 +7167,7 @@
                     <pic:cNvPicPr/>
                   </pic:nvPicPr>
                   <pic:blipFill>
-                    <a:blip r:embed="rId23"/>
+                    <a:blip r:embed="rId28"/>
                     <a:stretch>
                       <a:fillRect/>
                     </a:stretch>
@@ -7307,7 +7312,7 @@
         <w:drawing>
           <wp:inline xmlns:a="http://schemas.openxmlformats.org/drawingml/2006/main" xmlns:pic="http://schemas.openxmlformats.org/drawingml/2006/picture">
             <wp:extent cx="5486400" cy="2725947"/>
-            <wp:docPr id="16" name="Picture 16"/>
+            <wp:docPr id="21" name="Picture 21"/>
             <wp:cNvGraphicFramePr>
               <a:graphicFrameLocks noChangeAspect="1"/>
             </wp:cNvGraphicFramePr>
@@ -7319,7 +7324,7 @@
                     <pic:cNvPicPr/>
                   </pic:nvPicPr>
                   <pic:blipFill>
-                    <a:blip r:embed="rId24"/>
+                    <a:blip r:embed="rId29"/>
                     <a:stretch>
                       <a:fillRect/>
                     </a:stretch>
@@ -7446,7 +7451,7 @@
         <w:drawing>
           <wp:inline xmlns:a="http://schemas.openxmlformats.org/drawingml/2006/main" xmlns:pic="http://schemas.openxmlformats.org/drawingml/2006/picture">
             <wp:extent cx="5486400" cy="5571066"/>
-            <wp:docPr id="17" name="Picture 17"/>
+            <wp:docPr id="22" name="Picture 22"/>
             <wp:cNvGraphicFramePr>
               <a:graphicFrameLocks noChangeAspect="1"/>
             </wp:cNvGraphicFramePr>
@@ -7458,7 +7463,7 @@
                     <pic:cNvPicPr/>
                   </pic:nvPicPr>
                   <pic:blipFill>
-                    <a:blip r:embed="rId25"/>
+                    <a:blip r:embed="rId30"/>
                     <a:stretch>
                       <a:fillRect/>
                     </a:stretch>
@@ -7588,7 +7593,7 @@
         <w:drawing>
           <wp:inline xmlns:a="http://schemas.openxmlformats.org/drawingml/2006/main" xmlns:pic="http://schemas.openxmlformats.org/drawingml/2006/picture">
             <wp:extent cx="5486400" cy="896184"/>
-            <wp:docPr id="18" name="Picture 18"/>
+            <wp:docPr id="23" name="Picture 23"/>
             <wp:cNvGraphicFramePr>
               <a:graphicFrameLocks noChangeAspect="1"/>
             </wp:cNvGraphicFramePr>
@@ -7600,7 +7605,7 @@
                     <pic:cNvPicPr/>
                   </pic:nvPicPr>
                   <pic:blipFill>
-                    <a:blip r:embed="rId26"/>
+                    <a:blip r:embed="rId31"/>
                     <a:stretch>
                       <a:fillRect/>
                     </a:stretch>
@@ -7700,7 +7705,7 @@
         <w:drawing>
           <wp:inline xmlns:a="http://schemas.openxmlformats.org/drawingml/2006/main" xmlns:pic="http://schemas.openxmlformats.org/drawingml/2006/picture">
             <wp:extent cx="4478725" cy="6035040"/>
-            <wp:docPr id="19" name="Picture 19"/>
+            <wp:docPr id="24" name="Picture 24"/>
             <wp:cNvGraphicFramePr>
               <a:graphicFrameLocks noChangeAspect="1"/>
             </wp:cNvGraphicFramePr>
@@ -7712,7 +7717,7 @@
                     <pic:cNvPicPr/>
                   </pic:nvPicPr>
                   <pic:blipFill>
-                    <a:blip r:embed="rId27"/>
+                    <a:blip r:embed="rId32"/>
                     <a:stretch>
                       <a:fillRect/>
                     </a:stretch>
@@ -7812,7 +7817,7 @@
         <w:drawing>
           <wp:inline xmlns:a="http://schemas.openxmlformats.org/drawingml/2006/main" xmlns:pic="http://schemas.openxmlformats.org/drawingml/2006/picture">
             <wp:extent cx="5283528" cy="6035040"/>
-            <wp:docPr id="20" name="Picture 20"/>
+            <wp:docPr id="25" name="Picture 25"/>
             <wp:cNvGraphicFramePr>
               <a:graphicFrameLocks noChangeAspect="1"/>
             </wp:cNvGraphicFramePr>
@@ -7824,7 +7829,7 @@
                     <pic:cNvPicPr/>
                   </pic:nvPicPr>
                   <pic:blipFill>
-                    <a:blip r:embed="rId28"/>
+                    <a:blip r:embed="rId33"/>
                     <a:stretch>
                       <a:fillRect/>
                     </a:stretch>

</xml_diff>

<commit_message>
Embed the Task 4 creation and the two category inserts
Leaves S14 (R6) as the only outstanding figure.

Co-Authored-By: Claude Opus 5 <noreply@anthropic.com>
Claude-Session: https://claude.ai/code/session_01WKECxGAA4Qrww3QEZbaem4
</commit_message>
<xml_diff>
--- a/dbms_casestudy/News_Portal_MongoDB_CaseStudy_24BCE2743.docx
+++ b/dbms_casestudy/News_Portal_MongoDB_CaseStudy_24BCE2743.docx
@@ -3779,41 +3779,42 @@
     </w:p>
     <w:p>
       <w:pPr>
-        <w:spacing w:before="160" w:after="40"/>
+        <w:spacing w:before="120" w:after="40"/>
         <w:jc w:val="center"/>
-        <w:shd w:val="clear" w:color="auto" w:fill="FAFAFA"/>
-        <w:pBdr>
-          <w:top w:val="single" w:sz="4" w:space="6" w:color="C0C0C0"/>
-          <w:left w:val="single" w:sz="4" w:space="6" w:color="C0C0C0"/>
-          <w:bottom w:val="single" w:sz="4" w:space="6" w:color="C0C0C0"/>
-          <w:right w:val="single" w:sz="4" w:space="6" w:color="C0C0C0"/>
-        </w:pBdr>
       </w:pPr>
       <w:r>
-        <w:rPr>
-          <w:i/>
-          <w:color w:val="888888"/>
-          <w:sz w:val="20"/>
-        </w:rPr>
-        <w:t>[ screenshot S01 ]</w:t>
-        <w:br/>
-      </w:r>
-      <w:r>
-        <w:rPr>
-          <w:i/>
-          <w:color w:val="888888"/>
-          <w:sz w:val="18"/>
-        </w:rPr>
-        <w:t>Database and collections created, verified with show collections</w:t>
-        <w:br/>
-      </w:r>
-      <w:r>
-        <w:rPr>
-          <w:i/>
-          <w:color w:val="888888"/>
-          <w:sz w:val="18"/>
-        </w:rPr>
-        <w:t>paste the mongosh output here, or save it as S01.png</w:t>
+        <w:drawing>
+          <wp:inline xmlns:a="http://schemas.openxmlformats.org/drawingml/2006/main" xmlns:pic="http://schemas.openxmlformats.org/drawingml/2006/picture">
+            <wp:extent cx="5486400" cy="4320459"/>
+            <wp:docPr id="1" name="Picture 1"/>
+            <wp:cNvGraphicFramePr>
+              <a:graphicFrameLocks noChangeAspect="1"/>
+            </wp:cNvGraphicFramePr>
+            <a:graphic>
+              <a:graphicData uri="http://schemas.openxmlformats.org/drawingml/2006/picture">
+                <pic:pic>
+                  <pic:nvPicPr>
+                    <pic:cNvPr id="0" name="S01.png"/>
+                    <pic:cNvPicPr/>
+                  </pic:nvPicPr>
+                  <pic:blipFill>
+                    <a:blip r:embed="rId9"/>
+                    <a:stretch>
+                      <a:fillRect/>
+                    </a:stretch>
+                  </pic:blipFill>
+                  <pic:spPr>
+                    <a:xfrm>
+                      <a:off x="0" y="0"/>
+                      <a:ext cx="5486400" cy="4320459"/>
+                    </a:xfrm>
+                    <a:prstGeom prst="rect"/>
+                  </pic:spPr>
+                </pic:pic>
+              </a:graphicData>
+            </a:graphic>
+          </wp:inline>
+        </w:drawing>
       </w:r>
     </w:p>
     <w:p>
@@ -3974,41 +3975,42 @@
     </w:p>
     <w:p>
       <w:pPr>
-        <w:spacing w:before="160" w:after="40"/>
+        <w:spacing w:before="120" w:after="40"/>
         <w:jc w:val="center"/>
-        <w:shd w:val="clear" w:color="auto" w:fill="FAFAFA"/>
-        <w:pBdr>
-          <w:top w:val="single" w:sz="4" w:space="6" w:color="C0C0C0"/>
-          <w:left w:val="single" w:sz="4" w:space="6" w:color="C0C0C0"/>
-          <w:bottom w:val="single" w:sz="4" w:space="6" w:color="C0C0C0"/>
-          <w:right w:val="single" w:sz="4" w:space="6" w:color="C0C0C0"/>
-        </w:pBdr>
       </w:pPr>
       <w:r>
-        <w:rPr>
-          <w:i/>
-          <w:color w:val="888888"/>
-          <w:sz w:val="20"/>
-        </w:rPr>
-        <w:t>[ screenshot S02 ]</w:t>
-        <w:br/>
-      </w:r>
-      <w:r>
-        <w:rPr>
-          <w:i/>
-          <w:color w:val="888888"/>
-          <w:sz w:val="18"/>
-        </w:rPr>
-        <w:t>insertOne() adding the Politics category</w:t>
-        <w:br/>
-      </w:r>
-      <w:r>
-        <w:rPr>
-          <w:i/>
-          <w:color w:val="888888"/>
-          <w:sz w:val="18"/>
-        </w:rPr>
-        <w:t>paste the mongosh output here, or save it as S02.png</w:t>
+        <w:drawing>
+          <wp:inline xmlns:a="http://schemas.openxmlformats.org/drawingml/2006/main" xmlns:pic="http://schemas.openxmlformats.org/drawingml/2006/picture">
+            <wp:extent cx="5486400" cy="3113447"/>
+            <wp:docPr id="2" name="Picture 2"/>
+            <wp:cNvGraphicFramePr>
+              <a:graphicFrameLocks noChangeAspect="1"/>
+            </wp:cNvGraphicFramePr>
+            <a:graphic>
+              <a:graphicData uri="http://schemas.openxmlformats.org/drawingml/2006/picture">
+                <pic:pic>
+                  <pic:nvPicPr>
+                    <pic:cNvPr id="0" name="S02.png"/>
+                    <pic:cNvPicPr/>
+                  </pic:nvPicPr>
+                  <pic:blipFill>
+                    <a:blip r:embed="rId10"/>
+                    <a:stretch>
+                      <a:fillRect/>
+                    </a:stretch>
+                  </pic:blipFill>
+                  <pic:spPr>
+                    <a:xfrm>
+                      <a:off x="0" y="0"/>
+                      <a:ext cx="5486400" cy="3113447"/>
+                    </a:xfrm>
+                    <a:prstGeom prst="rect"/>
+                  </pic:spPr>
+                </pic:pic>
+              </a:graphicData>
+            </a:graphic>
+          </wp:inline>
+        </w:drawing>
       </w:r>
     </w:p>
     <w:p>
@@ -4121,41 +4123,42 @@
     </w:p>
     <w:p>
       <w:pPr>
-        <w:spacing w:before="160" w:after="40"/>
+        <w:spacing w:before="120" w:after="40"/>
         <w:jc w:val="center"/>
-        <w:shd w:val="clear" w:color="auto" w:fill="FAFAFA"/>
-        <w:pBdr>
-          <w:top w:val="single" w:sz="4" w:space="6" w:color="C0C0C0"/>
-          <w:left w:val="single" w:sz="4" w:space="6" w:color="C0C0C0"/>
-          <w:bottom w:val="single" w:sz="4" w:space="6" w:color="C0C0C0"/>
-          <w:right w:val="single" w:sz="4" w:space="6" w:color="C0C0C0"/>
-        </w:pBdr>
       </w:pPr>
       <w:r>
-        <w:rPr>
-          <w:i/>
-          <w:color w:val="888888"/>
-          <w:sz w:val="20"/>
-        </w:rPr>
-        <w:t>[ screenshot S03 ]</w:t>
-        <w:br/>
-      </w:r>
-      <w:r>
-        <w:rPr>
-          <w:i/>
-          <w:color w:val="888888"/>
-          <w:sz w:val="18"/>
-        </w:rPr>
-        <w:t>insertMany() adding the remaining seven categories</w:t>
-        <w:br/>
-      </w:r>
-      <w:r>
-        <w:rPr>
-          <w:i/>
-          <w:color w:val="888888"/>
-          <w:sz w:val="18"/>
-        </w:rPr>
-        <w:t>paste the mongosh output here, or save it as S03.png</w:t>
+        <w:drawing>
+          <wp:inline xmlns:a="http://schemas.openxmlformats.org/drawingml/2006/main" xmlns:pic="http://schemas.openxmlformats.org/drawingml/2006/picture">
+            <wp:extent cx="5486400" cy="2431301"/>
+            <wp:docPr id="3" name="Picture 3"/>
+            <wp:cNvGraphicFramePr>
+              <a:graphicFrameLocks noChangeAspect="1"/>
+            </wp:cNvGraphicFramePr>
+            <a:graphic>
+              <a:graphicData uri="http://schemas.openxmlformats.org/drawingml/2006/picture">
+                <pic:pic>
+                  <pic:nvPicPr>
+                    <pic:cNvPr id="0" name="S03.png"/>
+                    <pic:cNvPicPr/>
+                  </pic:nvPicPr>
+                  <pic:blipFill>
+                    <a:blip r:embed="rId11"/>
+                    <a:stretch>
+                      <a:fillRect/>
+                    </a:stretch>
+                  </pic:blipFill>
+                  <pic:spPr>
+                    <a:xfrm>
+                      <a:off x="0" y="0"/>
+                      <a:ext cx="5486400" cy="2431301"/>
+                    </a:xfrm>
+                    <a:prstGeom prst="rect"/>
+                  </pic:spPr>
+                </pic:pic>
+              </a:graphicData>
+            </a:graphic>
+          </wp:inline>
+        </w:drawing>
       </w:r>
     </w:p>
     <w:p>
@@ -4275,7 +4278,7 @@
         <w:drawing>
           <wp:inline xmlns:a="http://schemas.openxmlformats.org/drawingml/2006/main" xmlns:pic="http://schemas.openxmlformats.org/drawingml/2006/picture">
             <wp:extent cx="5486400" cy="2667000"/>
-            <wp:docPr id="1" name="Picture 1"/>
+            <wp:docPr id="4" name="Picture 4"/>
             <wp:cNvGraphicFramePr>
               <a:graphicFrameLocks noChangeAspect="1"/>
             </wp:cNvGraphicFramePr>
@@ -4287,7 +4290,7 @@
                     <pic:cNvPicPr/>
                   </pic:nvPicPr>
                   <pic:blipFill>
-                    <a:blip r:embed="rId9"/>
+                    <a:blip r:embed="rId12"/>
                     <a:stretch>
                       <a:fillRect/>
                     </a:stretch>
@@ -4450,7 +4453,7 @@
         <w:drawing>
           <wp:inline xmlns:a="http://schemas.openxmlformats.org/drawingml/2006/main" xmlns:pic="http://schemas.openxmlformats.org/drawingml/2006/picture">
             <wp:extent cx="5486400" cy="3118035"/>
-            <wp:docPr id="2" name="Picture 2"/>
+            <wp:docPr id="5" name="Picture 5"/>
             <wp:cNvGraphicFramePr>
               <a:graphicFrameLocks noChangeAspect="1"/>
             </wp:cNvGraphicFramePr>
@@ -4462,7 +4465,7 @@
                     <pic:cNvPicPr/>
                   </pic:nvPicPr>
                   <pic:blipFill>
-                    <a:blip r:embed="rId10"/>
+                    <a:blip r:embed="rId13"/>
                     <a:stretch>
                       <a:fillRect/>
                     </a:stretch>
@@ -4616,7 +4619,7 @@
         <w:drawing>
           <wp:inline xmlns:a="http://schemas.openxmlformats.org/drawingml/2006/main" xmlns:pic="http://schemas.openxmlformats.org/drawingml/2006/picture">
             <wp:extent cx="5486400" cy="2657358"/>
-            <wp:docPr id="3" name="Picture 3"/>
+            <wp:docPr id="6" name="Picture 6"/>
             <wp:cNvGraphicFramePr>
               <a:graphicFrameLocks noChangeAspect="1"/>
             </wp:cNvGraphicFramePr>
@@ -4628,7 +4631,7 @@
                     <pic:cNvPicPr/>
                   </pic:nvPicPr>
                   <pic:blipFill>
-                    <a:blip r:embed="rId11"/>
+                    <a:blip r:embed="rId14"/>
                     <a:stretch>
                       <a:fillRect/>
                     </a:stretch>
@@ -4782,7 +4785,7 @@
         <w:drawing>
           <wp:inline xmlns:a="http://schemas.openxmlformats.org/drawingml/2006/main" xmlns:pic="http://schemas.openxmlformats.org/drawingml/2006/picture">
             <wp:extent cx="5486400" cy="3108452"/>
-            <wp:docPr id="4" name="Picture 4"/>
+            <wp:docPr id="7" name="Picture 7"/>
             <wp:cNvGraphicFramePr>
               <a:graphicFrameLocks noChangeAspect="1"/>
             </wp:cNvGraphicFramePr>
@@ -4794,7 +4797,7 @@
                     <pic:cNvPicPr/>
                   </pic:nvPicPr>
                   <pic:blipFill>
-                    <a:blip r:embed="rId12"/>
+                    <a:blip r:embed="rId15"/>
                     <a:stretch>
                       <a:fillRect/>
                     </a:stretch>
@@ -4921,7 +4924,7 @@
         <w:drawing>
           <wp:inline xmlns:a="http://schemas.openxmlformats.org/drawingml/2006/main" xmlns:pic="http://schemas.openxmlformats.org/drawingml/2006/picture">
             <wp:extent cx="5486400" cy="4624661"/>
-            <wp:docPr id="5" name="Picture 5"/>
+            <wp:docPr id="8" name="Picture 8"/>
             <wp:cNvGraphicFramePr>
               <a:graphicFrameLocks noChangeAspect="1"/>
             </wp:cNvGraphicFramePr>
@@ -4933,7 +4936,7 @@
                     <pic:cNvPicPr/>
                   </pic:nvPicPr>
                   <pic:blipFill>
-                    <a:blip r:embed="rId13"/>
+                    <a:blip r:embed="rId16"/>
                     <a:stretch>
                       <a:fillRect/>
                     </a:stretch>
@@ -5095,7 +5098,7 @@
         <w:drawing>
           <wp:inline xmlns:a="http://schemas.openxmlformats.org/drawingml/2006/main" xmlns:pic="http://schemas.openxmlformats.org/drawingml/2006/picture">
             <wp:extent cx="5486400" cy="3306008"/>
-            <wp:docPr id="6" name="Picture 6"/>
+            <wp:docPr id="9" name="Picture 9"/>
             <wp:cNvGraphicFramePr>
               <a:graphicFrameLocks noChangeAspect="1"/>
             </wp:cNvGraphicFramePr>
@@ -5107,7 +5110,7 @@
                     <pic:cNvPicPr/>
                   </pic:nvPicPr>
                   <pic:blipFill>
-                    <a:blip r:embed="rId14"/>
+                    <a:blip r:embed="rId17"/>
                     <a:stretch>
                       <a:fillRect/>
                     </a:stretch>
@@ -5225,7 +5228,7 @@
         <w:drawing>
           <wp:inline xmlns:a="http://schemas.openxmlformats.org/drawingml/2006/main" xmlns:pic="http://schemas.openxmlformats.org/drawingml/2006/picture">
             <wp:extent cx="5486400" cy="4974336"/>
-            <wp:docPr id="7" name="Picture 7"/>
+            <wp:docPr id="10" name="Picture 10"/>
             <wp:cNvGraphicFramePr>
               <a:graphicFrameLocks noChangeAspect="1"/>
             </wp:cNvGraphicFramePr>
@@ -5237,7 +5240,7 @@
                     <pic:cNvPicPr/>
                   </pic:nvPicPr>
                   <pic:blipFill>
-                    <a:blip r:embed="rId15"/>
+                    <a:blip r:embed="rId18"/>
                     <a:stretch>
                       <a:fillRect/>
                     </a:stretch>
@@ -5355,7 +5358,7 @@
         <w:drawing>
           <wp:inline xmlns:a="http://schemas.openxmlformats.org/drawingml/2006/main" xmlns:pic="http://schemas.openxmlformats.org/drawingml/2006/picture">
             <wp:extent cx="5486400" cy="5965079"/>
-            <wp:docPr id="8" name="Picture 8"/>
+            <wp:docPr id="11" name="Picture 11"/>
             <wp:cNvGraphicFramePr>
               <a:graphicFrameLocks noChangeAspect="1"/>
             </wp:cNvGraphicFramePr>
@@ -5367,7 +5370,7 @@
                     <pic:cNvPicPr/>
                   </pic:nvPicPr>
                   <pic:blipFill>
-                    <a:blip r:embed="rId16"/>
+                    <a:blip r:embed="rId19"/>
                     <a:stretch>
                       <a:fillRect/>
                     </a:stretch>
@@ -5476,7 +5479,7 @@
         <w:drawing>
           <wp:inline xmlns:a="http://schemas.openxmlformats.org/drawingml/2006/main" xmlns:pic="http://schemas.openxmlformats.org/drawingml/2006/picture">
             <wp:extent cx="5486400" cy="3493510"/>
-            <wp:docPr id="9" name="Picture 9"/>
+            <wp:docPr id="12" name="Picture 12"/>
             <wp:cNvGraphicFramePr>
               <a:graphicFrameLocks noChangeAspect="1"/>
             </wp:cNvGraphicFramePr>
@@ -5488,7 +5491,7 @@
                     <pic:cNvPicPr/>
                   </pic:nvPicPr>
                   <pic:blipFill>
-                    <a:blip r:embed="rId17"/>
+                    <a:blip r:embed="rId20"/>
                     <a:stretch>
                       <a:fillRect/>
                     </a:stretch>
@@ -5606,7 +5609,7 @@
         <w:drawing>
           <wp:inline xmlns:a="http://schemas.openxmlformats.org/drawingml/2006/main" xmlns:pic="http://schemas.openxmlformats.org/drawingml/2006/picture">
             <wp:extent cx="5486400" cy="4844872"/>
-            <wp:docPr id="10" name="Picture 10"/>
+            <wp:docPr id="13" name="Picture 13"/>
             <wp:cNvGraphicFramePr>
               <a:graphicFrameLocks noChangeAspect="1"/>
             </wp:cNvGraphicFramePr>
@@ -5618,7 +5621,7 @@
                     <pic:cNvPicPr/>
                   </pic:nvPicPr>
                   <pic:blipFill>
-                    <a:blip r:embed="rId18"/>
+                    <a:blip r:embed="rId21"/>
                     <a:stretch>
                       <a:fillRect/>
                     </a:stretch>
@@ -5865,7 +5868,7 @@
         <w:drawing>
           <wp:inline xmlns:a="http://schemas.openxmlformats.org/drawingml/2006/main" xmlns:pic="http://schemas.openxmlformats.org/drawingml/2006/picture">
             <wp:extent cx="5486400" cy="4869488"/>
-            <wp:docPr id="11" name="Picture 11"/>
+            <wp:docPr id="14" name="Picture 14"/>
             <wp:cNvGraphicFramePr>
               <a:graphicFrameLocks noChangeAspect="1"/>
             </wp:cNvGraphicFramePr>
@@ -5877,7 +5880,7 @@
                     <pic:cNvPicPr/>
                   </pic:nvPicPr>
                   <pic:blipFill>
-                    <a:blip r:embed="rId19"/>
+                    <a:blip r:embed="rId22"/>
                     <a:stretch>
                       <a:fillRect/>
                     </a:stretch>
@@ -5995,7 +5998,7 @@
         <w:drawing>
           <wp:inline xmlns:a="http://schemas.openxmlformats.org/drawingml/2006/main" xmlns:pic="http://schemas.openxmlformats.org/drawingml/2006/picture">
             <wp:extent cx="5486400" cy="3207306"/>
-            <wp:docPr id="12" name="Picture 12"/>
+            <wp:docPr id="15" name="Picture 15"/>
             <wp:cNvGraphicFramePr>
               <a:graphicFrameLocks noChangeAspect="1"/>
             </wp:cNvGraphicFramePr>
@@ -6007,7 +6010,7 @@
                     <pic:cNvPicPr/>
                   </pic:nvPicPr>
                   <pic:blipFill>
-                    <a:blip r:embed="rId20"/>
+                    <a:blip r:embed="rId23"/>
                     <a:stretch>
                       <a:fillRect/>
                     </a:stretch>
@@ -6125,7 +6128,7 @@
         <w:drawing>
           <wp:inline xmlns:a="http://schemas.openxmlformats.org/drawingml/2006/main" xmlns:pic="http://schemas.openxmlformats.org/drawingml/2006/picture">
             <wp:extent cx="5182184" cy="6035040"/>
-            <wp:docPr id="13" name="Picture 13"/>
+            <wp:docPr id="16" name="Picture 16"/>
             <wp:cNvGraphicFramePr>
               <a:graphicFrameLocks noChangeAspect="1"/>
             </wp:cNvGraphicFramePr>
@@ -6137,7 +6140,7 @@
                     <pic:cNvPicPr/>
                   </pic:nvPicPr>
                   <pic:blipFill>
-                    <a:blip r:embed="rId21"/>
+                    <a:blip r:embed="rId24"/>
                     <a:stretch>
                       <a:fillRect/>
                     </a:stretch>
@@ -6228,7 +6231,7 @@
         <w:drawing>
           <wp:inline xmlns:a="http://schemas.openxmlformats.org/drawingml/2006/main" xmlns:pic="http://schemas.openxmlformats.org/drawingml/2006/picture">
             <wp:extent cx="5486400" cy="574029"/>
-            <wp:docPr id="14" name="Picture 14"/>
+            <wp:docPr id="17" name="Picture 17"/>
             <wp:cNvGraphicFramePr>
               <a:graphicFrameLocks noChangeAspect="1"/>
             </wp:cNvGraphicFramePr>
@@ -6240,7 +6243,7 @@
                     <pic:cNvPicPr/>
                   </pic:nvPicPr>
                   <pic:blipFill>
-                    <a:blip r:embed="rId22"/>
+                    <a:blip r:embed="rId25"/>
                     <a:stretch>
                       <a:fillRect/>
                     </a:stretch>
@@ -6412,7 +6415,7 @@
         <w:drawing>
           <wp:inline xmlns:a="http://schemas.openxmlformats.org/drawingml/2006/main" xmlns:pic="http://schemas.openxmlformats.org/drawingml/2006/picture">
             <wp:extent cx="5486400" cy="3950814"/>
-            <wp:docPr id="15" name="Picture 15"/>
+            <wp:docPr id="18" name="Picture 18"/>
             <wp:cNvGraphicFramePr>
               <a:graphicFrameLocks noChangeAspect="1"/>
             </wp:cNvGraphicFramePr>
@@ -6424,7 +6427,7 @@
                     <pic:cNvPicPr/>
                   </pic:nvPicPr>
                   <pic:blipFill>
-                    <a:blip r:embed="rId23"/>
+                    <a:blip r:embed="rId26"/>
                     <a:stretch>
                       <a:fillRect/>
                     </a:stretch>
@@ -6560,7 +6563,7 @@
         <w:drawing>
           <wp:inline xmlns:a="http://schemas.openxmlformats.org/drawingml/2006/main" xmlns:pic="http://schemas.openxmlformats.org/drawingml/2006/picture">
             <wp:extent cx="5486400" cy="4662549"/>
-            <wp:docPr id="16" name="Picture 16"/>
+            <wp:docPr id="19" name="Picture 19"/>
             <wp:cNvGraphicFramePr>
               <a:graphicFrameLocks noChangeAspect="1"/>
             </wp:cNvGraphicFramePr>
@@ -6572,7 +6575,7 @@
                     <pic:cNvPicPr/>
                   </pic:nvPicPr>
                   <pic:blipFill>
-                    <a:blip r:embed="rId24"/>
+                    <a:blip r:embed="rId27"/>
                     <a:stretch>
                       <a:fillRect/>
                     </a:stretch>
@@ -6729,7 +6732,7 @@
         <w:drawing>
           <wp:inline xmlns:a="http://schemas.openxmlformats.org/drawingml/2006/main" xmlns:pic="http://schemas.openxmlformats.org/drawingml/2006/picture">
             <wp:extent cx="5486400" cy="2323902"/>
-            <wp:docPr id="17" name="Picture 17"/>
+            <wp:docPr id="20" name="Picture 20"/>
             <wp:cNvGraphicFramePr>
               <a:graphicFrameLocks noChangeAspect="1"/>
             </wp:cNvGraphicFramePr>
@@ -6741,7 +6744,7 @@
                     <pic:cNvPicPr/>
                   </pic:nvPicPr>
                   <pic:blipFill>
-                    <a:blip r:embed="rId25"/>
+                    <a:blip r:embed="rId28"/>
                     <a:stretch>
                       <a:fillRect/>
                     </a:stretch>
@@ -6868,7 +6871,7 @@
         <w:drawing>
           <wp:inline xmlns:a="http://schemas.openxmlformats.org/drawingml/2006/main" xmlns:pic="http://schemas.openxmlformats.org/drawingml/2006/picture">
             <wp:extent cx="5486400" cy="4188177"/>
-            <wp:docPr id="18" name="Picture 18"/>
+            <wp:docPr id="21" name="Picture 21"/>
             <wp:cNvGraphicFramePr>
               <a:graphicFrameLocks noChangeAspect="1"/>
             </wp:cNvGraphicFramePr>
@@ -6880,7 +6883,7 @@
                     <pic:cNvPicPr/>
                   </pic:nvPicPr>
                   <pic:blipFill>
-                    <a:blip r:embed="rId26"/>
+                    <a:blip r:embed="rId29"/>
                     <a:stretch>
                       <a:fillRect/>
                     </a:stretch>
@@ -7016,7 +7019,7 @@
         <w:drawing>
           <wp:inline xmlns:a="http://schemas.openxmlformats.org/drawingml/2006/main" xmlns:pic="http://schemas.openxmlformats.org/drawingml/2006/picture">
             <wp:extent cx="5486400" cy="2032831"/>
-            <wp:docPr id="19" name="Picture 19"/>
+            <wp:docPr id="22" name="Picture 22"/>
             <wp:cNvGraphicFramePr>
               <a:graphicFrameLocks noChangeAspect="1"/>
             </wp:cNvGraphicFramePr>
@@ -7028,7 +7031,7 @@
                     <pic:cNvPicPr/>
                   </pic:nvPicPr>
                   <pic:blipFill>
-                    <a:blip r:embed="rId27"/>
+                    <a:blip r:embed="rId30"/>
                     <a:stretch>
                       <a:fillRect/>
                     </a:stretch>
@@ -7155,7 +7158,7 @@
         <w:drawing>
           <wp:inline xmlns:a="http://schemas.openxmlformats.org/drawingml/2006/main" xmlns:pic="http://schemas.openxmlformats.org/drawingml/2006/picture">
             <wp:extent cx="5486400" cy="3746001"/>
-            <wp:docPr id="20" name="Picture 20"/>
+            <wp:docPr id="23" name="Picture 23"/>
             <wp:cNvGraphicFramePr>
               <a:graphicFrameLocks noChangeAspect="1"/>
             </wp:cNvGraphicFramePr>
@@ -7167,7 +7170,7 @@
                     <pic:cNvPicPr/>
                   </pic:nvPicPr>
                   <pic:blipFill>
-                    <a:blip r:embed="rId28"/>
+                    <a:blip r:embed="rId31"/>
                     <a:stretch>
                       <a:fillRect/>
                     </a:stretch>
@@ -7312,7 +7315,7 @@
         <w:drawing>
           <wp:inline xmlns:a="http://schemas.openxmlformats.org/drawingml/2006/main" xmlns:pic="http://schemas.openxmlformats.org/drawingml/2006/picture">
             <wp:extent cx="5486400" cy="2725947"/>
-            <wp:docPr id="21" name="Picture 21"/>
+            <wp:docPr id="24" name="Picture 24"/>
             <wp:cNvGraphicFramePr>
               <a:graphicFrameLocks noChangeAspect="1"/>
             </wp:cNvGraphicFramePr>
@@ -7324,7 +7327,7 @@
                     <pic:cNvPicPr/>
                   </pic:nvPicPr>
                   <pic:blipFill>
-                    <a:blip r:embed="rId29"/>
+                    <a:blip r:embed="rId32"/>
                     <a:stretch>
                       <a:fillRect/>
                     </a:stretch>
@@ -7451,7 +7454,7 @@
         <w:drawing>
           <wp:inline xmlns:a="http://schemas.openxmlformats.org/drawingml/2006/main" xmlns:pic="http://schemas.openxmlformats.org/drawingml/2006/picture">
             <wp:extent cx="5486400" cy="5571066"/>
-            <wp:docPr id="22" name="Picture 22"/>
+            <wp:docPr id="25" name="Picture 25"/>
             <wp:cNvGraphicFramePr>
               <a:graphicFrameLocks noChangeAspect="1"/>
             </wp:cNvGraphicFramePr>
@@ -7463,7 +7466,7 @@
                     <pic:cNvPicPr/>
                   </pic:nvPicPr>
                   <pic:blipFill>
-                    <a:blip r:embed="rId30"/>
+                    <a:blip r:embed="rId33"/>
                     <a:stretch>
                       <a:fillRect/>
                     </a:stretch>
@@ -7593,7 +7596,7 @@
         <w:drawing>
           <wp:inline xmlns:a="http://schemas.openxmlformats.org/drawingml/2006/main" xmlns:pic="http://schemas.openxmlformats.org/drawingml/2006/picture">
             <wp:extent cx="5486400" cy="896184"/>
-            <wp:docPr id="23" name="Picture 23"/>
+            <wp:docPr id="26" name="Picture 26"/>
             <wp:cNvGraphicFramePr>
               <a:graphicFrameLocks noChangeAspect="1"/>
             </wp:cNvGraphicFramePr>
@@ -7605,7 +7608,7 @@
                     <pic:cNvPicPr/>
                   </pic:nvPicPr>
                   <pic:blipFill>
-                    <a:blip r:embed="rId31"/>
+                    <a:blip r:embed="rId34"/>
                     <a:stretch>
                       <a:fillRect/>
                     </a:stretch>
@@ -7705,7 +7708,7 @@
         <w:drawing>
           <wp:inline xmlns:a="http://schemas.openxmlformats.org/drawingml/2006/main" xmlns:pic="http://schemas.openxmlformats.org/drawingml/2006/picture">
             <wp:extent cx="4478725" cy="6035040"/>
-            <wp:docPr id="24" name="Picture 24"/>
+            <wp:docPr id="27" name="Picture 27"/>
             <wp:cNvGraphicFramePr>
               <a:graphicFrameLocks noChangeAspect="1"/>
             </wp:cNvGraphicFramePr>
@@ -7717,7 +7720,7 @@
                     <pic:cNvPicPr/>
                   </pic:nvPicPr>
                   <pic:blipFill>
-                    <a:blip r:embed="rId32"/>
+                    <a:blip r:embed="rId35"/>
                     <a:stretch>
                       <a:fillRect/>
                     </a:stretch>
@@ -7817,7 +7820,7 @@
         <w:drawing>
           <wp:inline xmlns:a="http://schemas.openxmlformats.org/drawingml/2006/main" xmlns:pic="http://schemas.openxmlformats.org/drawingml/2006/picture">
             <wp:extent cx="5283528" cy="6035040"/>
-            <wp:docPr id="25" name="Picture 25"/>
+            <wp:docPr id="28" name="Picture 28"/>
             <wp:cNvGraphicFramePr>
               <a:graphicFrameLocks noChangeAspect="1"/>
             </wp:cNvGraphicFramePr>
@@ -7829,7 +7832,7 @@
                     <pic:cNvPicPr/>
                   </pic:nvPicPr>
                   <pic:blipFill>
-                    <a:blip r:embed="rId33"/>
+                    <a:blip r:embed="rId36"/>
                     <a:stretch>
                       <a:fillRect/>
                     </a:stretch>

</xml_diff>

<commit_message>
Embed the R6 screenshot, completing all 29 figures
Notes that R6 was captured after U6 ran, which is why two readers
come back from the premium filter instead of three.

Co-Authored-By: Claude Opus 5 <noreply@anthropic.com>
Claude-Session: https://claude.ai/code/session_01WKECxGAA4Qrww3QEZbaem4
</commit_message>
<xml_diff>
--- a/dbms_casestudy/News_Portal_MongoDB_CaseStudy_24BCE2743.docx
+++ b/dbms_casestudy/News_Portal_MongoDB_CaseStudy_24BCE2743.docx
@@ -5727,46 +5727,47 @@
           <w:i w:val="0"/>
           <w:sz w:val="22"/>
         </w:rPr>
-        <w:t>The renewal reminder list. subscription is an embedded document, and dot notation reaches into it without the whole sub-document having to be matched. The quotes around the key are required because of the dot. The projection uses dot notation as well, returning only the end date out of the subscription block.</w:t>
+        <w:t>The renewal reminder list. subscription is an embedded document, and dot notation reaches into it without the whole sub-document having to be matched. The quotes around the key are required because of the dot. The projection uses dot notation as well, returning only the end date out of the subscription block. Two readers come back rather than three because this was captured after the Task 7 subscription job had run: RDR07's plan was moved to free by U6 and no longer satisfies the premium condition.</w:t>
       </w:r>
     </w:p>
     <w:p>
       <w:pPr>
-        <w:spacing w:before="160" w:after="40"/>
+        <w:spacing w:before="120" w:after="40"/>
         <w:jc w:val="center"/>
-        <w:shd w:val="clear" w:color="auto" w:fill="FAFAFA"/>
-        <w:pBdr>
-          <w:top w:val="single" w:sz="4" w:space="6" w:color="C0C0C0"/>
-          <w:left w:val="single" w:sz="4" w:space="6" w:color="C0C0C0"/>
-          <w:bottom w:val="single" w:sz="4" w:space="6" w:color="C0C0C0"/>
-          <w:right w:val="single" w:sz="4" w:space="6" w:color="C0C0C0"/>
-        </w:pBdr>
       </w:pPr>
       <w:r>
-        <w:rPr>
-          <w:i/>
-          <w:color w:val="888888"/>
-          <w:sz w:val="20"/>
-        </w:rPr>
-        <w:t>[ screenshot S14 ]</w:t>
-        <w:br/>
-      </w:r>
-      <w:r>
-        <w:rPr>
-          <w:i/>
-          <w:color w:val="888888"/>
-          <w:sz w:val="18"/>
-        </w:rPr>
-        <w:t>R6: premium readers whose subscription expires before 2027</w:t>
-        <w:br/>
-      </w:r>
-      <w:r>
-        <w:rPr>
-          <w:i/>
-          <w:color w:val="888888"/>
-          <w:sz w:val="18"/>
-        </w:rPr>
-        <w:t>paste the mongosh output here, or save it as S14.png</w:t>
+        <w:drawing>
+          <wp:inline xmlns:a="http://schemas.openxmlformats.org/drawingml/2006/main" xmlns:pic="http://schemas.openxmlformats.org/drawingml/2006/picture">
+            <wp:extent cx="5486400" cy="2577503"/>
+            <wp:docPr id="14" name="Picture 14"/>
+            <wp:cNvGraphicFramePr>
+              <a:graphicFrameLocks noChangeAspect="1"/>
+            </wp:cNvGraphicFramePr>
+            <a:graphic>
+              <a:graphicData uri="http://schemas.openxmlformats.org/drawingml/2006/picture">
+                <pic:pic>
+                  <pic:nvPicPr>
+                    <pic:cNvPr id="0" name="S14.png"/>
+                    <pic:cNvPicPr/>
+                  </pic:nvPicPr>
+                  <pic:blipFill>
+                    <a:blip r:embed="rId22"/>
+                    <a:stretch>
+                      <a:fillRect/>
+                    </a:stretch>
+                  </pic:blipFill>
+                  <pic:spPr>
+                    <a:xfrm>
+                      <a:off x="0" y="0"/>
+                      <a:ext cx="5486400" cy="2577503"/>
+                    </a:xfrm>
+                    <a:prstGeom prst="rect"/>
+                  </pic:spPr>
+                </pic:pic>
+              </a:graphicData>
+            </a:graphic>
+          </wp:inline>
+        </w:drawing>
       </w:r>
     </w:p>
     <w:p>
@@ -5868,7 +5869,7 @@
         <w:drawing>
           <wp:inline xmlns:a="http://schemas.openxmlformats.org/drawingml/2006/main" xmlns:pic="http://schemas.openxmlformats.org/drawingml/2006/picture">
             <wp:extent cx="5486400" cy="4869488"/>
-            <wp:docPr id="14" name="Picture 14"/>
+            <wp:docPr id="15" name="Picture 15"/>
             <wp:cNvGraphicFramePr>
               <a:graphicFrameLocks noChangeAspect="1"/>
             </wp:cNvGraphicFramePr>
@@ -5880,7 +5881,7 @@
                     <pic:cNvPicPr/>
                   </pic:nvPicPr>
                   <pic:blipFill>
-                    <a:blip r:embed="rId22"/>
+                    <a:blip r:embed="rId23"/>
                     <a:stretch>
                       <a:fillRect/>
                     </a:stretch>
@@ -5998,7 +5999,7 @@
         <w:drawing>
           <wp:inline xmlns:a="http://schemas.openxmlformats.org/drawingml/2006/main" xmlns:pic="http://schemas.openxmlformats.org/drawingml/2006/picture">
             <wp:extent cx="5486400" cy="3207306"/>
-            <wp:docPr id="15" name="Picture 15"/>
+            <wp:docPr id="16" name="Picture 16"/>
             <wp:cNvGraphicFramePr>
               <a:graphicFrameLocks noChangeAspect="1"/>
             </wp:cNvGraphicFramePr>
@@ -6010,7 +6011,7 @@
                     <pic:cNvPicPr/>
                   </pic:nvPicPr>
                   <pic:blipFill>
-                    <a:blip r:embed="rId23"/>
+                    <a:blip r:embed="rId24"/>
                     <a:stretch>
                       <a:fillRect/>
                     </a:stretch>
@@ -6128,7 +6129,7 @@
         <w:drawing>
           <wp:inline xmlns:a="http://schemas.openxmlformats.org/drawingml/2006/main" xmlns:pic="http://schemas.openxmlformats.org/drawingml/2006/picture">
             <wp:extent cx="5182184" cy="6035040"/>
-            <wp:docPr id="16" name="Picture 16"/>
+            <wp:docPr id="17" name="Picture 17"/>
             <wp:cNvGraphicFramePr>
               <a:graphicFrameLocks noChangeAspect="1"/>
             </wp:cNvGraphicFramePr>
@@ -6140,7 +6141,7 @@
                     <pic:cNvPicPr/>
                   </pic:nvPicPr>
                   <pic:blipFill>
-                    <a:blip r:embed="rId24"/>
+                    <a:blip r:embed="rId25"/>
                     <a:stretch>
                       <a:fillRect/>
                     </a:stretch>
@@ -6231,7 +6232,7 @@
         <w:drawing>
           <wp:inline xmlns:a="http://schemas.openxmlformats.org/drawingml/2006/main" xmlns:pic="http://schemas.openxmlformats.org/drawingml/2006/picture">
             <wp:extent cx="5486400" cy="574029"/>
-            <wp:docPr id="17" name="Picture 17"/>
+            <wp:docPr id="18" name="Picture 18"/>
             <wp:cNvGraphicFramePr>
               <a:graphicFrameLocks noChangeAspect="1"/>
             </wp:cNvGraphicFramePr>
@@ -6243,7 +6244,7 @@
                     <pic:cNvPicPr/>
                   </pic:nvPicPr>
                   <pic:blipFill>
-                    <a:blip r:embed="rId25"/>
+                    <a:blip r:embed="rId26"/>
                     <a:stretch>
                       <a:fillRect/>
                     </a:stretch>
@@ -6415,7 +6416,7 @@
         <w:drawing>
           <wp:inline xmlns:a="http://schemas.openxmlformats.org/drawingml/2006/main" xmlns:pic="http://schemas.openxmlformats.org/drawingml/2006/picture">
             <wp:extent cx="5486400" cy="3950814"/>
-            <wp:docPr id="18" name="Picture 18"/>
+            <wp:docPr id="19" name="Picture 19"/>
             <wp:cNvGraphicFramePr>
               <a:graphicFrameLocks noChangeAspect="1"/>
             </wp:cNvGraphicFramePr>
@@ -6427,7 +6428,7 @@
                     <pic:cNvPicPr/>
                   </pic:nvPicPr>
                   <pic:blipFill>
-                    <a:blip r:embed="rId26"/>
+                    <a:blip r:embed="rId27"/>
                     <a:stretch>
                       <a:fillRect/>
                     </a:stretch>
@@ -6563,7 +6564,7 @@
         <w:drawing>
           <wp:inline xmlns:a="http://schemas.openxmlformats.org/drawingml/2006/main" xmlns:pic="http://schemas.openxmlformats.org/drawingml/2006/picture">
             <wp:extent cx="5486400" cy="4662549"/>
-            <wp:docPr id="19" name="Picture 19"/>
+            <wp:docPr id="20" name="Picture 20"/>
             <wp:cNvGraphicFramePr>
               <a:graphicFrameLocks noChangeAspect="1"/>
             </wp:cNvGraphicFramePr>
@@ -6575,7 +6576,7 @@
                     <pic:cNvPicPr/>
                   </pic:nvPicPr>
                   <pic:blipFill>
-                    <a:blip r:embed="rId27"/>
+                    <a:blip r:embed="rId28"/>
                     <a:stretch>
                       <a:fillRect/>
                     </a:stretch>
@@ -6732,7 +6733,7 @@
         <w:drawing>
           <wp:inline xmlns:a="http://schemas.openxmlformats.org/drawingml/2006/main" xmlns:pic="http://schemas.openxmlformats.org/drawingml/2006/picture">
             <wp:extent cx="5486400" cy="2323902"/>
-            <wp:docPr id="20" name="Picture 20"/>
+            <wp:docPr id="21" name="Picture 21"/>
             <wp:cNvGraphicFramePr>
               <a:graphicFrameLocks noChangeAspect="1"/>
             </wp:cNvGraphicFramePr>
@@ -6744,7 +6745,7 @@
                     <pic:cNvPicPr/>
                   </pic:nvPicPr>
                   <pic:blipFill>
-                    <a:blip r:embed="rId28"/>
+                    <a:blip r:embed="rId29"/>
                     <a:stretch>
                       <a:fillRect/>
                     </a:stretch>
@@ -6871,7 +6872,7 @@
         <w:drawing>
           <wp:inline xmlns:a="http://schemas.openxmlformats.org/drawingml/2006/main" xmlns:pic="http://schemas.openxmlformats.org/drawingml/2006/picture">
             <wp:extent cx="5486400" cy="4188177"/>
-            <wp:docPr id="21" name="Picture 21"/>
+            <wp:docPr id="22" name="Picture 22"/>
             <wp:cNvGraphicFramePr>
               <a:graphicFrameLocks noChangeAspect="1"/>
             </wp:cNvGraphicFramePr>
@@ -6883,7 +6884,7 @@
                     <pic:cNvPicPr/>
                   </pic:nvPicPr>
                   <pic:blipFill>
-                    <a:blip r:embed="rId29"/>
+                    <a:blip r:embed="rId30"/>
                     <a:stretch>
                       <a:fillRect/>
                     </a:stretch>
@@ -7019,7 +7020,7 @@
         <w:drawing>
           <wp:inline xmlns:a="http://schemas.openxmlformats.org/drawingml/2006/main" xmlns:pic="http://schemas.openxmlformats.org/drawingml/2006/picture">
             <wp:extent cx="5486400" cy="2032831"/>
-            <wp:docPr id="22" name="Picture 22"/>
+            <wp:docPr id="23" name="Picture 23"/>
             <wp:cNvGraphicFramePr>
               <a:graphicFrameLocks noChangeAspect="1"/>
             </wp:cNvGraphicFramePr>
@@ -7031,7 +7032,7 @@
                     <pic:cNvPicPr/>
                   </pic:nvPicPr>
                   <pic:blipFill>
-                    <a:blip r:embed="rId30"/>
+                    <a:blip r:embed="rId31"/>
                     <a:stretch>
                       <a:fillRect/>
                     </a:stretch>
@@ -7158,7 +7159,7 @@
         <w:drawing>
           <wp:inline xmlns:a="http://schemas.openxmlformats.org/drawingml/2006/main" xmlns:pic="http://schemas.openxmlformats.org/drawingml/2006/picture">
             <wp:extent cx="5486400" cy="3746001"/>
-            <wp:docPr id="23" name="Picture 23"/>
+            <wp:docPr id="24" name="Picture 24"/>
             <wp:cNvGraphicFramePr>
               <a:graphicFrameLocks noChangeAspect="1"/>
             </wp:cNvGraphicFramePr>
@@ -7170,7 +7171,7 @@
                     <pic:cNvPicPr/>
                   </pic:nvPicPr>
                   <pic:blipFill>
-                    <a:blip r:embed="rId31"/>
+                    <a:blip r:embed="rId32"/>
                     <a:stretch>
                       <a:fillRect/>
                     </a:stretch>
@@ -7315,7 +7316,7 @@
         <w:drawing>
           <wp:inline xmlns:a="http://schemas.openxmlformats.org/drawingml/2006/main" xmlns:pic="http://schemas.openxmlformats.org/drawingml/2006/picture">
             <wp:extent cx="5486400" cy="2725947"/>
-            <wp:docPr id="24" name="Picture 24"/>
+            <wp:docPr id="25" name="Picture 25"/>
             <wp:cNvGraphicFramePr>
               <a:graphicFrameLocks noChangeAspect="1"/>
             </wp:cNvGraphicFramePr>
@@ -7327,7 +7328,7 @@
                     <pic:cNvPicPr/>
                   </pic:nvPicPr>
                   <pic:blipFill>
-                    <a:blip r:embed="rId32"/>
+                    <a:blip r:embed="rId33"/>
                     <a:stretch>
                       <a:fillRect/>
                     </a:stretch>
@@ -7454,7 +7455,7 @@
         <w:drawing>
           <wp:inline xmlns:a="http://schemas.openxmlformats.org/drawingml/2006/main" xmlns:pic="http://schemas.openxmlformats.org/drawingml/2006/picture">
             <wp:extent cx="5486400" cy="5571066"/>
-            <wp:docPr id="25" name="Picture 25"/>
+            <wp:docPr id="26" name="Picture 26"/>
             <wp:cNvGraphicFramePr>
               <a:graphicFrameLocks noChangeAspect="1"/>
             </wp:cNvGraphicFramePr>
@@ -7466,7 +7467,7 @@
                     <pic:cNvPicPr/>
                   </pic:nvPicPr>
                   <pic:blipFill>
-                    <a:blip r:embed="rId33"/>
+                    <a:blip r:embed="rId34"/>
                     <a:stretch>
                       <a:fillRect/>
                     </a:stretch>
@@ -7596,7 +7597,7 @@
         <w:drawing>
           <wp:inline xmlns:a="http://schemas.openxmlformats.org/drawingml/2006/main" xmlns:pic="http://schemas.openxmlformats.org/drawingml/2006/picture">
             <wp:extent cx="5486400" cy="896184"/>
-            <wp:docPr id="26" name="Picture 26"/>
+            <wp:docPr id="27" name="Picture 27"/>
             <wp:cNvGraphicFramePr>
               <a:graphicFrameLocks noChangeAspect="1"/>
             </wp:cNvGraphicFramePr>
@@ -7608,7 +7609,7 @@
                     <pic:cNvPicPr/>
                   </pic:nvPicPr>
                   <pic:blipFill>
-                    <a:blip r:embed="rId34"/>
+                    <a:blip r:embed="rId35"/>
                     <a:stretch>
                       <a:fillRect/>
                     </a:stretch>
@@ -7708,7 +7709,7 @@
         <w:drawing>
           <wp:inline xmlns:a="http://schemas.openxmlformats.org/drawingml/2006/main" xmlns:pic="http://schemas.openxmlformats.org/drawingml/2006/picture">
             <wp:extent cx="4478725" cy="6035040"/>
-            <wp:docPr id="27" name="Picture 27"/>
+            <wp:docPr id="28" name="Picture 28"/>
             <wp:cNvGraphicFramePr>
               <a:graphicFrameLocks noChangeAspect="1"/>
             </wp:cNvGraphicFramePr>
@@ -7720,7 +7721,7 @@
                     <pic:cNvPicPr/>
                   </pic:nvPicPr>
                   <pic:blipFill>
-                    <a:blip r:embed="rId35"/>
+                    <a:blip r:embed="rId36"/>
                     <a:stretch>
                       <a:fillRect/>
                     </a:stretch>
@@ -7820,7 +7821,7 @@
         <w:drawing>
           <wp:inline xmlns:a="http://schemas.openxmlformats.org/drawingml/2006/main" xmlns:pic="http://schemas.openxmlformats.org/drawingml/2006/picture">
             <wp:extent cx="5283528" cy="6035040"/>
-            <wp:docPr id="28" name="Picture 28"/>
+            <wp:docPr id="29" name="Picture 29"/>
             <wp:cNvGraphicFramePr>
               <a:graphicFrameLocks noChangeAspect="1"/>
             </wp:cNvGraphicFramePr>
@@ -7832,7 +7833,7 @@
                     <pic:cNvPicPr/>
                   </pic:nvPicPr>
                   <pic:blipFill>
-                    <a:blip r:embed="rId36"/>
+                    <a:blip r:embed="rId37"/>
                     <a:stretch>
                       <a:fillRect/>
                     </a:stretch>

</xml_diff>

<commit_message>
Replace the truncated R9 and R11 figures, add a findOne figure
Both queries now show their full result across two captures placed
under one caption, scaled to a common width. A findOne figure at the
end of Task 5 shows a stored comment with its embedded reply, which
the insertMany captures cut off at the window edge.

Co-Authored-By: Claude Opus 5 <noreply@anthropic.com>
Claude-Session: https://claude.ai/code/session_01WKECxGAA4Qrww3QEZbaem4
</commit_message>
<xml_diff>
--- a/dbms_casestudy/News_Portal_MongoDB_CaseStudy_24BCE2743.docx
+++ b/dbms_casestudy/News_Portal_MongoDB_CaseStudy_24BCE2743.docx
@@ -4971,6 +4971,145 @@
     </w:p>
     <w:p>
       <w:pPr>
+        <w:spacing w:before="280" w:after="120"/>
+      </w:pPr>
+      <w:r>
+        <w:rPr>
+          <w:b/>
+          <w:i w:val="0"/>
+          <w:color w:val="2E5496"/>
+          <w:sz w:val="25"/>
+        </w:rPr>
+        <w:t>Reading a stored document back in full</w:t>
+      </w:r>
+    </w:p>
+    <w:p>
+      <w:pPr>
+        <w:spacing w:before="120" w:after="120" w:line="240" w:lineRule="auto"/>
+        <w:ind w:left="173"/>
+        <w:shd w:val="clear" w:color="auto" w:fill="F2F2F2"/>
+        <w:pBdr>
+          <w:top w:val="single" w:sz="6" w:space="6" w:color="D0D0D0"/>
+          <w:left w:val="single" w:sz="6" w:space="6" w:color="D0D0D0"/>
+          <w:bottom w:val="single" w:sz="6" w:space="6" w:color="D0D0D0"/>
+          <w:right w:val="single" w:sz="6" w:space="6" w:color="D0D0D0"/>
+        </w:pBdr>
+      </w:pPr>
+      <w:r>
+        <w:rPr>
+          <w:rFonts w:ascii="Consolas" w:hAnsi="Consolas" w:eastAsia="Consolas"/>
+          <w:color w:val="1A1A1A"/>
+          <w:sz w:val="18"/>
+        </w:rPr>
+        <w:t>db.categories.findOne({ _id: "CAT02" })</w:t>
+        <w:br/>
+      </w:r>
+      <w:r>
+        <w:rPr>
+          <w:rFonts w:ascii="Consolas" w:hAnsi="Consolas" w:eastAsia="Consolas"/>
+          <w:color w:val="1A1A1A"/>
+          <w:sz w:val="18"/>
+        </w:rPr>
+        <w:t>db.authors.findOne({ _id: "AUT01" })</w:t>
+        <w:br/>
+      </w:r>
+      <w:r>
+        <w:rPr>
+          <w:rFonts w:ascii="Consolas" w:hAnsi="Consolas" w:eastAsia="Consolas"/>
+          <w:color w:val="1A1A1A"/>
+          <w:sz w:val="18"/>
+        </w:rPr>
+        <w:t>db.articles.findOne({ _id: "ART01" })</w:t>
+        <w:br/>
+      </w:r>
+      <w:r>
+        <w:rPr>
+          <w:rFonts w:ascii="Consolas" w:hAnsi="Consolas" w:eastAsia="Consolas"/>
+          <w:color w:val="1A1A1A"/>
+          <w:sz w:val="18"/>
+        </w:rPr>
+        <w:t>db.readers.findOne({ _id: "RDR01" })</w:t>
+        <w:br/>
+      </w:r>
+      <w:r>
+        <w:rPr>
+          <w:rFonts w:ascii="Consolas" w:hAnsi="Consolas" w:eastAsia="Consolas"/>
+          <w:color w:val="1A1A1A"/>
+          <w:sz w:val="18"/>
+        </w:rPr>
+        <w:t>db.comments.findOne({ _id: "CMT01" })</w:t>
+      </w:r>
+    </w:p>
+    <w:p>
+      <w:pPr>
+        <w:spacing w:before="0" w:after="160"/>
+        <w:jc w:val="both"/>
+      </w:pPr>
+      <w:r>
+        <w:rPr>
+          <w:b w:val="0"/>
+          <w:i w:val="0"/>
+          <w:sz w:val="22"/>
+        </w:rPr>
+        <w:t>The insertMany output above confirms what went in but truncates each document at the width of the shell window. findOne prints one document down the page instead, so the structure described in Task 3 can actually be seen. The output shown is the last of the five calls, CMT01. articleId and readerId are plain string references pointing into the articles and readers collections, while replies is an array holding a complete sub-document with its own readerId, text and postedAt. Nothing joins the reply to anything: it exists only inside this comment, which is the embedding decision made visible.</w:t>
+      </w:r>
+    </w:p>
+    <w:p>
+      <w:pPr>
+        <w:spacing w:before="120" w:after="40"/>
+        <w:jc w:val="center"/>
+      </w:pPr>
+      <w:r>
+        <w:drawing>
+          <wp:inline xmlns:a="http://schemas.openxmlformats.org/drawingml/2006/main" xmlns:pic="http://schemas.openxmlformats.org/drawingml/2006/picture">
+            <wp:extent cx="4759412" cy="6035040"/>
+            <wp:docPr id="9" name="Picture 9"/>
+            <wp:cNvGraphicFramePr>
+              <a:graphicFrameLocks noChangeAspect="1"/>
+            </wp:cNvGraphicFramePr>
+            <a:graphic>
+              <a:graphicData uri="http://schemas.openxmlformats.org/drawingml/2006/picture">
+                <pic:pic>
+                  <pic:nvPicPr>
+                    <pic:cNvPr id="0" name="S30.png"/>
+                    <pic:cNvPicPr/>
+                  </pic:nvPicPr>
+                  <pic:blipFill>
+                    <a:blip r:embed="rId17"/>
+                    <a:stretch>
+                      <a:fillRect/>
+                    </a:stretch>
+                  </pic:blipFill>
+                  <pic:spPr>
+                    <a:xfrm>
+                      <a:off x="0" y="0"/>
+                      <a:ext cx="4759412" cy="6035040"/>
+                    </a:xfrm>
+                    <a:prstGeom prst="rect"/>
+                  </pic:spPr>
+                </pic:pic>
+              </a:graphicData>
+            </a:graphic>
+          </wp:inline>
+        </w:drawing>
+      </w:r>
+    </w:p>
+    <w:p>
+      <w:pPr>
+        <w:spacing w:after="280"/>
+        <w:jc w:val="center"/>
+      </w:pPr>
+      <w:r>
+        <w:rPr>
+          <w:i/>
+          <w:color w:val="555555"/>
+          <w:sz w:val="18"/>
+        </w:rPr>
+        <w:t>Fig. 9 — findOne() showing a comment document with its embedded reply</w:t>
+      </w:r>
+    </w:p>
+    <w:p>
+      <w:pPr>
         <w:spacing w:before="440" w:after="200"/>
         <w:pBdr>
           <w:bottom w:val="single" w:sz="8" w:space="4" w:color="1F3864"/>
@@ -5098,7 +5237,7 @@
         <w:drawing>
           <wp:inline xmlns:a="http://schemas.openxmlformats.org/drawingml/2006/main" xmlns:pic="http://schemas.openxmlformats.org/drawingml/2006/picture">
             <wp:extent cx="5486400" cy="3306008"/>
-            <wp:docPr id="9" name="Picture 9"/>
+            <wp:docPr id="10" name="Picture 10"/>
             <wp:cNvGraphicFramePr>
               <a:graphicFrameLocks noChangeAspect="1"/>
             </wp:cNvGraphicFramePr>
@@ -5110,7 +5249,7 @@
                     <pic:cNvPicPr/>
                   </pic:nvPicPr>
                   <pic:blipFill>
-                    <a:blip r:embed="rId17"/>
+                    <a:blip r:embed="rId18"/>
                     <a:stretch>
                       <a:fillRect/>
                     </a:stretch>
@@ -5140,7 +5279,7 @@
           <w:color w:val="555555"/>
           <w:sz w:val="18"/>
         </w:rPr>
-        <w:t>Fig. 9 — R1: published Technology articles sorted by view count</w:t>
+        <w:t>Fig. 10 — R1: published Technology articles sorted by view count</w:t>
       </w:r>
     </w:p>
     <w:p>
@@ -5228,7 +5367,7 @@
         <w:drawing>
           <wp:inline xmlns:a="http://schemas.openxmlformats.org/drawingml/2006/main" xmlns:pic="http://schemas.openxmlformats.org/drawingml/2006/picture">
             <wp:extent cx="5486400" cy="4974336"/>
-            <wp:docPr id="10" name="Picture 10"/>
+            <wp:docPr id="11" name="Picture 11"/>
             <wp:cNvGraphicFramePr>
               <a:graphicFrameLocks noChangeAspect="1"/>
             </wp:cNvGraphicFramePr>
@@ -5240,7 +5379,7 @@
                     <pic:cNvPicPr/>
                   </pic:nvPicPr>
                   <pic:blipFill>
-                    <a:blip r:embed="rId18"/>
+                    <a:blip r:embed="rId19"/>
                     <a:stretch>
                       <a:fillRect/>
                     </a:stretch>
@@ -5270,7 +5409,7 @@
           <w:color w:val="555555"/>
           <w:sz w:val="18"/>
         </w:rPr>
-        <w:t>Fig. 10 — R2: articles above 10,000 views and 1,000 likes</w:t>
+        <w:t>Fig. 11 — R2: articles above 10,000 views and 1,000 likes</w:t>
       </w:r>
     </w:p>
     <w:p>
@@ -5358,7 +5497,7 @@
         <w:drawing>
           <wp:inline xmlns:a="http://schemas.openxmlformats.org/drawingml/2006/main" xmlns:pic="http://schemas.openxmlformats.org/drawingml/2006/picture">
             <wp:extent cx="5486400" cy="5965079"/>
-            <wp:docPr id="11" name="Picture 11"/>
+            <wp:docPr id="12" name="Picture 12"/>
             <wp:cNvGraphicFramePr>
               <a:graphicFrameLocks noChangeAspect="1"/>
             </wp:cNvGraphicFramePr>
@@ -5370,7 +5509,7 @@
                     <pic:cNvPicPr/>
                   </pic:nvPicPr>
                   <pic:blipFill>
-                    <a:blip r:embed="rId19"/>
+                    <a:blip r:embed="rId20"/>
                     <a:stretch>
                       <a:fillRect/>
                     </a:stretch>
@@ -5400,7 +5539,7 @@
           <w:color w:val="555555"/>
           <w:sz w:val="18"/>
         </w:rPr>
-        <w:t>Fig. 11 — R3: articles tagged AI or elections</w:t>
+        <w:t>Fig. 12 — R3: articles tagged AI or elections</w:t>
       </w:r>
     </w:p>
     <w:p>
@@ -5479,7 +5618,7 @@
         <w:drawing>
           <wp:inline xmlns:a="http://schemas.openxmlformats.org/drawingml/2006/main" xmlns:pic="http://schemas.openxmlformats.org/drawingml/2006/picture">
             <wp:extent cx="5486400" cy="3493510"/>
-            <wp:docPr id="12" name="Picture 12"/>
+            <wp:docPr id="13" name="Picture 13"/>
             <wp:cNvGraphicFramePr>
               <a:graphicFrameLocks noChangeAspect="1"/>
             </wp:cNvGraphicFramePr>
@@ -5491,7 +5630,7 @@
                     <pic:cNvPicPr/>
                   </pic:nvPicPr>
                   <pic:blipFill>
-                    <a:blip r:embed="rId20"/>
+                    <a:blip r:embed="rId21"/>
                     <a:stretch>
                       <a:fillRect/>
                     </a:stretch>
@@ -5521,7 +5660,7 @@
           <w:color w:val="555555"/>
           <w:sz w:val="18"/>
         </w:rPr>
-        <w:t>Fig. 12 — R4: top three most-read articles</w:t>
+        <w:t>Fig. 13 — R4: top three most-read articles</w:t>
       </w:r>
     </w:p>
     <w:p>
@@ -5609,7 +5748,7 @@
         <w:drawing>
           <wp:inline xmlns:a="http://schemas.openxmlformats.org/drawingml/2006/main" xmlns:pic="http://schemas.openxmlformats.org/drawingml/2006/picture">
             <wp:extent cx="5486400" cy="4844872"/>
-            <wp:docPr id="13" name="Picture 13"/>
+            <wp:docPr id="14" name="Picture 14"/>
             <wp:cNvGraphicFramePr>
               <a:graphicFrameLocks noChangeAspect="1"/>
             </wp:cNvGraphicFramePr>
@@ -5621,7 +5760,7 @@
                     <pic:cNvPicPr/>
                   </pic:nvPicPr>
                   <pic:blipFill>
-                    <a:blip r:embed="rId21"/>
+                    <a:blip r:embed="rId22"/>
                     <a:stretch>
                       <a:fillRect/>
                     </a:stretch>
@@ -5651,7 +5790,7 @@
           <w:color w:val="555555"/>
           <w:sz w:val="18"/>
         </w:rPr>
-        <w:t>Fig. 13 — R5: articles published between 1 and 15 October 2026</w:t>
+        <w:t>Fig. 14 — R5: articles published between 1 and 15 October 2026</w:t>
       </w:r>
     </w:p>
     <w:p>
@@ -5739,7 +5878,7 @@
         <w:drawing>
           <wp:inline xmlns:a="http://schemas.openxmlformats.org/drawingml/2006/main" xmlns:pic="http://schemas.openxmlformats.org/drawingml/2006/picture">
             <wp:extent cx="5486400" cy="2577503"/>
-            <wp:docPr id="14" name="Picture 14"/>
+            <wp:docPr id="15" name="Picture 15"/>
             <wp:cNvGraphicFramePr>
               <a:graphicFrameLocks noChangeAspect="1"/>
             </wp:cNvGraphicFramePr>
@@ -5751,7 +5890,7 @@
                     <pic:cNvPicPr/>
                   </pic:nvPicPr>
                   <pic:blipFill>
-                    <a:blip r:embed="rId22"/>
+                    <a:blip r:embed="rId23"/>
                     <a:stretch>
                       <a:fillRect/>
                     </a:stretch>
@@ -5781,7 +5920,7 @@
           <w:color w:val="555555"/>
           <w:sz w:val="18"/>
         </w:rPr>
-        <w:t>Fig. 14 — R6: premium readers whose subscription expires before 2027</w:t>
+        <w:t>Fig. 15 — R6: premium readers whose subscription expires before 2027</w:t>
       </w:r>
     </w:p>
     <w:p>
@@ -5869,7 +6008,7 @@
         <w:drawing>
           <wp:inline xmlns:a="http://schemas.openxmlformats.org/drawingml/2006/main" xmlns:pic="http://schemas.openxmlformats.org/drawingml/2006/picture">
             <wp:extent cx="5486400" cy="4869488"/>
-            <wp:docPr id="15" name="Picture 15"/>
+            <wp:docPr id="16" name="Picture 16"/>
             <wp:cNvGraphicFramePr>
               <a:graphicFrameLocks noChangeAspect="1"/>
             </wp:cNvGraphicFramePr>
@@ -5881,7 +6020,7 @@
                     <pic:cNvPicPr/>
                   </pic:nvPicPr>
                   <pic:blipFill>
-                    <a:blip r:embed="rId23"/>
+                    <a:blip r:embed="rId24"/>
                     <a:stretch>
                       <a:fillRect/>
                     </a:stretch>
@@ -5911,7 +6050,7 @@
           <w:color w:val="555555"/>
           <w:sz w:val="18"/>
         </w:rPr>
-        <w:t>Fig. 15 — R7: verified authors who cover Politics</w:t>
+        <w:t>Fig. 16 — R7: verified authors who cover Politics</w:t>
       </w:r>
     </w:p>
     <w:p>
@@ -5999,7 +6138,7 @@
         <w:drawing>
           <wp:inline xmlns:a="http://schemas.openxmlformats.org/drawingml/2006/main" xmlns:pic="http://schemas.openxmlformats.org/drawingml/2006/picture">
             <wp:extent cx="5486400" cy="3207306"/>
-            <wp:docPr id="16" name="Picture 16"/>
+            <wp:docPr id="17" name="Picture 17"/>
             <wp:cNvGraphicFramePr>
               <a:graphicFrameLocks noChangeAspect="1"/>
             </wp:cNvGraphicFramePr>
@@ -6011,7 +6150,7 @@
                     <pic:cNvPicPr/>
                   </pic:nvPicPr>
                   <pic:blipFill>
-                    <a:blip r:embed="rId24"/>
+                    <a:blip r:embed="rId25"/>
                     <a:stretch>
                       <a:fillRect/>
                     </a:stretch>
@@ -6041,7 +6180,7 @@
           <w:color w:val="555555"/>
           <w:sz w:val="18"/>
         </w:rPr>
-        <w:t>Fig. 16 — R8: title search for india, case-insensitive</w:t>
+        <w:t>Fig. 17 — R8: title search for india, case-insensitive</w:t>
       </w:r>
     </w:p>
     <w:p>
@@ -6128,8 +6267,8 @@
       <w:r>
         <w:drawing>
           <wp:inline xmlns:a="http://schemas.openxmlformats.org/drawingml/2006/main" xmlns:pic="http://schemas.openxmlformats.org/drawingml/2006/picture">
-            <wp:extent cx="5182184" cy="6035040"/>
-            <wp:docPr id="17" name="Picture 17"/>
+            <wp:extent cx="3304368" cy="4015534"/>
+            <wp:docPr id="18" name="Picture 18"/>
             <wp:cNvGraphicFramePr>
               <a:graphicFrameLocks noChangeAspect="1"/>
             </wp:cNvGraphicFramePr>
@@ -6137,11 +6276,11 @@
               <a:graphicData uri="http://schemas.openxmlformats.org/drawingml/2006/picture">
                 <pic:pic>
                   <pic:nvPicPr>
-                    <pic:cNvPr id="0" name="S17.png"/>
+                    <pic:cNvPr id="0" name="S17a.png"/>
                     <pic:cNvPicPr/>
                   </pic:nvPicPr>
                   <pic:blipFill>
-                    <a:blip r:embed="rId25"/>
+                    <a:blip r:embed="rId26"/>
                     <a:stretch>
                       <a:fillRect/>
                     </a:stretch>
@@ -6149,7 +6288,7 @@
                   <pic:spPr>
                     <a:xfrm>
                       <a:off x="0" y="0"/>
-                      <a:ext cx="5182184" cy="6035040"/>
+                      <a:ext cx="3304368" cy="4015534"/>
                     </a:xfrm>
                     <a:prstGeom prst="rect"/>
                   </pic:spPr>
@@ -6162,6 +6301,46 @@
     </w:p>
     <w:p>
       <w:pPr>
+        <w:spacing w:before="40" w:after="40"/>
+        <w:jc w:val="center"/>
+      </w:pPr>
+      <w:r>
+        <w:drawing>
+          <wp:inline xmlns:a="http://schemas.openxmlformats.org/drawingml/2006/main" xmlns:pic="http://schemas.openxmlformats.org/drawingml/2006/picture">
+            <wp:extent cx="3304368" cy="3482545"/>
+            <wp:docPr id="19" name="Picture 19"/>
+            <wp:cNvGraphicFramePr>
+              <a:graphicFrameLocks noChangeAspect="1"/>
+            </wp:cNvGraphicFramePr>
+            <a:graphic>
+              <a:graphicData uri="http://schemas.openxmlformats.org/drawingml/2006/picture">
+                <pic:pic>
+                  <pic:nvPicPr>
+                    <pic:cNvPr id="0" name="S17b.png"/>
+                    <pic:cNvPicPr/>
+                  </pic:nvPicPr>
+                  <pic:blipFill>
+                    <a:blip r:embed="rId27"/>
+                    <a:stretch>
+                      <a:fillRect/>
+                    </a:stretch>
+                  </pic:blipFill>
+                  <pic:spPr>
+                    <a:xfrm>
+                      <a:off x="0" y="0"/>
+                      <a:ext cx="3304368" cy="3482545"/>
+                    </a:xfrm>
+                    <a:prstGeom prst="rect"/>
+                  </pic:spPr>
+                </pic:pic>
+              </a:graphicData>
+            </a:graphic>
+          </wp:inline>
+        </w:drawing>
+      </w:r>
+    </w:p>
+    <w:p>
+      <w:pPr>
         <w:spacing w:after="280"/>
         <w:jc w:val="center"/>
       </w:pPr>
@@ -6171,7 +6350,7 @@
           <w:color w:val="555555"/>
           <w:sz w:val="18"/>
         </w:rPr>
-        <w:t>Fig. 17 — R9: flagged comments or comments with at least one reply</w:t>
+        <w:t>Fig. 18 — R9: flagged comments or comments with at least one reply</w:t>
       </w:r>
     </w:p>
     <w:p>
@@ -6232,7 +6411,7 @@
         <w:drawing>
           <wp:inline xmlns:a="http://schemas.openxmlformats.org/drawingml/2006/main" xmlns:pic="http://schemas.openxmlformats.org/drawingml/2006/picture">
             <wp:extent cx="5486400" cy="574029"/>
-            <wp:docPr id="18" name="Picture 18"/>
+            <wp:docPr id="20" name="Picture 20"/>
             <wp:cNvGraphicFramePr>
               <a:graphicFrameLocks noChangeAspect="1"/>
             </wp:cNvGraphicFramePr>
@@ -6244,7 +6423,7 @@
                     <pic:cNvPicPr/>
                   </pic:nvPicPr>
                   <pic:blipFill>
-                    <a:blip r:embed="rId26"/>
+                    <a:blip r:embed="rId28"/>
                     <a:stretch>
                       <a:fillRect/>
                     </a:stretch>
@@ -6274,7 +6453,7 @@
           <w:color w:val="555555"/>
           <w:sz w:val="18"/>
         </w:rPr>
-        <w:t>Fig. 18 — R10: count of draft articles</w:t>
+        <w:t>Fig. 19 — R10: count of draft articles</w:t>
       </w:r>
     </w:p>
     <w:p>
@@ -6415,8 +6594,8 @@
       <w:r>
         <w:drawing>
           <wp:inline xmlns:a="http://schemas.openxmlformats.org/drawingml/2006/main" xmlns:pic="http://schemas.openxmlformats.org/drawingml/2006/picture">
-            <wp:extent cx="5486400" cy="3950814"/>
-            <wp:docPr id="19" name="Picture 19"/>
+            <wp:extent cx="4177876" cy="2980909"/>
+            <wp:docPr id="21" name="Picture 21"/>
             <wp:cNvGraphicFramePr>
               <a:graphicFrameLocks noChangeAspect="1"/>
             </wp:cNvGraphicFramePr>
@@ -6424,11 +6603,11 @@
               <a:graphicData uri="http://schemas.openxmlformats.org/drawingml/2006/picture">
                 <pic:pic>
                   <pic:nvPicPr>
-                    <pic:cNvPr id="0" name="S19.png"/>
+                    <pic:cNvPr id="0" name="S19a.png"/>
                     <pic:cNvPicPr/>
                   </pic:nvPicPr>
                   <pic:blipFill>
-                    <a:blip r:embed="rId27"/>
+                    <a:blip r:embed="rId29"/>
                     <a:stretch>
                       <a:fillRect/>
                     </a:stretch>
@@ -6436,7 +6615,7 @@
                   <pic:spPr>
                     <a:xfrm>
                       <a:off x="0" y="0"/>
-                      <a:ext cx="5486400" cy="3950814"/>
+                      <a:ext cx="4177876" cy="2980909"/>
                     </a:xfrm>
                     <a:prstGeom prst="rect"/>
                   </pic:spPr>
@@ -6449,6 +6628,46 @@
     </w:p>
     <w:p>
       <w:pPr>
+        <w:spacing w:before="40" w:after="40"/>
+        <w:jc w:val="center"/>
+      </w:pPr>
+      <w:r>
+        <w:drawing>
+          <wp:inline xmlns:a="http://schemas.openxmlformats.org/drawingml/2006/main" xmlns:pic="http://schemas.openxmlformats.org/drawingml/2006/picture">
+            <wp:extent cx="4177876" cy="4517170"/>
+            <wp:docPr id="22" name="Picture 22"/>
+            <wp:cNvGraphicFramePr>
+              <a:graphicFrameLocks noChangeAspect="1"/>
+            </wp:cNvGraphicFramePr>
+            <a:graphic>
+              <a:graphicData uri="http://schemas.openxmlformats.org/drawingml/2006/picture">
+                <pic:pic>
+                  <pic:nvPicPr>
+                    <pic:cNvPr id="0" name="S19b.png"/>
+                    <pic:cNvPicPr/>
+                  </pic:nvPicPr>
+                  <pic:blipFill>
+                    <a:blip r:embed="rId30"/>
+                    <a:stretch>
+                      <a:fillRect/>
+                    </a:stretch>
+                  </pic:blipFill>
+                  <pic:spPr>
+                    <a:xfrm>
+                      <a:off x="0" y="0"/>
+                      <a:ext cx="4177876" cy="4517170"/>
+                    </a:xfrm>
+                    <a:prstGeom prst="rect"/>
+                  </pic:spPr>
+                </pic:pic>
+              </a:graphicData>
+            </a:graphic>
+          </wp:inline>
+        </w:drawing>
+      </w:r>
+    </w:p>
+    <w:p>
+      <w:pPr>
         <w:spacing w:after="280"/>
         <w:jc w:val="center"/>
       </w:pPr>
@@ -6458,7 +6677,7 @@
           <w:color w:val="555555"/>
           <w:sz w:val="18"/>
         </w:rPr>
-        <w:t>Fig. 19 — R11: articles joined to their author and category names</w:t>
+        <w:t>Fig. 20 — R11: articles joined to their author and category names</w:t>
       </w:r>
     </w:p>
     <w:p>
@@ -6564,7 +6783,7 @@
         <w:drawing>
           <wp:inline xmlns:a="http://schemas.openxmlformats.org/drawingml/2006/main" xmlns:pic="http://schemas.openxmlformats.org/drawingml/2006/picture">
             <wp:extent cx="5486400" cy="4662549"/>
-            <wp:docPr id="20" name="Picture 20"/>
+            <wp:docPr id="23" name="Picture 23"/>
             <wp:cNvGraphicFramePr>
               <a:graphicFrameLocks noChangeAspect="1"/>
             </wp:cNvGraphicFramePr>
@@ -6576,7 +6795,7 @@
                     <pic:cNvPicPr/>
                   </pic:nvPicPr>
                   <pic:blipFill>
-                    <a:blip r:embed="rId28"/>
+                    <a:blip r:embed="rId31"/>
                     <a:stretch>
                       <a:fillRect/>
                     </a:stretch>
@@ -6606,7 +6825,7 @@
           <w:color w:val="555555"/>
           <w:sz w:val="18"/>
         </w:rPr>
-        <w:t>Fig. 20 — R12: article count and total views per category</w:t>
+        <w:t>Fig. 21 — R12: article count and total views per category</w:t>
       </w:r>
     </w:p>
     <w:p>
@@ -6733,7 +6952,7 @@
         <w:drawing>
           <wp:inline xmlns:a="http://schemas.openxmlformats.org/drawingml/2006/main" xmlns:pic="http://schemas.openxmlformats.org/drawingml/2006/picture">
             <wp:extent cx="5486400" cy="2323902"/>
-            <wp:docPr id="21" name="Picture 21"/>
+            <wp:docPr id="24" name="Picture 24"/>
             <wp:cNvGraphicFramePr>
               <a:graphicFrameLocks noChangeAspect="1"/>
             </wp:cNvGraphicFramePr>
@@ -6745,7 +6964,7 @@
                     <pic:cNvPicPr/>
                   </pic:nvPicPr>
                   <pic:blipFill>
-                    <a:blip r:embed="rId29"/>
+                    <a:blip r:embed="rId32"/>
                     <a:stretch>
                       <a:fillRect/>
                     </a:stretch>
@@ -6775,7 +6994,7 @@
           <w:color w:val="555555"/>
           <w:sz w:val="18"/>
         </w:rPr>
-        <w:t>Fig. 21 — U1: $inc raising views and likes on ART09</w:t>
+        <w:t>Fig. 22 — U1: $inc raising views and likes on ART09</w:t>
       </w:r>
     </w:p>
     <w:p>
@@ -6872,7 +7091,7 @@
         <w:drawing>
           <wp:inline xmlns:a="http://schemas.openxmlformats.org/drawingml/2006/main" xmlns:pic="http://schemas.openxmlformats.org/drawingml/2006/picture">
             <wp:extent cx="5486400" cy="4188177"/>
-            <wp:docPr id="22" name="Picture 22"/>
+            <wp:docPr id="25" name="Picture 25"/>
             <wp:cNvGraphicFramePr>
               <a:graphicFrameLocks noChangeAspect="1"/>
             </wp:cNvGraphicFramePr>
@@ -6884,7 +7103,7 @@
                     <pic:cNvPicPr/>
                   </pic:nvPicPr>
                   <pic:blipFill>
-                    <a:blip r:embed="rId30"/>
+                    <a:blip r:embed="rId33"/>
                     <a:stretch>
                       <a:fillRect/>
                     </a:stretch>
@@ -6914,7 +7133,7 @@
           <w:color w:val="555555"/>
           <w:sz w:val="18"/>
         </w:rPr>
-        <w:t>Fig. 22 — U2: updateMany() featuring every article above 15,000 views</w:t>
+        <w:t>Fig. 23 — U2: updateMany() featuring every article above 15,000 views</w:t>
       </w:r>
     </w:p>
     <w:p>
@@ -7020,7 +7239,7 @@
         <w:drawing>
           <wp:inline xmlns:a="http://schemas.openxmlformats.org/drawingml/2006/main" xmlns:pic="http://schemas.openxmlformats.org/drawingml/2006/picture">
             <wp:extent cx="5486400" cy="2032831"/>
-            <wp:docPr id="23" name="Picture 23"/>
+            <wp:docPr id="26" name="Picture 26"/>
             <wp:cNvGraphicFramePr>
               <a:graphicFrameLocks noChangeAspect="1"/>
             </wp:cNvGraphicFramePr>
@@ -7032,7 +7251,7 @@
                     <pic:cNvPicPr/>
                   </pic:nvPicPr>
                   <pic:blipFill>
-                    <a:blip r:embed="rId31"/>
+                    <a:blip r:embed="rId34"/>
                     <a:stretch>
                       <a:fillRect/>
                     </a:stretch>
@@ -7062,7 +7281,7 @@
           <w:color w:val="555555"/>
           <w:sz w:val="18"/>
         </w:rPr>
-        <w:t>Fig. 23 — U3: publishing the draft article with $set and $currentDate</w:t>
+        <w:t>Fig. 24 — U3: publishing the draft article with $set and $currentDate</w:t>
       </w:r>
     </w:p>
     <w:p>
@@ -7159,7 +7378,7 @@
         <w:drawing>
           <wp:inline xmlns:a="http://schemas.openxmlformats.org/drawingml/2006/main" xmlns:pic="http://schemas.openxmlformats.org/drawingml/2006/picture">
             <wp:extent cx="5486400" cy="3746001"/>
-            <wp:docPr id="24" name="Picture 24"/>
+            <wp:docPr id="27" name="Picture 27"/>
             <wp:cNvGraphicFramePr>
               <a:graphicFrameLocks noChangeAspect="1"/>
             </wp:cNvGraphicFramePr>
@@ -7171,7 +7390,7 @@
                     <pic:cNvPicPr/>
                   </pic:nvPicPr>
                   <pic:blipFill>
-                    <a:blip r:embed="rId32"/>
+                    <a:blip r:embed="rId35"/>
                     <a:stretch>
                       <a:fillRect/>
                     </a:stretch>
@@ -7201,7 +7420,7 @@
           <w:color w:val="555555"/>
           <w:sz w:val="18"/>
         </w:rPr>
-        <w:t>Fig. 24 — U4: $addToSet adding a tag without duplicating it</w:t>
+        <w:t>Fig. 25 — U4: $addToSet adding a tag without duplicating it</w:t>
       </w:r>
     </w:p>
     <w:p>
@@ -7316,7 +7535,7 @@
         <w:drawing>
           <wp:inline xmlns:a="http://schemas.openxmlformats.org/drawingml/2006/main" xmlns:pic="http://schemas.openxmlformats.org/drawingml/2006/picture">
             <wp:extent cx="5486400" cy="2725947"/>
-            <wp:docPr id="25" name="Picture 25"/>
+            <wp:docPr id="28" name="Picture 28"/>
             <wp:cNvGraphicFramePr>
               <a:graphicFrameLocks noChangeAspect="1"/>
             </wp:cNvGraphicFramePr>
@@ -7328,7 +7547,7 @@
                     <pic:cNvPicPr/>
                   </pic:nvPicPr>
                   <pic:blipFill>
-                    <a:blip r:embed="rId33"/>
+                    <a:blip r:embed="rId36"/>
                     <a:stretch>
                       <a:fillRect/>
                     </a:stretch>
@@ -7358,7 +7577,7 @@
           <w:color w:val="555555"/>
           <w:sz w:val="18"/>
         </w:rPr>
-        <w:t>Fig. 25 — U5: $push adding a reply inside a comment document</w:t>
+        <w:t>Fig. 26 — U5: $push adding a reply inside a comment document</w:t>
       </w:r>
     </w:p>
     <w:p>
@@ -7455,7 +7674,7 @@
         <w:drawing>
           <wp:inline xmlns:a="http://schemas.openxmlformats.org/drawingml/2006/main" xmlns:pic="http://schemas.openxmlformats.org/drawingml/2006/picture">
             <wp:extent cx="5486400" cy="5571066"/>
-            <wp:docPr id="26" name="Picture 26"/>
+            <wp:docPr id="29" name="Picture 29"/>
             <wp:cNvGraphicFramePr>
               <a:graphicFrameLocks noChangeAspect="1"/>
             </wp:cNvGraphicFramePr>
@@ -7467,7 +7686,7 @@
                     <pic:cNvPicPr/>
                   </pic:nvPicPr>
                   <pic:blipFill>
-                    <a:blip r:embed="rId34"/>
+                    <a:blip r:embed="rId37"/>
                     <a:stretch>
                       <a:fillRect/>
                     </a:stretch>
@@ -7497,7 +7716,7 @@
           <w:color w:val="555555"/>
           <w:sz w:val="18"/>
         </w:rPr>
-        <w:t>Fig. 26 — U6: expired premium subscriptions downgraded to free</w:t>
+        <w:t>Fig. 27 — U6: expired premium subscriptions downgraded to free</w:t>
       </w:r>
     </w:p>
     <w:p>
@@ -7597,7 +7816,7 @@
         <w:drawing>
           <wp:inline xmlns:a="http://schemas.openxmlformats.org/drawingml/2006/main" xmlns:pic="http://schemas.openxmlformats.org/drawingml/2006/picture">
             <wp:extent cx="5486400" cy="896184"/>
-            <wp:docPr id="27" name="Picture 27"/>
+            <wp:docPr id="30" name="Picture 30"/>
             <wp:cNvGraphicFramePr>
               <a:graphicFrameLocks noChangeAspect="1"/>
             </wp:cNvGraphicFramePr>
@@ -7609,7 +7828,7 @@
                     <pic:cNvPicPr/>
                   </pic:nvPicPr>
                   <pic:blipFill>
-                    <a:blip r:embed="rId35"/>
+                    <a:blip r:embed="rId38"/>
                     <a:stretch>
                       <a:fillRect/>
                     </a:stretch>
@@ -7639,7 +7858,7 @@
           <w:color w:val="555555"/>
           <w:sz w:val="18"/>
         </w:rPr>
-        <w:t>Fig. 27 — D1: deleteOne() removing a single spam comment</w:t>
+        <w:t>Fig. 28 — D1: deleteOne() removing a single spam comment</w:t>
       </w:r>
     </w:p>
     <w:p>
@@ -7709,7 +7928,7 @@
         <w:drawing>
           <wp:inline xmlns:a="http://schemas.openxmlformats.org/drawingml/2006/main" xmlns:pic="http://schemas.openxmlformats.org/drawingml/2006/picture">
             <wp:extent cx="4478725" cy="6035040"/>
-            <wp:docPr id="28" name="Picture 28"/>
+            <wp:docPr id="31" name="Picture 31"/>
             <wp:cNvGraphicFramePr>
               <a:graphicFrameLocks noChangeAspect="1"/>
             </wp:cNvGraphicFramePr>
@@ -7721,7 +7940,7 @@
                     <pic:cNvPicPr/>
                   </pic:nvPicPr>
                   <pic:blipFill>
-                    <a:blip r:embed="rId36"/>
+                    <a:blip r:embed="rId39"/>
                     <a:stretch>
                       <a:fillRect/>
                     </a:stretch>
@@ -7751,7 +7970,7 @@
           <w:color w:val="555555"/>
           <w:sz w:val="18"/>
         </w:rPr>
-        <w:t>Fig. 28 — D2: deleteMany() clearing the remaining flagged comments</w:t>
+        <w:t>Fig. 29 — D2: deleteMany() clearing the remaining flagged comments</w:t>
       </w:r>
     </w:p>
     <w:p>
@@ -7821,7 +8040,7 @@
         <w:drawing>
           <wp:inline xmlns:a="http://schemas.openxmlformats.org/drawingml/2006/main" xmlns:pic="http://schemas.openxmlformats.org/drawingml/2006/picture">
             <wp:extent cx="5283528" cy="6035040"/>
-            <wp:docPr id="29" name="Picture 29"/>
+            <wp:docPr id="32" name="Picture 32"/>
             <wp:cNvGraphicFramePr>
               <a:graphicFrameLocks noChangeAspect="1"/>
             </wp:cNvGraphicFramePr>
@@ -7833,7 +8052,7 @@
                     <pic:cNvPicPr/>
                   </pic:nvPicPr>
                   <pic:blipFill>
-                    <a:blip r:embed="rId37"/>
+                    <a:blip r:embed="rId40"/>
                     <a:stretch>
                       <a:fillRect/>
                     </a:stretch>
@@ -7863,7 +8082,7 @@
           <w:color w:val="555555"/>
           <w:sz w:val="18"/>
         </w:rPr>
-        <w:t>Fig. 29 — D3: deleteMany() removing the inactive category</w:t>
+        <w:t>Fig. 30 — D3: deleteMany() removing the inactive category</w:t>
       </w:r>
     </w:p>
     <w:p>

</xml_diff>

<commit_message>
Replace the truncated R12 and U6 figures
Both now show their full output across two captures. The complete R12
result shows seven categories totalling ten articles, so the
explanation now covers why the draft is counted here but not in R11.

Co-Authored-By: Claude Opus 5 <noreply@anthropic.com>
Claude-Session: https://claude.ai/code/session_01WKECxGAA4Qrww3QEZbaem4
</commit_message>
<xml_diff>
--- a/dbms_casestudy/News_Portal_MongoDB_CaseStudy_24BCE2743.docx
+++ b/dbms_casestudy/News_Portal_MongoDB_CaseStudy_24BCE2743.docx
@@ -6771,7 +6771,7 @@
           <w:i w:val="0"/>
           <w:sz w:val="22"/>
         </w:rPr>
-        <w:t>The traffic report the editorial team looks at weekly. $group collapses documents that share a value: here _id: "$categoryId" makes one output document per category. Inside the group, $sum: 1 adds one for each article and so counts them, while $sum: "$views" adds up the actual view numbers. The dollar sign in front of a field name means read this document's value, which is what separates it from the literal 1. The category name is then looked up, since grouping leaves only the code behind.</w:t>
+        <w:t>The traffic report the editorial team looks at weekly. $group collapses documents that share a value: here _id: "$categoryId" makes one output document per category. Inside the group, $sum: 1 adds one for each article and so counts them, while $sum: "$views" adds up the actual view numbers. The dollar sign in front of a field name means read this document's value, which is what separates it from the literal 1. The category name is then looked up, since grouping leaves only the code behind. Seven categories come back and the article counts add up to ten, not nine: this pipeline has no $match stage, so the draft is grouped along with everything else and Business shows two articles while contributing only ART04's views. R11 filters to published first and returns nine. Whether a draft belongs in a traffic report is a decision the pipeline makes, not something MongoDB decides.</w:t>
       </w:r>
     </w:p>
     <w:p>
@@ -6782,7 +6782,7 @@
       <w:r>
         <w:drawing>
           <wp:inline xmlns:a="http://schemas.openxmlformats.org/drawingml/2006/main" xmlns:pic="http://schemas.openxmlformats.org/drawingml/2006/picture">
-            <wp:extent cx="5486400" cy="4662549"/>
+            <wp:extent cx="5486400" cy="3918275"/>
             <wp:docPr id="23" name="Picture 23"/>
             <wp:cNvGraphicFramePr>
               <a:graphicFrameLocks noChangeAspect="1"/>
@@ -6791,7 +6791,7 @@
               <a:graphicData uri="http://schemas.openxmlformats.org/drawingml/2006/picture">
                 <pic:pic>
                   <pic:nvPicPr>
-                    <pic:cNvPr id="0" name="S20.png"/>
+                    <pic:cNvPr id="0" name="S20a.png"/>
                     <pic:cNvPicPr/>
                   </pic:nvPicPr>
                   <pic:blipFill>
@@ -6803,7 +6803,47 @@
                   <pic:spPr>
                     <a:xfrm>
                       <a:off x="0" y="0"/>
-                      <a:ext cx="5486400" cy="4662549"/>
+                      <a:ext cx="5486400" cy="3918275"/>
+                    </a:xfrm>
+                    <a:prstGeom prst="rect"/>
+                  </pic:spPr>
+                </pic:pic>
+              </a:graphicData>
+            </a:graphic>
+          </wp:inline>
+        </w:drawing>
+      </w:r>
+    </w:p>
+    <w:p>
+      <w:pPr>
+        <w:spacing w:before="40" w:after="40"/>
+        <w:jc w:val="center"/>
+      </w:pPr>
+      <w:r>
+        <w:drawing>
+          <wp:inline xmlns:a="http://schemas.openxmlformats.org/drawingml/2006/main" xmlns:pic="http://schemas.openxmlformats.org/drawingml/2006/picture">
+            <wp:extent cx="5486400" cy="1677339"/>
+            <wp:docPr id="24" name="Picture 24"/>
+            <wp:cNvGraphicFramePr>
+              <a:graphicFrameLocks noChangeAspect="1"/>
+            </wp:cNvGraphicFramePr>
+            <a:graphic>
+              <a:graphicData uri="http://schemas.openxmlformats.org/drawingml/2006/picture">
+                <pic:pic>
+                  <pic:nvPicPr>
+                    <pic:cNvPr id="0" name="S20b.png"/>
+                    <pic:cNvPicPr/>
+                  </pic:nvPicPr>
+                  <pic:blipFill>
+                    <a:blip r:embed="rId32"/>
+                    <a:stretch>
+                      <a:fillRect/>
+                    </a:stretch>
+                  </pic:blipFill>
+                  <pic:spPr>
+                    <a:xfrm>
+                      <a:off x="0" y="0"/>
+                      <a:ext cx="5486400" cy="1677339"/>
                     </a:xfrm>
                     <a:prstGeom prst="rect"/>
                   </pic:spPr>
@@ -6952,7 +6992,7 @@
         <w:drawing>
           <wp:inline xmlns:a="http://schemas.openxmlformats.org/drawingml/2006/main" xmlns:pic="http://schemas.openxmlformats.org/drawingml/2006/picture">
             <wp:extent cx="5486400" cy="2323902"/>
-            <wp:docPr id="24" name="Picture 24"/>
+            <wp:docPr id="25" name="Picture 25"/>
             <wp:cNvGraphicFramePr>
               <a:graphicFrameLocks noChangeAspect="1"/>
             </wp:cNvGraphicFramePr>
@@ -6964,7 +7004,7 @@
                     <pic:cNvPicPr/>
                   </pic:nvPicPr>
                   <pic:blipFill>
-                    <a:blip r:embed="rId32"/>
+                    <a:blip r:embed="rId33"/>
                     <a:stretch>
                       <a:fillRect/>
                     </a:stretch>
@@ -7091,7 +7131,7 @@
         <w:drawing>
           <wp:inline xmlns:a="http://schemas.openxmlformats.org/drawingml/2006/main" xmlns:pic="http://schemas.openxmlformats.org/drawingml/2006/picture">
             <wp:extent cx="5486400" cy="4188177"/>
-            <wp:docPr id="25" name="Picture 25"/>
+            <wp:docPr id="26" name="Picture 26"/>
             <wp:cNvGraphicFramePr>
               <a:graphicFrameLocks noChangeAspect="1"/>
             </wp:cNvGraphicFramePr>
@@ -7103,7 +7143,7 @@
                     <pic:cNvPicPr/>
                   </pic:nvPicPr>
                   <pic:blipFill>
-                    <a:blip r:embed="rId33"/>
+                    <a:blip r:embed="rId34"/>
                     <a:stretch>
                       <a:fillRect/>
                     </a:stretch>
@@ -7239,7 +7279,7 @@
         <w:drawing>
           <wp:inline xmlns:a="http://schemas.openxmlformats.org/drawingml/2006/main" xmlns:pic="http://schemas.openxmlformats.org/drawingml/2006/picture">
             <wp:extent cx="5486400" cy="2032831"/>
-            <wp:docPr id="26" name="Picture 26"/>
+            <wp:docPr id="27" name="Picture 27"/>
             <wp:cNvGraphicFramePr>
               <a:graphicFrameLocks noChangeAspect="1"/>
             </wp:cNvGraphicFramePr>
@@ -7251,7 +7291,7 @@
                     <pic:cNvPicPr/>
                   </pic:nvPicPr>
                   <pic:blipFill>
-                    <a:blip r:embed="rId34"/>
+                    <a:blip r:embed="rId35"/>
                     <a:stretch>
                       <a:fillRect/>
                     </a:stretch>
@@ -7378,7 +7418,7 @@
         <w:drawing>
           <wp:inline xmlns:a="http://schemas.openxmlformats.org/drawingml/2006/main" xmlns:pic="http://schemas.openxmlformats.org/drawingml/2006/picture">
             <wp:extent cx="5486400" cy="3746001"/>
-            <wp:docPr id="27" name="Picture 27"/>
+            <wp:docPr id="28" name="Picture 28"/>
             <wp:cNvGraphicFramePr>
               <a:graphicFrameLocks noChangeAspect="1"/>
             </wp:cNvGraphicFramePr>
@@ -7390,7 +7430,7 @@
                     <pic:cNvPicPr/>
                   </pic:nvPicPr>
                   <pic:blipFill>
-                    <a:blip r:embed="rId35"/>
+                    <a:blip r:embed="rId36"/>
                     <a:stretch>
                       <a:fillRect/>
                     </a:stretch>
@@ -7535,7 +7575,7 @@
         <w:drawing>
           <wp:inline xmlns:a="http://schemas.openxmlformats.org/drawingml/2006/main" xmlns:pic="http://schemas.openxmlformats.org/drawingml/2006/picture">
             <wp:extent cx="5486400" cy="2725947"/>
-            <wp:docPr id="28" name="Picture 28"/>
+            <wp:docPr id="29" name="Picture 29"/>
             <wp:cNvGraphicFramePr>
               <a:graphicFrameLocks noChangeAspect="1"/>
             </wp:cNvGraphicFramePr>
@@ -7547,7 +7587,7 @@
                     <pic:cNvPicPr/>
                   </pic:nvPicPr>
                   <pic:blipFill>
-                    <a:blip r:embed="rId36"/>
+                    <a:blip r:embed="rId37"/>
                     <a:stretch>
                       <a:fillRect/>
                     </a:stretch>
@@ -7673,8 +7713,8 @@
       <w:r>
         <w:drawing>
           <wp:inline xmlns:a="http://schemas.openxmlformats.org/drawingml/2006/main" xmlns:pic="http://schemas.openxmlformats.org/drawingml/2006/picture">
-            <wp:extent cx="5486400" cy="5571066"/>
-            <wp:docPr id="29" name="Picture 29"/>
+            <wp:extent cx="3721882" cy="2961055"/>
+            <wp:docPr id="30" name="Picture 30"/>
             <wp:cNvGraphicFramePr>
               <a:graphicFrameLocks noChangeAspect="1"/>
             </wp:cNvGraphicFramePr>
@@ -7682,11 +7722,11 @@
               <a:graphicData uri="http://schemas.openxmlformats.org/drawingml/2006/picture">
                 <pic:pic>
                   <pic:nvPicPr>
-                    <pic:cNvPr id="0" name="S26.png"/>
+                    <pic:cNvPr id="0" name="S26a.png"/>
                     <pic:cNvPicPr/>
                   </pic:nvPicPr>
                   <pic:blipFill>
-                    <a:blip r:embed="rId37"/>
+                    <a:blip r:embed="rId38"/>
                     <a:stretch>
                       <a:fillRect/>
                     </a:stretch>
@@ -7694,7 +7734,47 @@
                   <pic:spPr>
                     <a:xfrm>
                       <a:off x="0" y="0"/>
-                      <a:ext cx="5486400" cy="5571066"/>
+                      <a:ext cx="3721882" cy="2961055"/>
+                    </a:xfrm>
+                    <a:prstGeom prst="rect"/>
+                  </pic:spPr>
+                </pic:pic>
+              </a:graphicData>
+            </a:graphic>
+          </wp:inline>
+        </w:drawing>
+      </w:r>
+    </w:p>
+    <w:p>
+      <w:pPr>
+        <w:spacing w:before="40" w:after="40"/>
+        <w:jc w:val="center"/>
+      </w:pPr>
+      <w:r>
+        <w:drawing>
+          <wp:inline xmlns:a="http://schemas.openxmlformats.org/drawingml/2006/main" xmlns:pic="http://schemas.openxmlformats.org/drawingml/2006/picture">
+            <wp:extent cx="3721882" cy="4537024"/>
+            <wp:docPr id="31" name="Picture 31"/>
+            <wp:cNvGraphicFramePr>
+              <a:graphicFrameLocks noChangeAspect="1"/>
+            </wp:cNvGraphicFramePr>
+            <a:graphic>
+              <a:graphicData uri="http://schemas.openxmlformats.org/drawingml/2006/picture">
+                <pic:pic>
+                  <pic:nvPicPr>
+                    <pic:cNvPr id="0" name="S26b.png"/>
+                    <pic:cNvPicPr/>
+                  </pic:nvPicPr>
+                  <pic:blipFill>
+                    <a:blip r:embed="rId39"/>
+                    <a:stretch>
+                      <a:fillRect/>
+                    </a:stretch>
+                  </pic:blipFill>
+                  <pic:spPr>
+                    <a:xfrm>
+                      <a:off x="0" y="0"/>
+                      <a:ext cx="3721882" cy="4537024"/>
                     </a:xfrm>
                     <a:prstGeom prst="rect"/>
                   </pic:spPr>
@@ -7816,7 +7896,7 @@
         <w:drawing>
           <wp:inline xmlns:a="http://schemas.openxmlformats.org/drawingml/2006/main" xmlns:pic="http://schemas.openxmlformats.org/drawingml/2006/picture">
             <wp:extent cx="5486400" cy="896184"/>
-            <wp:docPr id="30" name="Picture 30"/>
+            <wp:docPr id="32" name="Picture 32"/>
             <wp:cNvGraphicFramePr>
               <a:graphicFrameLocks noChangeAspect="1"/>
             </wp:cNvGraphicFramePr>
@@ -7828,7 +7908,7 @@
                     <pic:cNvPicPr/>
                   </pic:nvPicPr>
                   <pic:blipFill>
-                    <a:blip r:embed="rId38"/>
+                    <a:blip r:embed="rId40"/>
                     <a:stretch>
                       <a:fillRect/>
                     </a:stretch>
@@ -7928,7 +8008,7 @@
         <w:drawing>
           <wp:inline xmlns:a="http://schemas.openxmlformats.org/drawingml/2006/main" xmlns:pic="http://schemas.openxmlformats.org/drawingml/2006/picture">
             <wp:extent cx="4478725" cy="6035040"/>
-            <wp:docPr id="31" name="Picture 31"/>
+            <wp:docPr id="33" name="Picture 33"/>
             <wp:cNvGraphicFramePr>
               <a:graphicFrameLocks noChangeAspect="1"/>
             </wp:cNvGraphicFramePr>
@@ -7940,7 +8020,7 @@
                     <pic:cNvPicPr/>
                   </pic:nvPicPr>
                   <pic:blipFill>
-                    <a:blip r:embed="rId39"/>
+                    <a:blip r:embed="rId41"/>
                     <a:stretch>
                       <a:fillRect/>
                     </a:stretch>
@@ -8040,7 +8120,7 @@
         <w:drawing>
           <wp:inline xmlns:a="http://schemas.openxmlformats.org/drawingml/2006/main" xmlns:pic="http://schemas.openxmlformats.org/drawingml/2006/picture">
             <wp:extent cx="5283528" cy="6035040"/>
-            <wp:docPr id="32" name="Picture 32"/>
+            <wp:docPr id="34" name="Picture 34"/>
             <wp:cNvGraphicFramePr>
               <a:graphicFrameLocks noChangeAspect="1"/>
             </wp:cNvGraphicFramePr>
@@ -8052,7 +8132,7 @@
                     <pic:cNvPicPr/>
                   </pic:nvPicPr>
                   <pic:blipFill>
-                    <a:blip r:embed="rId40"/>
+                    <a:blip r:embed="rId42"/>
                     <a:stretch>
                       <a:fillRect/>
                     </a:stretch>

</xml_diff>

<commit_message>
Replace the clipped D2 and D3 figures with complete captures
Every figure in the report now shows its full output.

Co-Authored-By: Claude Opus 5 <noreply@anthropic.com>
Claude-Session: https://claude.ai/code/session_01WKECxGAA4Qrww3QEZbaem4
</commit_message>
<xml_diff>
--- a/dbms_casestudy/News_Portal_MongoDB_CaseStudy_24BCE2743.docx
+++ b/dbms_casestudy/News_Portal_MongoDB_CaseStudy_24BCE2743.docx
@@ -8007,7 +8007,7 @@
       <w:r>
         <w:drawing>
           <wp:inline xmlns:a="http://schemas.openxmlformats.org/drawingml/2006/main" xmlns:pic="http://schemas.openxmlformats.org/drawingml/2006/picture">
-            <wp:extent cx="4478725" cy="6035040"/>
+            <wp:extent cx="4408023" cy="4994412"/>
             <wp:docPr id="33" name="Picture 33"/>
             <wp:cNvGraphicFramePr>
               <a:graphicFrameLocks noChangeAspect="1"/>
@@ -8016,7 +8016,7 @@
               <a:graphicData uri="http://schemas.openxmlformats.org/drawingml/2006/picture">
                 <pic:pic>
                   <pic:nvPicPr>
-                    <pic:cNvPr id="0" name="S28.png"/>
+                    <pic:cNvPr id="0" name="S28a.png"/>
                     <pic:cNvPicPr/>
                   </pic:nvPicPr>
                   <pic:blipFill>
@@ -8028,7 +8028,47 @@
                   <pic:spPr>
                     <a:xfrm>
                       <a:off x="0" y="0"/>
-                      <a:ext cx="4478725" cy="6035040"/>
+                      <a:ext cx="4408023" cy="4994412"/>
+                    </a:xfrm>
+                    <a:prstGeom prst="rect"/>
+                  </pic:spPr>
+                </pic:pic>
+              </a:graphicData>
+            </a:graphic>
+          </wp:inline>
+        </w:drawing>
+      </w:r>
+    </w:p>
+    <w:p>
+      <w:pPr>
+        <w:spacing w:before="40" w:after="40"/>
+        <w:jc w:val="center"/>
+      </w:pPr>
+      <w:r>
+        <w:drawing>
+          <wp:inline xmlns:a="http://schemas.openxmlformats.org/drawingml/2006/main" xmlns:pic="http://schemas.openxmlformats.org/drawingml/2006/picture">
+            <wp:extent cx="4408023" cy="2503667"/>
+            <wp:docPr id="34" name="Picture 34"/>
+            <wp:cNvGraphicFramePr>
+              <a:graphicFrameLocks noChangeAspect="1"/>
+            </wp:cNvGraphicFramePr>
+            <a:graphic>
+              <a:graphicData uri="http://schemas.openxmlformats.org/drawingml/2006/picture">
+                <pic:pic>
+                  <pic:nvPicPr>
+                    <pic:cNvPr id="0" name="S28b.png"/>
+                    <pic:cNvPicPr/>
+                  </pic:nvPicPr>
+                  <pic:blipFill>
+                    <a:blip r:embed="rId42"/>
+                    <a:stretch>
+                      <a:fillRect/>
+                    </a:stretch>
+                  </pic:blipFill>
+                  <pic:spPr>
+                    <a:xfrm>
+                      <a:off x="0" y="0"/>
+                      <a:ext cx="4408023" cy="2503667"/>
                     </a:xfrm>
                     <a:prstGeom prst="rect"/>
                   </pic:spPr>
@@ -8119,8 +8159,8 @@
       <w:r>
         <w:drawing>
           <wp:inline xmlns:a="http://schemas.openxmlformats.org/drawingml/2006/main" xmlns:pic="http://schemas.openxmlformats.org/drawingml/2006/picture">
-            <wp:extent cx="5283528" cy="6035040"/>
-            <wp:docPr id="34" name="Picture 34"/>
+            <wp:extent cx="3899060" cy="4877588"/>
+            <wp:docPr id="35" name="Picture 35"/>
             <wp:cNvGraphicFramePr>
               <a:graphicFrameLocks noChangeAspect="1"/>
             </wp:cNvGraphicFramePr>
@@ -8128,11 +8168,11 @@
               <a:graphicData uri="http://schemas.openxmlformats.org/drawingml/2006/picture">
                 <pic:pic>
                   <pic:nvPicPr>
-                    <pic:cNvPr id="0" name="S29.png"/>
+                    <pic:cNvPr id="0" name="S29a.png"/>
                     <pic:cNvPicPr/>
                   </pic:nvPicPr>
                   <pic:blipFill>
-                    <a:blip r:embed="rId42"/>
+                    <a:blip r:embed="rId43"/>
                     <a:stretch>
                       <a:fillRect/>
                     </a:stretch>
@@ -8140,7 +8180,47 @@
                   <pic:spPr>
                     <a:xfrm>
                       <a:off x="0" y="0"/>
-                      <a:ext cx="5283528" cy="6035040"/>
+                      <a:ext cx="3899060" cy="4877588"/>
+                    </a:xfrm>
+                    <a:prstGeom prst="rect"/>
+                  </pic:spPr>
+                </pic:pic>
+              </a:graphicData>
+            </a:graphic>
+          </wp:inline>
+        </w:drawing>
+      </w:r>
+    </w:p>
+    <w:p>
+      <w:pPr>
+        <w:spacing w:before="40" w:after="40"/>
+        <w:jc w:val="center"/>
+      </w:pPr>
+      <w:r>
+        <w:drawing>
+          <wp:inline xmlns:a="http://schemas.openxmlformats.org/drawingml/2006/main" xmlns:pic="http://schemas.openxmlformats.org/drawingml/2006/picture">
+            <wp:extent cx="3899060" cy="2620491"/>
+            <wp:docPr id="36" name="Picture 36"/>
+            <wp:cNvGraphicFramePr>
+              <a:graphicFrameLocks noChangeAspect="1"/>
+            </wp:cNvGraphicFramePr>
+            <a:graphic>
+              <a:graphicData uri="http://schemas.openxmlformats.org/drawingml/2006/picture">
+                <pic:pic>
+                  <pic:nvPicPr>
+                    <pic:cNvPr id="0" name="S29b.png"/>
+                    <pic:cNvPicPr/>
+                  </pic:nvPicPr>
+                  <pic:blipFill>
+                    <a:blip r:embed="rId44"/>
+                    <a:stretch>
+                      <a:fillRect/>
+                    </a:stretch>
+                  </pic:blipFill>
+                  <pic:spPr>
+                    <a:xfrm>
+                      <a:off x="0" y="0"/>
+                      <a:ext cx="3899060" cy="2620491"/>
                     </a:xfrm>
                     <a:prstGeom prst="rect"/>
                   </pic:spPr>

</xml_diff>